<commit_message>
Build edited submission documents with verified Word equations
</commit_message>
<xml_diff>
--- a/paper/build/manuscript.docx
+++ b/paper/build/manuscript.docx
@@ -97,7 +97,7 @@
         <w:t xml:space="preserve"> </w:t>
       </w:r>
       <w:r>
-        <w:t xml:space="preserve">When do neighborhood election returns reveal the political alignment of their residents? We examine housing prices and conservative voting in six Seoul elections, 2012–2026. Among election-day voters, a positive within-district gradient extends beyond Gangnam, Seocho and Songpa in 2012 and the four sampled elections from 2022. Establishing its reach across the electorate requires accounting for politically different early voters whose ballots are counted at the station or pooled above the neighborhood. We bound the gradient in a roll-based share, distinct from the usual valid-vote share, over allocations consistent with returns, electoral rolls and statutory zones. Returns alone establish no direction in any sampled election with nationwide early voting. Under explicit movement and composition restrictions, the gradient is positive in 2026, narrowly positive in 2024, and unresolved in 2022 and 2025. In 2026 this positive gradient extends beyond the three districts, with its sensitivity to out-of-zone composition quantified explicitly. Holding the votes fixed, finer statutory zones can establish the direction under weaker restrictions. Exact residence reporting of out-of-zone ballots would remove 27–57% of the remaining range under the main restrictions. The findings establish the geographic reach of housing-related electoral alignment and show how electoral reporting governs its visibility across the electorate.</w:t>
+        <w:t xml:space="preserve">Neighborhood election returns can combine residents’ votes with ballots cast by people who live elsewhere. We examine how this reporting problem affects the association between housing prices and conservative voting in six Seoul elections, 2012–2026. Among election-day voters, the positive within-district gradient extends beyond Gangnam, Seocho and Songpa in 2012 and the four sampled elections from 2022. To assess the relationship across voting modes, we bound a resident-based, roll-denominator vote share over allocations consistent with returns, electoral rolls and statutory voting zones. Returns alone leave the sign unresolved in every sampled election with nationwide early voting. Under the main movement and composition restrictions, the gradient is positive in 2026, narrowly positive in 2024, and unresolved in 2022 and 2025. The 2026 result extends beyond the three districts but is sensitive to out-of-zone composition and the highest-price neighborhoods. Holding votes fixed, finer statutory zones can establish the sign under weaker restrictions. Reporting out-of-zone ballots by registered neighborhood would guarantee reductions of 27–57% in the remaining range across the four recent elections under the main restrictions. These results show which housing-related electoral patterns survive uncertain residential attribution and how reporting changes could make neighborhood comparisons more informative.</w:t>
       </w:r>
     </w:p>
     <w:p>
@@ -132,7 +132,7 @@
         <w:pStyle w:val="FirstParagraph"/>
       </w:pPr>
       <w:r>
-        <w:t xml:space="preserve">How widely does housing-related electoral alignment extend within a city, and whose votes establish its reach? A relationship concentrated in a wealthy enclave describes a different political geography from one recurring among neighborhoods across the city. A relationship among election-day voters also differs from one established for all voting residents. Seoul makes both distinctions consequential: housing has long been associated with conservative support, Gangnam with a distinctive place identity, and early voting with politically different participants (Son 2008, 2010; Lee and Kwon 2019; Bae and Joo 2020; Ka 2021; Han 2024). We examine the price–vote association within districts and beyond Gangnam, Seocho and Songpa, then ask whether it extends from election-day voters to the wider electorate.</w:t>
+        <w:t xml:space="preserve">Housing prices and conservative voting are closely associated in Seoul, but the geographic reach of that relationship is less clear. Gangnam, Seocho and Songpa occupy a distinctive position in the city’s housing market and political geography (Son 2008, 2010; Bae and Joo 2020). A citywide association could reflect their contrast with the rest of Seoul, differences among neighborhoods within districts, or both. Establishing a broader pattern also requires identifying whose votes it represents. Early voters differ politically from election-day voters, and their ballots are not always reported where they live (Lee and Kwon 2019; Ka 2021; Han 2024).</w:t>
       </w:r>
     </w:p>
     <w:p>
@@ -140,7 +140,7 @@
         <w:pStyle w:val="BodyText"/>
       </w:pPr>
       <w:r>
-        <w:t xml:space="preserve">The June 2026 mayoral election illustrates why these questions must be separated. A polling firm’s research note reported a correlation of 0.84 between apartment prices and Oh Se-hoon’s vote share across 424 neighborhoods (</w:t>
+        <w:t xml:space="preserve">The June 2026 mayoral election illustrates the problem. A polling firm’s research note reported a correlation of 0.84 between apartment prices and Oh Se-hoon’s vote share across 424 administrative neighborhoods (</w:t>
       </w:r>
       <w:r>
         <w:rPr>
@@ -150,15 +150,7 @@
         <w:t xml:space="preserve">dong</w:t>
       </w:r>
       <w:r>
-        <w:t xml:space="preserve">, 행정동), and 0.71 within districts (Lee 2026). Such maps appear to locate a political division precisely, but establishing its reach requires knowing both where the relationship recurs and whose votes the map represents.</w:t>
-      </w:r>
-    </w:p>
-    <w:p>
-      <w:pPr>
-        <w:pStyle w:val="BodyText"/>
-      </w:pPr>
-      <w:r>
-        <w:t xml:space="preserve">District-level evidence cannot establish alignment among neighborhoods of the same district (</w:t>
+        <w:t xml:space="preserve">), and 0.71 within districts (</w:t>
       </w:r>
       <w:r>
         <w:rPr>
@@ -168,7 +160,7 @@
         <w:t xml:space="preserve">gu</w:t>
       </w:r>
       <w:r>
-        <w:t xml:space="preserve">, 구): an association between expensive and inexpensive districts need not recur among nearby neighborhoods. Excluding the three southeastern districts tests dependence on a distinctive part of Seoul’s housing market and political geography (Bae and Joo 2020). This comparison establishes the geographic reach that explanations based on economic interests and place identity must accommodate.</w:t>
+        <w:t xml:space="preserve">) (Lee 2026). The fine geographic detail suggests a precise account of local voting. Yet a neighborhood’s published total combines votes cast by some of its residents with votes cast there by residents of other neighborhoods, and omits ballots reported only at a larger scale.</w:t>
       </w:r>
     </w:p>
     <w:p>
@@ -176,7 +168,7 @@
         <w:pStyle w:val="BodyText"/>
       </w:pPr>
       <w:r>
-        <w:t xml:space="preserve">The second difficulty is political as well as administrative. Since nationwide early voting began in 2014, neighborhood returns have combined residents’ and neighbors’ ballots. In recent elections, 22–35% of Seoul’s ballots were cast early inside the voter’s statutory zone and counted at the station’s neighborhood, which may differ from the voter’s. Another 12–15% were out-of-zone, at-home or overseas ballots reported only for a district or constituency. Only election-day ballots are attributed exactly to residential neighborhoods. Early voters also vote differently: the conservative share among in-zone early voters was on average 4 points below the election-day share in the same district in 2017, and 10, 12, 28 and 26 points below it in 2022, 2024, 2025 and 2026 (Online Appendix Table C8). Research links Korean early participation to partisan attitudes without establishing a separate effect of voting mode on vote choice (Ka 2021); comparative studies examine selection and participation under convenience voting (Gronke et al. 2008; Kaplan and Yuan 2020). A pattern among election-day voters therefore cannot simply be extended to the full electorate. The widening partisan gap makes the treatment of unattributed votes increasingly consequential for neighborhood comparisons.</w:t>
+        <w:t xml:space="preserve">Since nationwide early voting began in 2014, a substantial share of Seoul’s ballots has been affected. In recent elections, 22–35% were cast early inside the voter’s statutory zone and counted at the station’s neighborhood. Another 12–15% were out-of-zone, at-home or overseas ballots reported only for a district or constituency. Only election-day ballots are attributed exactly to residential neighborhoods. Conservative support among in-zone early voters averaged 4 percentage points below the election-day share in the same district in 2017, and 10, 12, 28 and 26 points below it in 2022, 2024, 2025 and 2026 (Online Appendix Table C8). Korean and comparative research documents political selection and participation differences under early and convenience voting (Ka 2021; Gronke et al. 2008; Kaplan and Yuan 2020). Assuming that these voters share election-day voters’ neighborhood pattern can therefore change the substantive conclusion.</w:t>
       </w:r>
     </w:p>
     <w:p>
@@ -184,7 +176,7 @@
         <w:pStyle w:val="BodyText"/>
       </w:pPr>
       <w:r>
-        <w:t xml:space="preserve">Across six Seoul elections from 2012 to 2026, we compute ranges over ballot allocations consistent with published counts, electoral rolls and statutory voting zones. We then show how explicit movement and composition restrictions change the conclusions. Across districts, the price–vote association is positive in all six elections. Within districts, election-day voters identify a positive gradient in 2012 and the four sampled elections from 2022, including outside the three southeastern districts, and a nearly flat gradient in 2017. For all residents, returns alone establish no direction after nationwide early voting began. Under our main assumptions, the slope is positive in 2026, narrowly positive and fragile in 2024, and undetermined in 2022 and 2025. In 2026 it remains positive outside the three districts: a doubling of neighborhood prices is associated with a fitted conservative share 2.0 to 9.6 points higher. Sensitivity analysis quantifies the movement and composition departures under which this result holds.</w:t>
+        <w:t xml:space="preserve">We examine six Seoul elections from 2012 to 2026. We distinguish associations across districts from those among neighborhoods within a district, then repeat the comparisons without Gangnam, Seocho and Songpa. For residents across all voting modes, we calculate the smallest and largest price–vote slopes consistent with published candidate counts, electoral rolls and statutory voting zones. These bounds show what the returns establish and how further restrictions on early-voter movement and composition change the answer.</w:t>
       </w:r>
     </w:p>
     <w:p>
@@ -192,7 +184,7 @@
         <w:pStyle w:val="BodyText"/>
       </w:pPr>
       <w:r>
-        <w:t xml:space="preserve">The institutional comparison supplies a further result. Holding the 2026 returns fixed, imposing their finer statutory voting zones can determine whether a positive slope is established under weaker assumptions; under the main assumptions the zones narrow the range by about a quarter. The comparison isolates information in the counting rule, rather than a change in voters’ behavior. It cautions against interpreting a more clearly observed relation in one election as a deepening political divide. Exact reporting of out-of-zone ballots by registered neighborhood would remove 27–57% of the remaining range under the main assumptions, although it would not always reveal the direction.</w:t>
+        <w:t xml:space="preserve">The price–vote association across districts is positive in all six elections. Within districts, the election-day gradient is positive in 2012 and the four sampled elections from 2022, including outside the three southeastern districts, and nearly flat in 2017. Extending that result across voting modes produces a different picture. Returns alone do not establish the sign after nationwide early voting began. Under our main assumptions, the slope is positive in 2026, narrowly positive and sensitive to specification in 2024, and unresolved in 2022 and 2025. Outside the three districts in 2026, a doubling of neighborhood prices corresponds to a fitted conservative roll-based share 2.0 to 9.6 points higher. This extension is more sensitive to out-of-zone composition and high-price neighborhoods than the whole-city result.</w:t>
       </w:r>
     </w:p>
     <w:p>
@@ -200,7 +192,15 @@
         <w:pStyle w:val="BodyText"/>
       </w:pPr>
       <w:r>
-        <w:t xml:space="preserve">The contribution is an account of how geographic and electoral scope interact. The observed alignment among election-day voters reaches beyond district differences and the three southeastern districts. Whether it describes the wider electorate depends on politically selected early voters whose residential votes the published rows do not reveal. Partial identification makes that extrapolation explicit: it distinguishes what every compatible allocation establishes from what additionally assuming similar composition establishes. Unlike changing the size or boundaries of spatial units (Lee et al. 2025), attribution can obscure residential voting within fixed boundaries. Related problems arise for German postal ballots, Australian declaration votes and American precinct datasets that allocate absentee votes (Online Appendix B.5; Amos et al. 2017; Baltz et al. 2022). The institutional contribution is consequently about the evidence available for political divisions: finer published units need not provide stronger evidence about residents when they combine different voting populations.</w:t>
+        <w:t xml:space="preserve">Reporting rules help explain what can be learned from these returns. Applying the finer statutory zones to the same 2026 votes narrows the main range by about a quarter and can establish its sign under weaker restrictions. Reporting out-of-zone votes by residential neighborhood would guarantee a reduction of 27–57% in the remaining range across the four recent elections under the main assumptions. These are information gains from fixed votes, so they separate what administration reveals from changes in political behavior.</w:t>
+      </w:r>
+    </w:p>
+    <w:p>
+      <w:pPr>
+        <w:pStyle w:val="BodyText"/>
+      </w:pPr>
+      <w:r>
+        <w:t xml:space="preserve">The paper contributes to housing politics by establishing where the observed association extends beyond Seoul’s southeastern enclave and which claims about the wider electorate require assumptions about early voters. It also addresses a measurement problem distinct from changing the size or boundaries of spatial units (Lee et al. 2025): ballots can be attributed to the wrong neighborhood even when boundaries remain fixed. Related problems arise for German postal ballots, Australian declaration votes and American precinct datasets that allocate absentee votes (Online Appendix B.5; Amos et al. 2017; Baltz et al. 2022). Explicit allocation bounds allow those residential claims to be assessed without selecting a single unobserved distribution of votes.</w:t>
       </w:r>
     </w:p>
     <w:bookmarkEnd w:id="20"/>
@@ -249,7 +249,7 @@
         <w:pStyle w:val="BodyText"/>
       </w:pPr>
       <w:r>
-        <w:t xml:space="preserve">Owners’ economic interests (Fischel 2001; Marble and Nall 2021), residential sorting (Rodden 2019) and local context could each produce an association between housing markets and voting. These explanations concern mechanisms at different levels. Neighborhood prices can reflect the households that select into an area, the interests residents share, or the identity attached to living there. Housing interests and place identities can operate outside wealthy enclaves and can vary with local conditions (Hankinson 2018). A price gradient outside Gangnam consequently leaves these mechanisms open. Its substantive value is to establish the geographic scope that an explanation of Seoul’s housing politics must accommodate.</w:t>
+        <w:t xml:space="preserve">Owners’ economic interests (Fischel 2001; Marble and Nall 2021), residential sorting (Rodden 2019) and place identity offer different explanations for the observed relationship. Neighborhood prices may reflect the households that select into an area, their shared policy interests, or the identity attached to living there. These mechanisms can also operate outside wealthy enclaves and vary with local conditions (Hankinson 2018). Finding a price gradient beyond Gangnam would therefore extend the geography to be explained, without choosing among these mechanisms.</w:t>
       </w:r>
     </w:p>
     <w:p>
@@ -257,15 +257,7 @@
         <w:pStyle w:val="BodyText"/>
       </w:pPr>
       <w:r>
-        <w:t xml:space="preserve">Spatial reach nevertheless changes the explanation required. A relation found only between districts could be accounted for by differences among those districts; one that also recurs within districts requires accounting for alignment among neighborhoods sharing a district government and wider local setting. A gradient beyond the three southeastern districts extends that explanatory task beyond a distinctive enclave. Within-district differences in income, age and residential selection remain possible explanations of this pattern. The electorate comparison adds a further requirement: a claim about a broad housing-related division must accommodate politically different early voters, rather than assume that their neighborhood pattern matches election-day voters’.</w:t>
-      </w:r>
-    </w:p>
-    <w:p>
-      <w:pPr>
-        <w:pStyle w:val="BodyText"/>
-      </w:pPr>
-      <w:r>
-        <w:t xml:space="preserve">Three distinctions therefore organize the inquiry: spatial scale, electorate and institutions. Alignment within districts and beyond the southeastern enclave has a wider geographic scope than a between-district association. Its scope across voters is wider only if adding early voters cannot overturn it. Holding the votes fixed while changing allocation constraints then identifies what the counting rule reveals, rather than an effect on preferences. The target is the electoral alignment of places, with the geographic and electorate comparisons defining its scope. Where both signs remain feasible, the full-electorate alignment is unresolved.</w:t>
+        <w:t xml:space="preserve">The comparisons answer progressively narrower empirical questions. District-level estimates describe differences across Seoul; district fixed effects ask whether more expensive neighborhoods also vote more conservatively than other neighborhoods in the same district. Excluding Gangnam, Seocho and Songpa tests how much that relation depends on the southeastern enclave. Finally, comparing election-day voters with residents across all voting modes tests whether the pattern extends to politically different early voters. Income, age and residential selection remain possible explanations of the neighborhood association. The analysis identifies its geographic and electoral reach, not a causal effect of housing wealth.</w:t>
       </w:r>
     </w:p>
     <w:p>
@@ -286,7 +278,7 @@
         <w:t xml:space="preserve">gradient</w:t>
       </w:r>
       <w:r>
-        <w:t xml:space="preserve">, the within-district slope of the conservative share on log price. Because it gives most weight to neighborhoods far from their district’s mean log price, we also report how much it depends on the most expensive neighborhoods (Section 4.5). Secondary</w:t>
+        <w:t xml:space="preserve">: the slope of the conservative share on log apartment price, with a separate intercept for each district and equal weight for each priced neighborhood. It measures the price–vote relation within districts. A slope of 0.1 corresponds to a fitted share about 6.9 percentage points higher when prices double. Neighborhoods far from their district’s mean log price contribute more to the slope, so Section 4.5 examines the influence of the most expensive neighborhoods. Secondary</w:t>
       </w:r>
       <w:r>
         <w:t xml:space="preserve"> </w:t>
@@ -302,7 +294,7 @@
         <w:t xml:space="preserve"> </w:t>
       </w:r>
       <w:r>
-        <w:t xml:space="preserve">compare each district’s higher- and lower-price neighborhoods (above versus at or below the median, and top versus bottom third), averaged over districts with weights proportional to their number of neighborhoods with price data. A gradient and a contrast answer different political questions: the former describes an overall alignment across prices, while the latter asks whether price groups are separated electorally. Their signs need not be established under the same assumptions.</w:t>
+        <w:t xml:space="preserve">compare higher- and lower-price groups within each district, using the median split and top versus bottom third, then average those differences with weights proportional to each district’s number of priced neighborhoods. The slope and contrasts summarize different features of the same association and can yield different sign conclusions.</w:t>
       </w:r>
     </w:p>
     <w:bookmarkEnd w:id="21"/>
@@ -329,7 +321,7 @@
         <w:pStyle w:val="FirstParagraph"/>
       </w:pPr>
       <w:r>
-        <w:t xml:space="preserve">Korea reports election results by voting district (투표구) and therefore by administrative neighborhood, a unit with about 19,500 electors in Seoul. Box 1 and Figure 1 summarize where each kind of ballot is counted. Election-day ballots are counted in the voter’s own voting district. Since the April 2013 by-elections and nationwide since 2014, any voter can also vote early at any station in the country. In-zone early voters (관내사전투표) cast a ballot within their designated zone, placing it directly in the station’s ballot box; it is then counted for the station’s neighborhood. The boundary that matters is this statutory zone, which coincides with the district only in some elections; we therefore write in-zone and out-of-zone rather than the literal in-district and out-of-district. Out-of-zone early voters (관외사전투표) seal their ballot in an envelope that is mailed to their district commission and counted only for the district, as are at-home (거소) and overseas ballots. Before 2014, voters who could not vote on election day registered as absentees (부재자) and their ballots were likewise reported only for the district; only 3.4% of Seoul ballots were pooled in 2012.</w:t>
+        <w:t xml:space="preserve">Korea reports election results by voting district and therefore by administrative neighborhood, a unit with about 19,500 electors in Seoul. Box 1 and Figure 1 summarize where each kind of ballot is counted. Election-day ballots are counted in the voter’s own voting district. Since the April 2013 by-elections and nationwide since 2014, any voter can also vote early at any station in the country. In-zone early voters cast a ballot within their designated zone, placing it directly in the station’s ballot box; it is then counted for the station’s neighborhood. The statutory zone coincides with the district only in some elections; the terms in-zone and out-of-zone refer to that election-specific boundary. Out-of-zone early voters seal their ballot in an envelope that is mailed to their district commission and counted only for the district, as are at-home and overseas ballots. Before 2014, voters who could not vote on election day registered as absentees and their ballots were likewise reported only for the district; only 3.4% of Seoul ballots were pooled in 2012.</w:t>
       </w:r>
     </w:p>
     <w:p>
@@ -360,7 +352,7 @@
         <w:t xml:space="preserve"> </w:t>
       </w:r>
       <w:r>
-        <w:t xml:space="preserve">Public Official Election Act (공직선거법; Act; Korea n.d.) and Regulations on Public Official Elections (공직선거관리규칙; Regulations; National Election Commission n.d.), in the versions in force at each election.</w:t>
+        <w:t xml:space="preserve">Public Official Election Act (Act; Korea n.d.) and Regulations on Public Official Elections (Regulations; National Election Commission n.d.), in the versions in force at each election.</w:t>
       </w:r>
     </w:p>
     <w:tbl>
@@ -855,7 +847,7 @@
         <w:pStyle w:val="FirstParagraph"/>
       </w:pPr>
       <w:r>
-        <w:t xml:space="preserve">We study the presidential elections of 2012, 2017, 2022 and 2025, the 2024 National Assembly election and the 2026 election of the mayor of Seoul (Table 1). The four presidential elections provide same-office comparisons; the legislative and mayoral elections also expose different early-voting zones. We interpret cross-election differences as comparisons among these six contests. Online Appendix B.1 describes the coverage of the assembled dataset.</w:t>
+        <w:t xml:space="preserve">We study the presidential elections of 2012, 2017, 2022 and 2025, the 2024 National Assembly election and the 2026 election of the mayor of Seoul (Table 1). The four presidential contests permit same-office comparisons. The legislative and mayoral contests provide different early-voting zones: parliamentary constituencies in 2024 and smaller district-council constituencies in 2026. The dataset covers these six contests; the cross-election comparisons do not estimate a continuous trend (Online Appendix B.1).</w:t>
       </w:r>
     </w:p>
     <w:p>
@@ -863,79 +855,15 @@
         <w:pStyle w:val="BodyText"/>
       </w:pPr>
       <w:r>
-        <w:t xml:space="preserve">Returns and electorates are the National Election Commission’s official counting-unit files and electorate records (National Election Commission 2026); the 2026 zones come from its official table of council constituencies and neighborhoods. The outcome is the share of the main conservative candidate: Park Geun-hye (2012), Hong Joon-pyo (2017), Yoon Suk Yeol (2022), the People Power Party’s constituency candidates (2024), Kim Moon-soo (2025) and Oh Se-hoon (2026). In 2017 the conservative vote was split; combining Hong with Yoo Seung-min raises the conventional within-district slope from 0.014 to 0.041 but leaves it undetermined with the returns alone and under minimal movement (</w:t>
-      </w:r>
-      <m:oMath>
-        <m:d>
-          <m:dPr>
-            <m:begChr m:val="["/>
-            <m:endChr m:val="]"/>
-            <m:sepChr m:val=""/>
-            <m:grow/>
-          </m:dPr>
-          <m:e>
-            <m:r>
-              <m:rPr>
-                <m:sty m:val="p"/>
-              </m:rPr>
-              <m:t>−</m:t>
-            </m:r>
-            <m:r>
-              <m:t>0.500</m:t>
-            </m:r>
-            <m:r>
-              <m:rPr>
-                <m:sty m:val="p"/>
-              </m:rPr>
-              <m:t>,</m:t>
-            </m:r>
-            <m:r>
-              <m:t>0.556</m:t>
-            </m:r>
-          </m:e>
-        </m:d>
-      </m:oMath>
-      <w:r>
-        <w:t xml:space="preserve"> </w:t>
-      </w:r>
-      <w:r>
-        <w:t xml:space="preserve">and</w:t>
-      </w:r>
-      <w:r>
-        <w:t xml:space="preserve"> </w:t>
-      </w:r>
-      <m:oMath>
-        <m:d>
-          <m:dPr>
-            <m:begChr m:val="["/>
-            <m:endChr m:val="]"/>
-            <m:sepChr m:val=""/>
-            <m:grow/>
-          </m:dPr>
-          <m:e>
-            <m:r>
-              <m:rPr>
-                <m:sty m:val="p"/>
-              </m:rPr>
-              <m:t>−</m:t>
-            </m:r>
-            <m:r>
-              <m:t>0.154</m:t>
-            </m:r>
-            <m:r>
-              <m:rPr>
-                <m:sty m:val="p"/>
-              </m:rPr>
-              <m:t>,</m:t>
-            </m:r>
-            <m:r>
-              <m:t>0.225</m:t>
-            </m:r>
-          </m:e>
-        </m:d>
-      </m:oMath>
-      <w:r>
-        <w:t xml:space="preserve">; Online Appendix Table C24). Apartment prices are medians of sale prices per square meter recorded by the Ministry of Land, Infrastructure and Transport (2026) during the twelve complete calendar months ending before each election month, geocoded to neighborhoods. They describe transacted apartments, rather than directly measuring the value of every home, homeownership or residents’ wealth. Mobility data come from Seoul Living Mobility (Seoul Metropolitan Government and KT 2026), which estimates trips from mobile-phone signals and is available from 2022. Online Appendix B describes the sources and their construction.</w:t>
+        <w:t xml:space="preserve">Returns and electorates are the National Election Commission’s official counting-unit files and electorate records (National Election Commission 2026). The 2026 zones come from its official table of council constituencies and neighborhoods. We measure support for the main conservative candidate: Park Geun-hye (2012), Hong Joon-pyo (2017), Yoon Suk Yeol (2022), the People Power Party’s constituency candidates (2024), Kim Moon-soo (2025) and Oh Se-hoon (2026). In 2017 the conservative vote was split. Combining Hong with Yoo Seung-min also leaves the within-district sign unresolved under returns alone and minimal movement (Online Appendix Table C24).</w:t>
+      </w:r>
+    </w:p>
+    <w:p>
+      <w:pPr>
+        <w:pStyle w:val="BodyText"/>
+      </w:pPr>
+      <w:r>
+        <w:t xml:space="preserve">Neighborhood prices are medians of apartment sale prices per square meter during the twelve complete calendar months before each election month, from Ministry of Land, Infrastructure and Transport (2026) transactions geocoded to neighborhoods. They measure traded apartments, not residents’ ownership or wealth. The movement scenarios use Seoul Living Mobility data, which estimate trips from mobile-phone signals and are available from 2022 (Seoul Metropolitan Government and KT 2026). Table 1 gives price coverage and the shares of votes requiring residential allocation; Online Appendix B documents the sources and construction.</w:t>
       </w:r>
     </w:p>
     <w:p>
@@ -1173,7 +1101,7 @@
           <w:p>
             <w:pPr>
               <w:pStyle w:val="Compact"/>
-              <w:keepNext w:val="0"/>
+              <w:keepNext/>
               <w:keepLines/>
               <w:spacing w:before="0" w:after="40" w:line="240" w:lineRule="auto"/>
               <w:jc w:val="left"/>
@@ -1193,7 +1121,7 @@
           <w:p>
             <w:pPr>
               <w:pStyle w:val="Compact"/>
-              <w:keepNext w:val="0"/>
+              <w:keepNext/>
               <w:keepLines/>
               <w:spacing w:before="0" w:after="40" w:line="240" w:lineRule="auto"/>
               <w:jc w:val="center"/>
@@ -1213,7 +1141,7 @@
           <w:p>
             <w:pPr>
               <w:pStyle w:val="Compact"/>
-              <w:keepNext w:val="0"/>
+              <w:keepNext/>
               <w:keepLines/>
               <w:spacing w:before="0" w:after="40" w:line="240" w:lineRule="auto"/>
               <w:jc w:val="center"/>
@@ -1233,7 +1161,7 @@
           <w:p>
             <w:pPr>
               <w:pStyle w:val="Compact"/>
-              <w:keepNext w:val="0"/>
+              <w:keepNext/>
               <w:keepLines/>
               <w:spacing w:before="0" w:after="40" w:line="240" w:lineRule="auto"/>
               <w:jc w:val="center"/>
@@ -1253,7 +1181,7 @@
           <w:p>
             <w:pPr>
               <w:pStyle w:val="Compact"/>
-              <w:keepNext w:val="0"/>
+              <w:keepNext/>
               <w:keepLines/>
               <w:spacing w:before="0" w:after="40" w:line="240" w:lineRule="auto"/>
               <w:jc w:val="center"/>
@@ -1273,7 +1201,7 @@
           <w:p>
             <w:pPr>
               <w:pStyle w:val="Compact"/>
-              <w:keepNext w:val="0"/>
+              <w:keepNext/>
               <w:keepLines/>
               <w:spacing w:before="0" w:after="40" w:line="240" w:lineRule="auto"/>
               <w:jc w:val="center"/>
@@ -1293,7 +1221,7 @@
           <w:p>
             <w:pPr>
               <w:pStyle w:val="Compact"/>
-              <w:keepNext w:val="0"/>
+              <w:keepNext/>
               <w:keepLines/>
               <w:spacing w:before="0" w:after="40" w:line="240" w:lineRule="auto"/>
               <w:jc w:val="center"/>
@@ -1313,7 +1241,7 @@
           <w:p>
             <w:pPr>
               <w:pStyle w:val="Compact"/>
-              <w:keepNext w:val="0"/>
+              <w:keepNext/>
               <w:keepLines/>
               <w:spacing w:before="0" w:after="40" w:line="240" w:lineRule="auto"/>
               <w:jc w:val="center"/>
@@ -1333,7 +1261,7 @@
           <w:p>
             <w:pPr>
               <w:pStyle w:val="Compact"/>
-              <w:keepNext w:val="0"/>
+              <w:keepNext/>
               <w:keepLines/>
               <w:spacing w:before="0" w:after="40" w:line="240" w:lineRule="auto"/>
               <w:jc w:val="center"/>
@@ -1358,7 +1286,7 @@
           <w:p>
             <w:pPr>
               <w:pStyle w:val="Compact"/>
-              <w:keepNext w:val="0"/>
+              <w:keepNext/>
               <w:keepLines/>
               <w:spacing w:before="0" w:after="40" w:line="240" w:lineRule="auto"/>
               <w:jc w:val="left"/>
@@ -1378,7 +1306,7 @@
           <w:p>
             <w:pPr>
               <w:pStyle w:val="Compact"/>
-              <w:keepNext w:val="0"/>
+              <w:keepNext/>
               <w:keepLines/>
               <w:spacing w:before="0" w:after="40" w:line="240" w:lineRule="auto"/>
               <w:jc w:val="center"/>
@@ -1398,7 +1326,7 @@
           <w:p>
             <w:pPr>
               <w:pStyle w:val="Compact"/>
-              <w:keepNext w:val="0"/>
+              <w:keepNext/>
               <w:keepLines/>
               <w:spacing w:before="0" w:after="40" w:line="240" w:lineRule="auto"/>
               <w:jc w:val="center"/>
@@ -1418,7 +1346,7 @@
           <w:p>
             <w:pPr>
               <w:pStyle w:val="Compact"/>
-              <w:keepNext w:val="0"/>
+              <w:keepNext/>
               <w:keepLines/>
               <w:spacing w:before="0" w:after="40" w:line="240" w:lineRule="auto"/>
               <w:jc w:val="center"/>
@@ -1438,7 +1366,7 @@
           <w:p>
             <w:pPr>
               <w:pStyle w:val="Compact"/>
-              <w:keepNext w:val="0"/>
+              <w:keepNext/>
               <w:keepLines/>
               <w:spacing w:before="0" w:after="40" w:line="240" w:lineRule="auto"/>
               <w:jc w:val="center"/>
@@ -1458,7 +1386,7 @@
           <w:p>
             <w:pPr>
               <w:pStyle w:val="Compact"/>
-              <w:keepNext w:val="0"/>
+              <w:keepNext/>
               <w:keepLines/>
               <w:spacing w:before="0" w:after="40" w:line="240" w:lineRule="auto"/>
               <w:jc w:val="center"/>
@@ -1478,7 +1406,7 @@
           <w:p>
             <w:pPr>
               <w:pStyle w:val="Compact"/>
-              <w:keepNext w:val="0"/>
+              <w:keepNext/>
               <w:keepLines/>
               <w:spacing w:before="0" w:after="40" w:line="240" w:lineRule="auto"/>
               <w:jc w:val="center"/>
@@ -1498,7 +1426,7 @@
           <w:p>
             <w:pPr>
               <w:pStyle w:val="Compact"/>
-              <w:keepNext w:val="0"/>
+              <w:keepNext/>
               <w:keepLines/>
               <w:spacing w:before="0" w:after="40" w:line="240" w:lineRule="auto"/>
               <w:jc w:val="center"/>
@@ -1518,7 +1446,7 @@
           <w:p>
             <w:pPr>
               <w:pStyle w:val="Compact"/>
-              <w:keepNext w:val="0"/>
+              <w:keepNext/>
               <w:keepLines/>
               <w:spacing w:before="0" w:after="40" w:line="240" w:lineRule="auto"/>
               <w:jc w:val="center"/>
@@ -1543,7 +1471,7 @@
           <w:p>
             <w:pPr>
               <w:pStyle w:val="Compact"/>
-              <w:keepNext w:val="0"/>
+              <w:keepNext/>
               <w:keepLines/>
               <w:spacing w:before="0" w:after="40" w:line="240" w:lineRule="auto"/>
               <w:jc w:val="left"/>
@@ -1563,7 +1491,7 @@
           <w:p>
             <w:pPr>
               <w:pStyle w:val="Compact"/>
-              <w:keepNext w:val="0"/>
+              <w:keepNext/>
               <w:keepLines/>
               <w:spacing w:before="0" w:after="40" w:line="240" w:lineRule="auto"/>
               <w:jc w:val="center"/>
@@ -1583,7 +1511,7 @@
           <w:p>
             <w:pPr>
               <w:pStyle w:val="Compact"/>
-              <w:keepNext w:val="0"/>
+              <w:keepNext/>
               <w:keepLines/>
               <w:spacing w:before="0" w:after="40" w:line="240" w:lineRule="auto"/>
               <w:jc w:val="center"/>
@@ -1603,7 +1531,7 @@
           <w:p>
             <w:pPr>
               <w:pStyle w:val="Compact"/>
-              <w:keepNext w:val="0"/>
+              <w:keepNext/>
               <w:keepLines/>
               <w:spacing w:before="0" w:after="40" w:line="240" w:lineRule="auto"/>
               <w:jc w:val="center"/>
@@ -1623,7 +1551,7 @@
           <w:p>
             <w:pPr>
               <w:pStyle w:val="Compact"/>
-              <w:keepNext w:val="0"/>
+              <w:keepNext/>
               <w:keepLines/>
               <w:spacing w:before="0" w:after="40" w:line="240" w:lineRule="auto"/>
               <w:jc w:val="center"/>
@@ -1643,7 +1571,7 @@
           <w:p>
             <w:pPr>
               <w:pStyle w:val="Compact"/>
-              <w:keepNext w:val="0"/>
+              <w:keepNext/>
               <w:keepLines/>
               <w:spacing w:before="0" w:after="40" w:line="240" w:lineRule="auto"/>
               <w:jc w:val="center"/>
@@ -1663,7 +1591,7 @@
           <w:p>
             <w:pPr>
               <w:pStyle w:val="Compact"/>
-              <w:keepNext w:val="0"/>
+              <w:keepNext/>
               <w:keepLines/>
               <w:spacing w:before="0" w:after="40" w:line="240" w:lineRule="auto"/>
               <w:jc w:val="center"/>
@@ -1683,7 +1611,7 @@
           <w:p>
             <w:pPr>
               <w:pStyle w:val="Compact"/>
-              <w:keepNext w:val="0"/>
+              <w:keepNext/>
               <w:keepLines/>
               <w:spacing w:before="0" w:after="40" w:line="240" w:lineRule="auto"/>
               <w:jc w:val="center"/>
@@ -1703,7 +1631,7 @@
           <w:p>
             <w:pPr>
               <w:pStyle w:val="Compact"/>
-              <w:keepNext w:val="0"/>
+              <w:keepNext/>
               <w:keepLines/>
               <w:spacing w:before="0" w:after="40" w:line="240" w:lineRule="auto"/>
               <w:jc w:val="center"/>
@@ -1728,7 +1656,7 @@
           <w:p>
             <w:pPr>
               <w:pStyle w:val="Compact"/>
-              <w:keepNext w:val="0"/>
+              <w:keepNext/>
               <w:keepLines/>
               <w:spacing w:before="0" w:after="40" w:line="240" w:lineRule="auto"/>
               <w:jc w:val="left"/>
@@ -1748,7 +1676,7 @@
           <w:p>
             <w:pPr>
               <w:pStyle w:val="Compact"/>
-              <w:keepNext w:val="0"/>
+              <w:keepNext/>
               <w:keepLines/>
               <w:spacing w:before="0" w:after="40" w:line="240" w:lineRule="auto"/>
               <w:jc w:val="center"/>
@@ -1768,7 +1696,7 @@
           <w:p>
             <w:pPr>
               <w:pStyle w:val="Compact"/>
-              <w:keepNext w:val="0"/>
+              <w:keepNext/>
               <w:keepLines/>
               <w:spacing w:before="0" w:after="40" w:line="240" w:lineRule="auto"/>
               <w:jc w:val="center"/>
@@ -1788,7 +1716,7 @@
           <w:p>
             <w:pPr>
               <w:pStyle w:val="Compact"/>
-              <w:keepNext w:val="0"/>
+              <w:keepNext/>
               <w:keepLines/>
               <w:spacing w:before="0" w:after="40" w:line="240" w:lineRule="auto"/>
               <w:jc w:val="center"/>
@@ -1808,7 +1736,7 @@
           <w:p>
             <w:pPr>
               <w:pStyle w:val="Compact"/>
-              <w:keepNext w:val="0"/>
+              <w:keepNext/>
               <w:keepLines/>
               <w:spacing w:before="0" w:after="40" w:line="240" w:lineRule="auto"/>
               <w:jc w:val="center"/>
@@ -1828,7 +1756,7 @@
           <w:p>
             <w:pPr>
               <w:pStyle w:val="Compact"/>
-              <w:keepNext w:val="0"/>
+              <w:keepNext/>
               <w:keepLines/>
               <w:spacing w:before="0" w:after="40" w:line="240" w:lineRule="auto"/>
               <w:jc w:val="center"/>
@@ -1848,7 +1776,7 @@
           <w:p>
             <w:pPr>
               <w:pStyle w:val="Compact"/>
-              <w:keepNext w:val="0"/>
+              <w:keepNext/>
               <w:keepLines/>
               <w:spacing w:before="0" w:after="40" w:line="240" w:lineRule="auto"/>
               <w:jc w:val="center"/>
@@ -1868,7 +1796,7 @@
           <w:p>
             <w:pPr>
               <w:pStyle w:val="Compact"/>
-              <w:keepNext w:val="0"/>
+              <w:keepNext/>
               <w:keepLines/>
               <w:spacing w:before="0" w:after="40" w:line="240" w:lineRule="auto"/>
               <w:jc w:val="center"/>
@@ -1888,7 +1816,7 @@
           <w:p>
             <w:pPr>
               <w:pStyle w:val="Compact"/>
-              <w:keepNext w:val="0"/>
+              <w:keepNext/>
               <w:keepLines/>
               <w:spacing w:before="0" w:after="40" w:line="240" w:lineRule="auto"/>
               <w:jc w:val="center"/>
@@ -1913,7 +1841,7 @@
           <w:p>
             <w:pPr>
               <w:pStyle w:val="Compact"/>
-              <w:keepNext w:val="0"/>
+              <w:keepNext/>
               <w:keepLines/>
               <w:spacing w:before="0" w:after="40" w:line="240" w:lineRule="auto"/>
               <w:jc w:val="left"/>
@@ -1933,7 +1861,7 @@
           <w:p>
             <w:pPr>
               <w:pStyle w:val="Compact"/>
-              <w:keepNext w:val="0"/>
+              <w:keepNext/>
               <w:keepLines/>
               <w:spacing w:before="0" w:after="40" w:line="240" w:lineRule="auto"/>
               <w:jc w:val="center"/>
@@ -1953,7 +1881,7 @@
           <w:p>
             <w:pPr>
               <w:pStyle w:val="Compact"/>
-              <w:keepNext w:val="0"/>
+              <w:keepNext/>
               <w:keepLines/>
               <w:spacing w:before="0" w:after="40" w:line="240" w:lineRule="auto"/>
               <w:jc w:val="center"/>
@@ -1973,7 +1901,7 @@
           <w:p>
             <w:pPr>
               <w:pStyle w:val="Compact"/>
-              <w:keepNext w:val="0"/>
+              <w:keepNext/>
               <w:keepLines/>
               <w:spacing w:before="0" w:after="40" w:line="240" w:lineRule="auto"/>
               <w:jc w:val="center"/>
@@ -1993,7 +1921,7 @@
           <w:p>
             <w:pPr>
               <w:pStyle w:val="Compact"/>
-              <w:keepNext w:val="0"/>
+              <w:keepNext/>
               <w:keepLines/>
               <w:spacing w:before="0" w:after="40" w:line="240" w:lineRule="auto"/>
               <w:jc w:val="center"/>
@@ -2013,7 +1941,7 @@
           <w:p>
             <w:pPr>
               <w:pStyle w:val="Compact"/>
-              <w:keepNext w:val="0"/>
+              <w:keepNext/>
               <w:keepLines/>
               <w:spacing w:before="0" w:after="40" w:line="240" w:lineRule="auto"/>
               <w:jc w:val="center"/>
@@ -2033,7 +1961,7 @@
           <w:p>
             <w:pPr>
               <w:pStyle w:val="Compact"/>
-              <w:keepNext w:val="0"/>
+              <w:keepNext/>
               <w:keepLines/>
               <w:spacing w:before="0" w:after="40" w:line="240" w:lineRule="auto"/>
               <w:jc w:val="center"/>
@@ -2053,7 +1981,7 @@
           <w:p>
             <w:pPr>
               <w:pStyle w:val="Compact"/>
-              <w:keepNext w:val="0"/>
+              <w:keepNext/>
               <w:keepLines/>
               <w:spacing w:before="0" w:after="40" w:line="240" w:lineRule="auto"/>
               <w:jc w:val="center"/>
@@ -2073,7 +2001,7 @@
           <w:p>
             <w:pPr>
               <w:pStyle w:val="Compact"/>
-              <w:keepNext w:val="0"/>
+              <w:keepNext/>
               <w:keepLines/>
               <w:spacing w:before="0" w:after="40" w:line="240" w:lineRule="auto"/>
               <w:jc w:val="center"/>
@@ -2098,7 +2026,7 @@
           <w:p>
             <w:pPr>
               <w:pStyle w:val="Compact"/>
-              <w:keepNext w:val="0"/>
+              <w:keepNext/>
               <w:keepLines/>
               <w:spacing w:before="0" w:after="40" w:line="240" w:lineRule="auto"/>
               <w:jc w:val="left"/>
@@ -2118,7 +2046,7 @@
           <w:p>
             <w:pPr>
               <w:pStyle w:val="Compact"/>
-              <w:keepNext w:val="0"/>
+              <w:keepNext/>
               <w:keepLines/>
               <w:spacing w:before="0" w:after="40" w:line="240" w:lineRule="auto"/>
               <w:jc w:val="center"/>
@@ -2138,7 +2066,7 @@
           <w:p>
             <w:pPr>
               <w:pStyle w:val="Compact"/>
-              <w:keepNext w:val="0"/>
+              <w:keepNext/>
               <w:keepLines/>
               <w:spacing w:before="0" w:after="40" w:line="240" w:lineRule="auto"/>
               <w:jc w:val="center"/>
@@ -2158,7 +2086,7 @@
           <w:p>
             <w:pPr>
               <w:pStyle w:val="Compact"/>
-              <w:keepNext w:val="0"/>
+              <w:keepNext/>
               <w:keepLines/>
               <w:spacing w:before="0" w:after="40" w:line="240" w:lineRule="auto"/>
               <w:jc w:val="center"/>
@@ -2178,7 +2106,7 @@
           <w:p>
             <w:pPr>
               <w:pStyle w:val="Compact"/>
-              <w:keepNext w:val="0"/>
+              <w:keepNext/>
               <w:keepLines/>
               <w:spacing w:before="0" w:after="40" w:line="240" w:lineRule="auto"/>
               <w:jc w:val="center"/>
@@ -2198,7 +2126,7 @@
           <w:p>
             <w:pPr>
               <w:pStyle w:val="Compact"/>
-              <w:keepNext w:val="0"/>
+              <w:keepNext/>
               <w:keepLines/>
               <w:spacing w:before="0" w:after="40" w:line="240" w:lineRule="auto"/>
               <w:jc w:val="center"/>
@@ -2218,7 +2146,7 @@
           <w:p>
             <w:pPr>
               <w:pStyle w:val="Compact"/>
-              <w:keepNext w:val="0"/>
+              <w:keepNext/>
               <w:keepLines/>
               <w:spacing w:before="0" w:after="40" w:line="240" w:lineRule="auto"/>
               <w:jc w:val="center"/>
@@ -2238,7 +2166,7 @@
           <w:p>
             <w:pPr>
               <w:pStyle w:val="Compact"/>
-              <w:keepNext w:val="0"/>
+              <w:keepNext/>
               <w:keepLines/>
               <w:spacing w:before="0" w:after="40" w:line="240" w:lineRule="auto"/>
               <w:jc w:val="center"/>
@@ -2258,7 +2186,7 @@
           <w:p>
             <w:pPr>
               <w:pStyle w:val="Compact"/>
-              <w:keepNext w:val="0"/>
+              <w:keepNext/>
               <w:keepLines/>
               <w:spacing w:before="0" w:after="40" w:line="240" w:lineRule="auto"/>
               <w:jc w:val="center"/>
@@ -2276,6 +2204,7 @@
     <w:p>
       <w:pPr>
         <w:pStyle w:val="BodyText"/>
+        <w:keepLines/>
         <w:spacing w:line="240" w:lineRule="auto" w:before="80" w:after="120"/>
       </w:pPr>
       <w:r>
@@ -2591,7 +2520,7 @@
         <w:t xml:space="preserve"> </w:t>
       </w:r>
       <w:r>
-        <w:t xml:space="preserve">is not. A conventional map, which shows each station’s count and drops the pooled ballots, picks one allocation without saying so.</w:t>
+        <w:t xml:space="preserve">is not. A conventional map treats station counts as residential counts and drops pooled ballots, leaving both sources of uncertainty unrepresented.</w:t>
       </w:r>
     </w:p>
     <w:p>
@@ -2611,7 +2540,7 @@
         <w:pStyle w:val="BodyText"/>
       </w:pPr>
       <w:r>
-        <w:t xml:space="preserve">An allocation must reproduce the election-day and station counts, the residents removed from each roll, and pooled candidate totals, while respecting statutory zones. A conclusion is identified if it holds for every feasible allocation. Linear programming gives sharp bounds for continuous ballot counts and conservative outer bounds for integer counts (Manski 2003; Tamer 2010). Under the main assumptions, integer witnesses for the four elections from 2022 place endpoints within 0.0008 of the continuous bounds in both geographic scopes (Online Appendix A.4).</w:t>
+        <w:t xml:space="preserve">An allocation must reproduce the election-day and station counts, the residents removed from each roll, and pooled candidate totals, while respecting statutory zones. We minimize and maximize the within-district slope over these allocations. A positive lower bound means that every compatible allocation yields a positive slope; a range spanning zero leaves the sign unresolved. Linear programming gives sharp bounds for continuous ballot counts and conservative outer bounds for integer counts (Manski 2003; Tamer 2010). Under the main assumptions, integer witnesses for the four elections from 2022 place endpoints within 0.0008 of the continuous bounds in both geographic scopes (Online Appendix A.4).</w:t>
       </w:r>
     </w:p>
     <w:p>
@@ -2653,7 +2582,7 @@
           <w:iCs/>
           <w:i/>
         </w:rPr>
-        <w:t xml:space="preserve">How far did early voters move?</w:t>
+        <w:t xml:space="preserve">Cross-neighborhood movement.</w:t>
       </w:r>
       <w:r>
         <w:t xml:space="preserve"> </w:t>
@@ -2685,7 +2614,7 @@
         <w:t xml:space="preserve">mobility-calibrated scenario</w:t>
       </w:r>
       <w:r>
-        <w:t xml:space="preserve">, we use mobile-phone trip data (Seoul Living Mobility) to calibrate an upper bound on cross-neighborhood movement: beyond a baseline set by the roll (Online Appendix A.1), the early voters who voted at another neighborhood’s station in their zone may number at most the zone’s out-of-zone early voters multiplied by the ratio of residents’ daytime trips to other neighborhoods of the zone to their trips leaving it. Trips are not votes, so the data set the scale of a cap rather than measure movement; studies that infer turnout from phone visits to polling stations use such data differently (Harada et al. 2025). We vary the cap by a factor</w:t>
+        <w:t xml:space="preserve">, we use mobile-phone trip data (Seoul Living Mobility) to calibrate an upper bound on cross-neighborhood movement: beyond a baseline determined by the rolls and zone totals (Online Appendix A.1), the early voters who voted at another neighborhood’s station in their zone may number at most the zone’s out-of-zone early voters multiplied by the ratio of residents’ daytime trips to other neighborhoods of the zone to their trips leaving it. Trips are not votes, so the data set the scale of a cap rather than measure movement; studies that infer turnout from phone visits to polling stations use such data differently (Harada et al. 2025). We vary the cap by a factor</w:t>
       </w:r>
       <w:r>
         <w:t xml:space="preserve"> </w:t>
@@ -2715,7 +2644,7 @@
           <w:iCs/>
           <w:i/>
         </w:rPr>
-        <w:t xml:space="preserve">How similar are out-of-zone and local-station votes?</w:t>
+        <w:t xml:space="preserve">Out-of-zone composition.</w:t>
       </w:r>
       <w:r>
         <w:t xml:space="preserve"> </w:t>
@@ -2748,7 +2677,7 @@
           <w:iCs/>
           <w:i/>
         </w:rPr>
-        <w:t xml:space="preserve">How far can residents’ early-vote shares depart from their benchmark?</w:t>
+        <w:t xml:space="preserve">Residents’ in-zone early-vote composition.</w:t>
       </w:r>
       <w:r>
         <w:t xml:space="preserve"> </w:t>
@@ -2768,7 +2697,30 @@
         <w:t xml:space="preserve"> </w:t>
       </w:r>
       <w:r>
-        <w:t xml:space="preserve">(two percentage points in the main specification). This restriction carries much of the election-day pattern over to early voters: with small</w:t>
+        <w:t xml:space="preserve">(two percentage points in the main specification). For example, if a station’s share differs from the benchmark by three points,</w:t>
+      </w:r>
+      <w:r>
+        <w:t xml:space="preserve"> </w:t>
+      </w:r>
+      <m:oMath>
+        <m:r>
+          <m:t>s</m:t>
+        </m:r>
+        <m:r>
+          <m:rPr>
+            <m:sty m:val="p"/>
+          </m:rPr>
+          <m:t>=</m:t>
+        </m:r>
+        <m:r>
+          <m:t>0.02</m:t>
+        </m:r>
+      </m:oMath>
+      <w:r>
+        <w:t xml:space="preserve"> </w:t>
+      </w:r>
+      <w:r>
+        <w:t xml:space="preserve">permits its residents’ in-zone early share to differ by up to five points. This restriction carries much of the election-day pattern over to early voters: with small</w:t>
       </w:r>
       <w:r>
         <w:t xml:space="preserve"> </w:t>
@@ -2868,15 +2820,7 @@
         <w:pStyle w:val="BodyText"/>
       </w:pPr>
       <w:r>
-        <w:t xml:space="preserve">The composition restriction explicitly links an unobserved group’s pattern to an observed group’s. A positive slope under that restriction cannot validate the link itself. We therefore distinguish what the accounting rules establish, what movement and out-of-zone restrictions add, and what additionally carrying the election-day pattern over to residents’ early votes establishes. The sensitivity thresholds describe how far this extrapolation can be relaxed; they do not estimate the true tolerances or assign probabilities to the assumptions.</w:t>
-      </w:r>
-    </w:p>
-    <w:p>
-      <w:pPr>
-        <w:pStyle w:val="BodyText"/>
-      </w:pPr>
-      <w:r>
-        <w:t xml:space="preserve">We study residents across all voting modes because election-day voters account for only 50–66% of ballots in recent elections and their partisanship differs from early voters’ by 10 to 28 points. A geographic claim about everyone who votes cannot be established from that group alone.</w:t>
+        <w:t xml:space="preserve">Table 2 separates the contribution of each restriction: counts and rolls alone, movement and out-of-zone composition, then residents’ in-zone composition. The last restriction links an unobserved group to the observed election-day pattern. Sensitivity thresholds show how far that link can be relaxed; they neither validate it nor assign probabilities to the assumed tolerances.</w:t>
       </w:r>
     </w:p>
     <w:p>
@@ -2985,6 +2929,98 @@
       </m:oMath>
       <w:r>
         <w:t xml:space="preserve">,</w:t>
+      </w:r>
+      <w:r>
+        <w:t xml:space="preserve"> </w:t>
+      </w:r>
+      <m:oMath>
+        <m:sSub>
+          <m:e>
+            <m:r>
+              <m:t>E</m:t>
+            </m:r>
+          </m:e>
+          <m:sub>
+            <m:r>
+              <m:t>i</m:t>
+            </m:r>
+          </m:sub>
+        </m:sSub>
+      </m:oMath>
+      <w:r>
+        <w:t xml:space="preserve"> </w:t>
+      </w:r>
+      <w:r>
+        <w:t xml:space="preserve">the registered electorate,</w:t>
+      </w:r>
+      <w:r>
+        <w:t xml:space="preserve"> </w:t>
+      </w:r>
+      <m:oMath>
+        <m:sSub>
+          <m:e>
+            <m:r>
+              <m:t>D</m:t>
+            </m:r>
+          </m:e>
+          <m:sub>
+            <m:r>
+              <m:t>i</m:t>
+            </m:r>
+          </m:sub>
+        </m:sSub>
+      </m:oMath>
+      <w:r>
+        <w:t xml:space="preserve"> </w:t>
+      </w:r>
+      <w:r>
+        <w:t xml:space="preserve">the electorate remaining on the election-day roll, and</w:t>
+      </w:r>
+      <w:r>
+        <w:t xml:space="preserve"> </w:t>
+      </w:r>
+      <m:oMath>
+        <m:sSub>
+          <m:e>
+            <m:r>
+              <m:t>P</m:t>
+            </m:r>
+          </m:e>
+          <m:sub>
+            <m:r>
+              <m:t>c</m:t>
+            </m:r>
+          </m:sub>
+        </m:sSub>
+      </m:oMath>
+      <w:r>
+        <w:t xml:space="preserve"> </w:t>
+      </w:r>
+      <w:r>
+        <w:t xml:space="preserve">and</w:t>
+      </w:r>
+      <w:r>
+        <w:t xml:space="preserve"> </w:t>
+      </w:r>
+      <m:oMath>
+        <m:sSub>
+          <m:e>
+            <m:r>
+              <m:t>Q</m:t>
+            </m:r>
+          </m:e>
+          <m:sub>
+            <m:r>
+              <m:t>c</m:t>
+            </m:r>
+          </m:sub>
+        </m:sSub>
+      </m:oMath>
+      <w:r>
+        <w:t xml:space="preserve"> </w:t>
+      </w:r>
+      <w:r>
+        <w:t xml:space="preserve">the jurisdiction totals of out-of-zone early ballots and of at-home and overseas ballots. The difference</w:t>
       </w:r>
       <w:r>
         <w:t xml:space="preserve"> </w:t>
@@ -3025,67 +3061,7 @@
         <w:t xml:space="preserve"> </w:t>
       </w:r>
       <w:r>
-        <w:t xml:space="preserve">the residents of</w:t>
-      </w:r>
-      <w:r>
-        <w:t xml:space="preserve"> </w:t>
-      </w:r>
-      <m:oMath>
-        <m:r>
-          <m:t>i</m:t>
-        </m:r>
-      </m:oMath>
-      <w:r>
-        <w:t xml:space="preserve"> </w:t>
-      </w:r>
-      <w:r>
-        <w:t xml:space="preserve">removed from the election-day roll, and</w:t>
-      </w:r>
-      <w:r>
-        <w:t xml:space="preserve"> </w:t>
-      </w:r>
-      <m:oMath>
-        <m:sSub>
-          <m:e>
-            <m:r>
-              <m:t>P</m:t>
-            </m:r>
-          </m:e>
-          <m:sub>
-            <m:r>
-              <m:t>c</m:t>
-            </m:r>
-          </m:sub>
-        </m:sSub>
-      </m:oMath>
-      <w:r>
-        <w:t xml:space="preserve"> </w:t>
-      </w:r>
-      <w:r>
-        <w:t xml:space="preserve">and</w:t>
-      </w:r>
-      <w:r>
-        <w:t xml:space="preserve"> </w:t>
-      </w:r>
-      <m:oMath>
-        <m:sSub>
-          <m:e>
-            <m:r>
-              <m:t>Q</m:t>
-            </m:r>
-          </m:e>
-          <m:sub>
-            <m:r>
-              <m:t>c</m:t>
-            </m:r>
-          </m:sub>
-        </m:sSub>
-      </m:oMath>
-      <w:r>
-        <w:t xml:space="preserve"> </w:t>
-      </w:r>
-      <w:r>
-        <w:t xml:space="preserve">the jurisdiction totals of out-of-zone early ballots and of at-home and overseas ballots. The unknowns are</w:t>
+        <w:t xml:space="preserve">counts residents removed from the election-day roll. The unknowns are</w:t>
       </w:r>
       <w:r>
         <w:t xml:space="preserve"> </w:t>
@@ -4263,6 +4239,378 @@
         <w:pStyle w:val="BodyText"/>
       </w:pPr>
       <w:r>
+        <w:t xml:space="preserve">For each allocation, the within-district slope is</w:t>
+      </w:r>
+    </w:p>
+    <w:p>
+      <w:pPr>
+        <w:pStyle w:val="BodyText"/>
+      </w:pPr>
+      <m:oMathPara>
+        <m:oMathParaPr>
+          <m:jc m:val="center"/>
+        </m:oMathParaPr>
+        <m:oMath>
+          <m:r>
+            <m:t>β</m:t>
+          </m:r>
+          <m:r>
+            <m:rPr>
+              <m:sty m:val="p"/>
+            </m:rPr>
+            <m:t>=</m:t>
+          </m:r>
+          <m:f>
+            <m:fPr>
+              <m:type m:val="bar"/>
+            </m:fPr>
+            <m:num>
+              <m:nary>
+                <m:naryPr>
+                  <m:chr m:val="∑"/>
+                  <m:limLoc m:val="undOvr"/>
+                  <m:subHide m:val="off"/>
+                  <m:supHide m:val="on"/>
+                </m:naryPr>
+                <m:sub>
+                  <m:r>
+                    <m:t>i</m:t>
+                  </m:r>
+                </m:sub>
+                <m:sup>
+                  <m:r>
+                    <m:t>​</m:t>
+                  </m:r>
+                </m:sup>
+                <m:e>
+                  <m:d>
+                    <m:dPr>
+                      <m:begChr m:val="("/>
+                      <m:endChr m:val=")"/>
+                      <m:sepChr m:val=""/>
+                      <m:grow/>
+                    </m:dPr>
+                    <m:e>
+                      <m:sSub>
+                        <m:e>
+                          <m:r>
+                            <m:t>x</m:t>
+                          </m:r>
+                        </m:e>
+                        <m:sub>
+                          <m:r>
+                            <m:t>i</m:t>
+                          </m:r>
+                        </m:sub>
+                      </m:sSub>
+                      <m:r>
+                        <m:rPr>
+                          <m:sty m:val="p"/>
+                        </m:rPr>
+                        <m:t>−</m:t>
+                      </m:r>
+                      <m:sSub>
+                        <m:e>
+                          <m:bar>
+                            <m:barPr>
+                              <m:pos m:val="top"/>
+                            </m:barPr>
+                            <m:e>
+                              <m:r>
+                                <m:t>x</m:t>
+                              </m:r>
+                            </m:e>
+                          </m:bar>
+                        </m:e>
+                        <m:sub>
+                          <m:r>
+                            <m:t>g</m:t>
+                          </m:r>
+                          <m:d>
+                            <m:dPr>
+                              <m:begChr m:val="("/>
+                              <m:endChr m:val=")"/>
+                              <m:sepChr m:val=""/>
+                              <m:grow/>
+                            </m:dPr>
+                            <m:e>
+                              <m:r>
+                                <m:t>i</m:t>
+                              </m:r>
+                            </m:e>
+                          </m:d>
+                        </m:sub>
+                      </m:sSub>
+                    </m:e>
+                  </m:d>
+                </m:e>
+              </m:nary>
+              <m:sSub>
+                <m:e>
+                  <m:r>
+                    <m:t>z</m:t>
+                  </m:r>
+                </m:e>
+                <m:sub>
+                  <m:r>
+                    <m:t>i</m:t>
+                  </m:r>
+                  <m:r>
+                    <m:t>c</m:t>
+                  </m:r>
+                </m:sub>
+              </m:sSub>
+            </m:num>
+            <m:den>
+              <m:nary>
+                <m:naryPr>
+                  <m:chr m:val="∑"/>
+                  <m:limLoc m:val="undOvr"/>
+                  <m:subHide m:val="off"/>
+                  <m:supHide m:val="on"/>
+                </m:naryPr>
+                <m:sub>
+                  <m:r>
+                    <m:t>i</m:t>
+                  </m:r>
+                </m:sub>
+                <m:sup>
+                  <m:r>
+                    <m:t>​</m:t>
+                  </m:r>
+                </m:sup>
+                <m:e>
+                  <m:sSup>
+                    <m:e>
+                      <m:d>
+                        <m:dPr>
+                          <m:begChr m:val="("/>
+                          <m:endChr m:val=")"/>
+                          <m:sepChr m:val=""/>
+                          <m:grow/>
+                        </m:dPr>
+                        <m:e>
+                          <m:sSub>
+                            <m:e>
+                              <m:r>
+                                <m:t>x</m:t>
+                              </m:r>
+                            </m:e>
+                            <m:sub>
+                              <m:r>
+                                <m:t>i</m:t>
+                              </m:r>
+                            </m:sub>
+                          </m:sSub>
+                          <m:r>
+                            <m:rPr>
+                              <m:sty m:val="p"/>
+                            </m:rPr>
+                            <m:t>−</m:t>
+                          </m:r>
+                          <m:sSub>
+                            <m:e>
+                              <m:bar>
+                                <m:barPr>
+                                  <m:pos m:val="top"/>
+                                </m:barPr>
+                                <m:e>
+                                  <m:r>
+                                    <m:t>x</m:t>
+                                  </m:r>
+                                </m:e>
+                              </m:bar>
+                            </m:e>
+                            <m:sub>
+                              <m:r>
+                                <m:t>g</m:t>
+                              </m:r>
+                              <m:d>
+                                <m:dPr>
+                                  <m:begChr m:val="("/>
+                                  <m:endChr m:val=")"/>
+                                  <m:sepChr m:val=""/>
+                                  <m:grow/>
+                                </m:dPr>
+                                <m:e>
+                                  <m:r>
+                                    <m:t>i</m:t>
+                                  </m:r>
+                                </m:e>
+                              </m:d>
+                            </m:sub>
+                          </m:sSub>
+                        </m:e>
+                      </m:d>
+                    </m:e>
+                    <m:sup>
+                      <m:r>
+                        <m:t>2</m:t>
+                      </m:r>
+                    </m:sup>
+                  </m:sSup>
+                </m:e>
+              </m:nary>
+            </m:den>
+          </m:f>
+          <m:r>
+            <m:rPr>
+              <m:sty m:val="p"/>
+            </m:rPr>
+            <m:t>,</m:t>
+          </m:r>
+        </m:oMath>
+      </m:oMathPara>
+    </w:p>
+    <w:p>
+      <w:pPr>
+        <w:pStyle w:val="FirstParagraph"/>
+      </w:pPr>
+      <w:r>
+        <w:t xml:space="preserve">where</w:t>
+      </w:r>
+      <w:r>
+        <w:t xml:space="preserve"> </w:t>
+      </w:r>
+      <m:oMath>
+        <m:sSub>
+          <m:e>
+            <m:r>
+              <m:t>x</m:t>
+            </m:r>
+          </m:e>
+          <m:sub>
+            <m:r>
+              <m:t>i</m:t>
+            </m:r>
+          </m:sub>
+        </m:sSub>
+      </m:oMath>
+      <w:r>
+        <w:t xml:space="preserve"> </w:t>
+      </w:r>
+      <w:r>
+        <w:t xml:space="preserve">is log apartment price,</w:t>
+      </w:r>
+      <w:r>
+        <w:t xml:space="preserve"> </w:t>
+      </w:r>
+      <m:oMath>
+        <m:r>
+          <m:t>g</m:t>
+        </m:r>
+        <m:d>
+          <m:dPr>
+            <m:begChr m:val="("/>
+            <m:endChr m:val=")"/>
+            <m:sepChr m:val=""/>
+            <m:grow/>
+          </m:dPr>
+          <m:e>
+            <m:r>
+              <m:t>i</m:t>
+            </m:r>
+          </m:e>
+        </m:d>
+      </m:oMath>
+      <w:r>
+        <w:t xml:space="preserve"> </w:t>
+      </w:r>
+      <w:r>
+        <w:t xml:space="preserve">is the district containing neighborhood</w:t>
+      </w:r>
+      <w:r>
+        <w:t xml:space="preserve"> </w:t>
+      </w:r>
+      <m:oMath>
+        <m:r>
+          <m:t>i</m:t>
+        </m:r>
+      </m:oMath>
+      <w:r>
+        <w:t xml:space="preserve">, and</w:t>
+      </w:r>
+      <w:r>
+        <w:t xml:space="preserve"> </w:t>
+      </w:r>
+      <m:oMath>
+        <m:sSub>
+          <m:e>
+            <m:bar>
+              <m:barPr>
+                <m:pos m:val="top"/>
+              </m:barPr>
+              <m:e>
+                <m:r>
+                  <m:t>x</m:t>
+                </m:r>
+              </m:e>
+            </m:bar>
+          </m:e>
+          <m:sub>
+            <m:r>
+              <m:t>g</m:t>
+            </m:r>
+          </m:sub>
+        </m:sSub>
+      </m:oMath>
+      <w:r>
+        <w:t xml:space="preserve"> </w:t>
+      </w:r>
+      <w:r>
+        <w:t xml:space="preserve">is the mean log price of the priced neighborhoods in that district. The sums run over neighborhoods with price data in the specified sample. Prices and weights stay fixed while the allocation changes</w:t>
+      </w:r>
+      <w:r>
+        <w:t xml:space="preserve"> </w:t>
+      </w:r>
+      <m:oMath>
+        <m:r>
+          <m:t>z</m:t>
+        </m:r>
+      </m:oMath>
+      <w:r>
+        <w:t xml:space="preserve">; the two linear programs find the smallest and largest</w:t>
+      </w:r>
+      <w:r>
+        <w:t xml:space="preserve"> </w:t>
+      </w:r>
+      <m:oMath>
+        <m:r>
+          <m:t>β</m:t>
+        </m:r>
+      </m:oMath>
+      <w:r>
+        <w:t xml:space="preserve">. Multiplying a slope by</w:t>
+      </w:r>
+      <w:r>
+        <w:t xml:space="preserve"> </w:t>
+      </w:r>
+      <m:oMath>
+        <m:r>
+          <m:t>100</m:t>
+        </m:r>
+        <m:r>
+          <m:rPr>
+            <m:sty m:val="p"/>
+          </m:rPr>
+          <m:t>log</m:t>
+        </m:r>
+        <m:r>
+          <m:t>2</m:t>
+        </m:r>
+      </m:oMath>
+      <w:r>
+        <w:t xml:space="preserve"> </w:t>
+      </w:r>
+      <w:r>
+        <w:t xml:space="preserve">expresses the fitted difference for a doubling of prices in percentage points.</w:t>
+      </w:r>
+    </w:p>
+    <w:p>
+      <w:pPr>
+        <w:pStyle w:val="BodyText"/>
+      </w:pPr>
+      <w:r>
         <w:t xml:space="preserve">The estimands describe registered residents of places, not homeowners, and they are associations, not effects of housing wealth. All results are conditional on the observed returns and price measure. The ranges describe allocation uncertainty for the observed finite population, not confidence intervals: the returns are a census, so this target does not involve sampling voters. This does not eliminate uncertainty from price measurement, address matching or administrative records, nor justify inference to other elections. The election-day slopes are descriptions of the observed neighborhoods; permutation p-values and clustered standard errors are auxiliary diagnostics requiring further assumptions (Abadie et al. 2020; Online Appendix Table C20). Transaction resampling shows sensitivity to the price measure without supplying confidence intervals with established coverage (Online Appendix Table C13). Inference for estimated bounds is developed elsewhere (Imbens and Manski 2004; Stoye 2009; Fang and Santos 2019; Fang et al. 2023).</w:t>
       </w:r>
     </w:p>
@@ -4302,7 +4650,7 @@
       <w:r>
         <w:drawing>
           <wp:inline>
-            <wp:extent cx="5334000" cy="3774460"/>
+            <wp:extent cx="5334000" cy="3785852"/>
             <wp:effectExtent b="0" l="0" r="0" t="0"/>
             <wp:docPr descr="Figure 2. The three spatial claims, for all of Seoul and without Gangnam, Seocho and Songpa. (A) Expensive districts: slope of the conservative valid-vote share on log price across districts; for all of Seoul, the dot is the slope over 25 districts (24 units in 2024) and the line the range of slopes when one district at a time is dropped. (B) Expensive neighborhoods within districts: range of the within-district slope of the roll-based share z consistent with the data under the main assumptions (Table 2, column E). (C) The same for the difference between the more and less expensive halves of each district’s neighborhoods, in percentage points. 2012 and 2017, which lack mobility data, use the returns and rolls alone and minimal movement with out-of-zone voters within ten points (columns A and C) and are drawn faint, as they are not comparable with the later elections. Panel A uses valid-vote shares, panels B and C roll-based shares. Ranges are sets of values consistent with the data and assumptions, not confidence intervals." title="" id="31" name="Picture"/>
             <a:graphic>
@@ -4323,7 +4671,7 @@
                   <pic:spPr bwMode="auto">
                     <a:xfrm>
                       <a:off x="0" y="0"/>
-                      <a:ext cx="5334000" cy="3774460"/>
+                      <a:ext cx="5334000" cy="3785852"/>
                     </a:xfrm>
                     <a:prstGeom prst="rect">
                       <a:avLst/>
@@ -4588,7 +4936,7 @@
           <w:p>
             <w:pPr>
               <w:pStyle w:val="Compact"/>
-              <w:keepNext w:val="0"/>
+              <w:keepNext/>
               <w:keepLines/>
               <w:spacing w:before="0" w:after="40" w:line="240" w:lineRule="auto"/>
               <w:jc w:val="left"/>
@@ -4608,7 +4956,7 @@
           <w:p>
             <w:pPr>
               <w:pStyle w:val="Compact"/>
-              <w:keepNext w:val="0"/>
+              <w:keepNext/>
               <w:keepLines/>
               <w:spacing w:before="0" w:after="40" w:line="240" w:lineRule="auto"/>
               <w:jc w:val="center"/>
@@ -4628,7 +4976,7 @@
           <w:p>
             <w:pPr>
               <w:pStyle w:val="Compact"/>
-              <w:keepNext w:val="0"/>
+              <w:keepNext/>
               <w:keepLines/>
               <w:spacing w:before="0" w:after="40" w:line="240" w:lineRule="auto"/>
               <w:jc w:val="center"/>
@@ -4648,7 +4996,7 @@
           <w:p>
             <w:pPr>
               <w:pStyle w:val="Compact"/>
-              <w:keepNext w:val="0"/>
+              <w:keepNext/>
               <w:keepLines/>
               <w:spacing w:before="0" w:after="40" w:line="240" w:lineRule="auto"/>
               <w:jc w:val="center"/>
@@ -4668,7 +5016,7 @@
           <w:p>
             <w:pPr>
               <w:pStyle w:val="Compact"/>
-              <w:keepNext w:val="0"/>
+              <w:keepNext/>
               <w:keepLines/>
               <w:spacing w:before="0" w:after="40" w:line="240" w:lineRule="auto"/>
               <w:jc w:val="center"/>
@@ -4688,7 +5036,7 @@
           <w:p>
             <w:pPr>
               <w:pStyle w:val="Compact"/>
-              <w:keepNext w:val="0"/>
+              <w:keepNext/>
               <w:keepLines/>
               <w:spacing w:before="0" w:after="40" w:line="240" w:lineRule="auto"/>
               <w:jc w:val="center"/>
@@ -4708,7 +5056,7 @@
           <w:p>
             <w:pPr>
               <w:pStyle w:val="Compact"/>
-              <w:keepNext w:val="0"/>
+              <w:keepNext/>
               <w:keepLines/>
               <w:spacing w:before="0" w:after="40" w:line="240" w:lineRule="auto"/>
               <w:jc w:val="center"/>
@@ -4728,7 +5076,7 @@
           <w:p>
             <w:pPr>
               <w:pStyle w:val="Compact"/>
-              <w:keepNext w:val="0"/>
+              <w:keepNext/>
               <w:keepLines/>
               <w:spacing w:before="0" w:after="40" w:line="240" w:lineRule="auto"/>
               <w:jc w:val="center"/>
@@ -4753,7 +5101,7 @@
           <w:p>
             <w:pPr>
               <w:pStyle w:val="Compact"/>
-              <w:keepNext w:val="0"/>
+              <w:keepNext/>
               <w:keepLines/>
               <w:spacing w:before="0" w:after="40" w:line="240" w:lineRule="auto"/>
               <w:jc w:val="left"/>
@@ -4773,7 +5121,7 @@
           <w:p>
             <w:pPr>
               <w:pStyle w:val="Compact"/>
-              <w:keepNext w:val="0"/>
+              <w:keepNext/>
               <w:keepLines/>
               <w:spacing w:before="0" w:after="40" w:line="240" w:lineRule="auto"/>
               <w:jc w:val="center"/>
@@ -4793,7 +5141,7 @@
           <w:p>
             <w:pPr>
               <w:pStyle w:val="Compact"/>
-              <w:keepNext w:val="0"/>
+              <w:keepNext/>
               <w:keepLines/>
               <w:spacing w:before="0" w:after="40" w:line="240" w:lineRule="auto"/>
               <w:jc w:val="center"/>
@@ -4815,7 +5163,7 @@
           <w:p>
             <w:pPr>
               <w:pStyle w:val="Compact"/>
-              <w:keepNext w:val="0"/>
+              <w:keepNext/>
               <w:keepLines/>
               <w:spacing w:before="0" w:after="40" w:line="240" w:lineRule="auto"/>
               <w:jc w:val="center"/>
@@ -4837,7 +5185,7 @@
           <w:p>
             <w:pPr>
               <w:pStyle w:val="Compact"/>
-              <w:keepNext w:val="0"/>
+              <w:keepNext/>
               <w:keepLines/>
               <w:spacing w:before="0" w:after="40" w:line="240" w:lineRule="auto"/>
               <w:jc w:val="center"/>
@@ -4859,7 +5207,7 @@
           <w:p>
             <w:pPr>
               <w:pStyle w:val="Compact"/>
-              <w:keepNext w:val="0"/>
+              <w:keepNext/>
               <w:keepLines/>
               <w:spacing w:before="0" w:after="40" w:line="240" w:lineRule="auto"/>
               <w:jc w:val="center"/>
@@ -4879,7 +5227,7 @@
           <w:p>
             <w:pPr>
               <w:pStyle w:val="Compact"/>
-              <w:keepNext w:val="0"/>
+              <w:keepNext/>
               <w:keepLines/>
               <w:spacing w:before="0" w:after="40" w:line="240" w:lineRule="auto"/>
               <w:jc w:val="center"/>
@@ -4899,7 +5247,7 @@
           <w:p>
             <w:pPr>
               <w:pStyle w:val="Compact"/>
-              <w:keepNext w:val="0"/>
+              <w:keepNext/>
               <w:keepLines/>
               <w:spacing w:before="0" w:after="40" w:line="240" w:lineRule="auto"/>
               <w:jc w:val="center"/>
@@ -4924,7 +5272,7 @@
           <w:p>
             <w:pPr>
               <w:pStyle w:val="Compact"/>
-              <w:keepNext w:val="0"/>
+              <w:keepNext/>
               <w:keepLines/>
               <w:spacing w:before="0" w:after="40" w:line="240" w:lineRule="auto"/>
               <w:jc w:val="left"/>
@@ -4944,7 +5292,7 @@
           <w:p>
             <w:pPr>
               <w:pStyle w:val="Compact"/>
-              <w:keepNext w:val="0"/>
+              <w:keepNext/>
               <w:keepLines/>
               <w:spacing w:before="0" w:after="40" w:line="240" w:lineRule="auto"/>
               <w:jc w:val="center"/>
@@ -4964,7 +5312,7 @@
           <w:p>
             <w:pPr>
               <w:pStyle w:val="Compact"/>
-              <w:keepNext w:val="0"/>
+              <w:keepNext/>
               <w:keepLines/>
               <w:spacing w:before="0" w:after="40" w:line="240" w:lineRule="auto"/>
               <w:jc w:val="center"/>
@@ -4986,7 +5334,7 @@
           <w:p>
             <w:pPr>
               <w:pStyle w:val="Compact"/>
-              <w:keepNext w:val="0"/>
+              <w:keepNext/>
               <w:keepLines/>
               <w:spacing w:before="0" w:after="40" w:line="240" w:lineRule="auto"/>
               <w:jc w:val="center"/>
@@ -5008,7 +5356,7 @@
           <w:p>
             <w:pPr>
               <w:pStyle w:val="Compact"/>
-              <w:keepNext w:val="0"/>
+              <w:keepNext/>
               <w:keepLines/>
               <w:spacing w:before="0" w:after="40" w:line="240" w:lineRule="auto"/>
               <w:jc w:val="center"/>
@@ -5028,7 +5376,7 @@
           <w:p>
             <w:pPr>
               <w:pStyle w:val="Compact"/>
-              <w:keepNext w:val="0"/>
+              <w:keepNext/>
               <w:keepLines/>
               <w:spacing w:before="0" w:after="40" w:line="240" w:lineRule="auto"/>
               <w:jc w:val="center"/>
@@ -5050,7 +5398,7 @@
           <w:p>
             <w:pPr>
               <w:pStyle w:val="Compact"/>
-              <w:keepNext w:val="0"/>
+              <w:keepNext/>
               <w:keepLines/>
               <w:spacing w:before="0" w:after="40" w:line="240" w:lineRule="auto"/>
               <w:jc w:val="center"/>
@@ -5072,7 +5420,7 @@
           <w:p>
             <w:pPr>
               <w:pStyle w:val="Compact"/>
-              <w:keepNext w:val="0"/>
+              <w:keepNext/>
               <w:keepLines/>
               <w:spacing w:before="0" w:after="40" w:line="240" w:lineRule="auto"/>
               <w:jc w:val="center"/>
@@ -5099,7 +5447,7 @@
           <w:p>
             <w:pPr>
               <w:pStyle w:val="Compact"/>
-              <w:keepNext w:val="0"/>
+              <w:keepNext/>
               <w:keepLines/>
               <w:spacing w:before="0" w:after="40" w:line="240" w:lineRule="auto"/>
               <w:jc w:val="left"/>
@@ -5119,7 +5467,7 @@
           <w:p>
             <w:pPr>
               <w:pStyle w:val="Compact"/>
-              <w:keepNext w:val="0"/>
+              <w:keepNext/>
               <w:keepLines/>
               <w:spacing w:before="0" w:after="40" w:line="240" w:lineRule="auto"/>
               <w:jc w:val="center"/>
@@ -5139,7 +5487,7 @@
           <w:p>
             <w:pPr>
               <w:pStyle w:val="Compact"/>
-              <w:keepNext w:val="0"/>
+              <w:keepNext/>
               <w:keepLines/>
               <w:spacing w:before="0" w:after="40" w:line="240" w:lineRule="auto"/>
               <w:jc w:val="center"/>
@@ -5161,7 +5509,7 @@
           <w:p>
             <w:pPr>
               <w:pStyle w:val="Compact"/>
-              <w:keepNext w:val="0"/>
+              <w:keepNext/>
               <w:keepLines/>
               <w:spacing w:before="0" w:after="40" w:line="240" w:lineRule="auto"/>
               <w:jc w:val="center"/>
@@ -5183,7 +5531,7 @@
           <w:p>
             <w:pPr>
               <w:pStyle w:val="Compact"/>
-              <w:keepNext w:val="0"/>
+              <w:keepNext/>
               <w:keepLines/>
               <w:spacing w:before="0" w:after="40" w:line="240" w:lineRule="auto"/>
               <w:jc w:val="center"/>
@@ -5203,7 +5551,7 @@
           <w:p>
             <w:pPr>
               <w:pStyle w:val="Compact"/>
-              <w:keepNext w:val="0"/>
+              <w:keepNext/>
               <w:keepLines/>
               <w:spacing w:before="0" w:after="40" w:line="240" w:lineRule="auto"/>
               <w:jc w:val="center"/>
@@ -5225,7 +5573,7 @@
           <w:p>
             <w:pPr>
               <w:pStyle w:val="Compact"/>
-              <w:keepNext w:val="0"/>
+              <w:keepNext/>
               <w:keepLines/>
               <w:spacing w:before="0" w:after="40" w:line="240" w:lineRule="auto"/>
               <w:jc w:val="center"/>
@@ -5245,7 +5593,7 @@
           <w:p>
             <w:pPr>
               <w:pStyle w:val="Compact"/>
-              <w:keepNext w:val="0"/>
+              <w:keepNext/>
               <w:keepLines/>
               <w:spacing w:before="0" w:after="40" w:line="240" w:lineRule="auto"/>
               <w:jc w:val="center"/>
@@ -5272,7 +5620,7 @@
           <w:p>
             <w:pPr>
               <w:pStyle w:val="Compact"/>
-              <w:keepNext w:val="0"/>
+              <w:keepNext/>
               <w:keepLines/>
               <w:spacing w:before="0" w:after="40" w:line="240" w:lineRule="auto"/>
               <w:jc w:val="left"/>
@@ -5292,7 +5640,7 @@
           <w:p>
             <w:pPr>
               <w:pStyle w:val="Compact"/>
-              <w:keepNext w:val="0"/>
+              <w:keepNext/>
               <w:keepLines/>
               <w:spacing w:before="0" w:after="40" w:line="240" w:lineRule="auto"/>
               <w:jc w:val="center"/>
@@ -5312,7 +5660,7 @@
           <w:p>
             <w:pPr>
               <w:pStyle w:val="Compact"/>
-              <w:keepNext w:val="0"/>
+              <w:keepNext/>
               <w:keepLines/>
               <w:spacing w:before="0" w:after="40" w:line="240" w:lineRule="auto"/>
               <w:jc w:val="center"/>
@@ -5334,7 +5682,7 @@
           <w:p>
             <w:pPr>
               <w:pStyle w:val="Compact"/>
-              <w:keepNext w:val="0"/>
+              <w:keepNext/>
               <w:keepLines/>
               <w:spacing w:before="0" w:after="40" w:line="240" w:lineRule="auto"/>
               <w:jc w:val="center"/>
@@ -5356,7 +5704,7 @@
           <w:p>
             <w:pPr>
               <w:pStyle w:val="Compact"/>
-              <w:keepNext w:val="0"/>
+              <w:keepNext/>
               <w:keepLines/>
               <w:spacing w:before="0" w:after="40" w:line="240" w:lineRule="auto"/>
               <w:jc w:val="center"/>
@@ -5376,7 +5724,7 @@
           <w:p>
             <w:pPr>
               <w:pStyle w:val="Compact"/>
-              <w:keepNext w:val="0"/>
+              <w:keepNext/>
               <w:keepLines/>
               <w:spacing w:before="0" w:after="40" w:line="240" w:lineRule="auto"/>
               <w:jc w:val="center"/>
@@ -5398,7 +5746,7 @@
           <w:p>
             <w:pPr>
               <w:pStyle w:val="Compact"/>
-              <w:keepNext w:val="0"/>
+              <w:keepNext/>
               <w:keepLines/>
               <w:spacing w:before="0" w:after="40" w:line="240" w:lineRule="auto"/>
               <w:jc w:val="center"/>
@@ -5420,7 +5768,7 @@
           <w:p>
             <w:pPr>
               <w:pStyle w:val="Compact"/>
-              <w:keepNext w:val="0"/>
+              <w:keepNext/>
               <w:keepLines/>
               <w:spacing w:before="0" w:after="40" w:line="240" w:lineRule="auto"/>
               <w:jc w:val="center"/>
@@ -5447,7 +5795,7 @@
           <w:p>
             <w:pPr>
               <w:pStyle w:val="Compact"/>
-              <w:keepNext w:val="0"/>
+              <w:keepNext/>
               <w:keepLines/>
               <w:spacing w:before="0" w:after="40" w:line="240" w:lineRule="auto"/>
               <w:jc w:val="left"/>
@@ -5467,7 +5815,7 @@
           <w:p>
             <w:pPr>
               <w:pStyle w:val="Compact"/>
-              <w:keepNext w:val="0"/>
+              <w:keepNext/>
               <w:keepLines/>
               <w:spacing w:before="0" w:after="40" w:line="240" w:lineRule="auto"/>
               <w:jc w:val="center"/>
@@ -5487,7 +5835,7 @@
           <w:p>
             <w:pPr>
               <w:pStyle w:val="Compact"/>
-              <w:keepNext w:val="0"/>
+              <w:keepNext/>
               <w:keepLines/>
               <w:spacing w:before="0" w:after="40" w:line="240" w:lineRule="auto"/>
               <w:jc w:val="center"/>
@@ -5509,7 +5857,7 @@
           <w:p>
             <w:pPr>
               <w:pStyle w:val="Compact"/>
-              <w:keepNext w:val="0"/>
+              <w:keepNext/>
               <w:keepLines/>
               <w:spacing w:before="0" w:after="40" w:line="240" w:lineRule="auto"/>
               <w:jc w:val="center"/>
@@ -5531,7 +5879,7 @@
           <w:p>
             <w:pPr>
               <w:pStyle w:val="Compact"/>
-              <w:keepNext w:val="0"/>
+              <w:keepNext/>
               <w:keepLines/>
               <w:spacing w:before="0" w:after="40" w:line="240" w:lineRule="auto"/>
               <w:jc w:val="center"/>
@@ -5551,7 +5899,7 @@
           <w:p>
             <w:pPr>
               <w:pStyle w:val="Compact"/>
-              <w:keepNext w:val="0"/>
+              <w:keepNext/>
               <w:keepLines/>
               <w:spacing w:before="0" w:after="40" w:line="240" w:lineRule="auto"/>
               <w:jc w:val="center"/>
@@ -5571,7 +5919,7 @@
           <w:p>
             <w:pPr>
               <w:pStyle w:val="Compact"/>
-              <w:keepNext w:val="0"/>
+              <w:keepNext/>
               <w:keepLines/>
               <w:spacing w:before="0" w:after="40" w:line="240" w:lineRule="auto"/>
               <w:jc w:val="center"/>
@@ -5591,7 +5939,7 @@
           <w:p>
             <w:pPr>
               <w:pStyle w:val="Compact"/>
-              <w:keepNext w:val="0"/>
+              <w:keepNext/>
               <w:keepLines/>
               <w:spacing w:before="0" w:after="40" w:line="240" w:lineRule="auto"/>
               <w:jc w:val="center"/>
@@ -5609,6 +5957,7 @@
     <w:p>
       <w:pPr>
         <w:pStyle w:val="BodyText"/>
+        <w:keepLines/>
         <w:spacing w:line="240" w:lineRule="auto" w:before="80" w:after="120"/>
       </w:pPr>
       <w:r>
@@ -7735,7 +8084,7 @@
         <w:pStyle w:val="BodyText"/>
       </w:pPr>
       <w:r>
-        <w:t xml:space="preserve">Under the main assumptions, the 2026 result locates housing-related alignment across neighborhoods beyond Gangnam, Seocho and Songpa. Explanations must therefore accommodate a broader geography, including the possibility that place identity operates outside Gangnam as well (Bae and Joo 2020). The pooled within-district slope summarizes this wider pattern; district-specific slopes can differ. Among the remaining neighborhoods, additionally excluding the top 5% or 10% by price lowers the 2026 main-assumption bound to 0.0004 and -0.0093, respectively, whereas omitting any one of the remaining districts keeps it positive (Online Appendix Table C29). The association beyond the three districts thus remains sensitive to the upper end of the price distribution.</w:t>
+        <w:t xml:space="preserve">Under the main assumptions, the 2026 positive slope extends beyond Gangnam, Seocho and Songpa. It is not driven by any single remaining district: omitting each in turn keeps the lower bound positive. High-price neighborhoods nevertheless matter. Excluding the top 5% or 10% by price among the remaining neighborhoods lowers the bound to 0.0004 and -0.0093, respectively (Online Appendix Table C29). The result therefore extends beyond the three-district enclave while remaining sensitive to the upper end of the price distribution. It is compatible with economic interests, sorting and place identity operating elsewhere in Seoul (Bae and Joo 2020).</w:t>
       </w:r>
     </w:p>
     <w:bookmarkEnd w:id="38"/>
@@ -7856,7 +8205,7 @@
           <w:p>
             <w:pPr>
               <w:pStyle w:val="Compact"/>
-              <w:keepNext w:val="0"/>
+              <w:keepNext/>
               <w:keepLines/>
               <w:spacing w:before="0" w:after="40" w:line="240" w:lineRule="auto"/>
               <w:jc w:val="left"/>
@@ -7876,7 +8225,7 @@
           <w:p>
             <w:pPr>
               <w:pStyle w:val="Compact"/>
-              <w:keepNext w:val="0"/>
+              <w:keepNext/>
               <w:keepLines/>
               <w:spacing w:before="0" w:after="40" w:line="240" w:lineRule="auto"/>
               <w:jc w:val="center"/>
@@ -7898,7 +8247,7 @@
           <w:p>
             <w:pPr>
               <w:pStyle w:val="Compact"/>
-              <w:keepNext w:val="0"/>
+              <w:keepNext/>
               <w:keepLines/>
               <w:spacing w:before="0" w:after="40" w:line="240" w:lineRule="auto"/>
               <w:jc w:val="center"/>
@@ -7925,7 +8274,7 @@
           <w:p>
             <w:pPr>
               <w:pStyle w:val="Compact"/>
-              <w:keepNext w:val="0"/>
+              <w:keepNext/>
               <w:keepLines/>
               <w:spacing w:before="0" w:after="40" w:line="240" w:lineRule="auto"/>
               <w:jc w:val="left"/>
@@ -7945,7 +8294,7 @@
           <w:p>
             <w:pPr>
               <w:pStyle w:val="Compact"/>
-              <w:keepNext w:val="0"/>
+              <w:keepNext/>
               <w:keepLines/>
               <w:spacing w:before="0" w:after="40" w:line="240" w:lineRule="auto"/>
               <w:jc w:val="center"/>
@@ -7965,7 +8314,7 @@
           <w:p>
             <w:pPr>
               <w:pStyle w:val="Compact"/>
-              <w:keepNext w:val="0"/>
+              <w:keepNext/>
               <w:keepLines/>
               <w:spacing w:before="0" w:after="40" w:line="240" w:lineRule="auto"/>
               <w:jc w:val="center"/>
@@ -7990,7 +8339,7 @@
           <w:p>
             <w:pPr>
               <w:pStyle w:val="Compact"/>
-              <w:keepNext w:val="0"/>
+              <w:keepNext/>
               <w:keepLines/>
               <w:spacing w:before="0" w:after="40" w:line="240" w:lineRule="auto"/>
               <w:jc w:val="left"/>
@@ -8010,7 +8359,7 @@
           <w:p>
             <w:pPr>
               <w:pStyle w:val="Compact"/>
-              <w:keepNext w:val="0"/>
+              <w:keepNext/>
               <w:keepLines/>
               <w:spacing w:before="0" w:after="40" w:line="240" w:lineRule="auto"/>
               <w:jc w:val="center"/>
@@ -8032,7 +8381,7 @@
           <w:p>
             <w:pPr>
               <w:pStyle w:val="Compact"/>
-              <w:keepNext w:val="0"/>
+              <w:keepNext/>
               <w:keepLines/>
               <w:spacing w:before="0" w:after="40" w:line="240" w:lineRule="auto"/>
               <w:jc w:val="center"/>
@@ -8057,7 +8406,7 @@
           <w:p>
             <w:pPr>
               <w:pStyle w:val="Compact"/>
-              <w:keepNext w:val="0"/>
+              <w:keepNext/>
               <w:keepLines/>
               <w:spacing w:before="0" w:after="40" w:line="240" w:lineRule="auto"/>
               <w:jc w:val="left"/>
@@ -8077,7 +8426,7 @@
           <w:p>
             <w:pPr>
               <w:pStyle w:val="Compact"/>
-              <w:keepNext w:val="0"/>
+              <w:keepNext/>
               <w:keepLines/>
               <w:spacing w:before="0" w:after="40" w:line="240" w:lineRule="auto"/>
               <w:jc w:val="center"/>
@@ -8099,7 +8448,7 @@
           <w:p>
             <w:pPr>
               <w:pStyle w:val="Compact"/>
-              <w:keepNext w:val="0"/>
+              <w:keepNext/>
               <w:keepLines/>
               <w:spacing w:before="0" w:after="40" w:line="240" w:lineRule="auto"/>
               <w:jc w:val="center"/>
@@ -8124,7 +8473,7 @@
           <w:p>
             <w:pPr>
               <w:pStyle w:val="Compact"/>
-              <w:keepNext w:val="0"/>
+              <w:keepNext/>
               <w:keepLines/>
               <w:spacing w:before="0" w:after="40" w:line="240" w:lineRule="auto"/>
               <w:jc w:val="left"/>
@@ -8144,7 +8493,7 @@
           <w:p>
             <w:pPr>
               <w:pStyle w:val="Compact"/>
-              <w:keepNext w:val="0"/>
+              <w:keepNext/>
               <w:keepLines/>
               <w:spacing w:before="0" w:after="40" w:line="240" w:lineRule="auto"/>
               <w:jc w:val="center"/>
@@ -8164,7 +8513,7 @@
           <w:p>
             <w:pPr>
               <w:pStyle w:val="Compact"/>
-              <w:keepNext w:val="0"/>
+              <w:keepNext/>
               <w:keepLines/>
               <w:spacing w:before="0" w:after="40" w:line="240" w:lineRule="auto"/>
               <w:jc w:val="center"/>
@@ -8182,6 +8531,7 @@
     <w:p>
       <w:pPr>
         <w:pStyle w:val="BodyText"/>
+        <w:keepLines/>
         <w:spacing w:line="240" w:lineRule="auto" w:before="80" w:after="120"/>
       </w:pPr>
       <w:r>
@@ -8210,69 +8560,73 @@
         <w:pStyle w:val="BodyText"/>
       </w:pPr>
       <w:r>
-        <w:t xml:space="preserve">With the uniform movement cap held fixed, the within-district slope ranges from</w:t>
+        <w:t xml:space="preserve">With the uniform movement cap held fixed, allowing early ballots to move throughout the district yields a slope range of</w:t>
       </w:r>
       <w:r>
         <w:t xml:space="preserve"> </w:t>
       </w:r>
       <m:oMath>
-        <m:r>
-          <m:rPr>
-            <m:sty m:val="p"/>
-          </m:rPr>
-          <m:t>−</m:t>
-        </m:r>
-        <m:r>
-          <m:t>0.039</m:t>
-        </m:r>
+        <m:d>
+          <m:dPr>
+            <m:begChr m:val="["/>
+            <m:endChr m:val="]"/>
+            <m:sepChr m:val=""/>
+            <m:grow/>
+          </m:dPr>
+          <m:e>
+            <m:r>
+              <m:rPr>
+                <m:sty m:val="p"/>
+              </m:rPr>
+              <m:t>−</m:t>
+            </m:r>
+            <m:r>
+              <m:t>0.039</m:t>
+            </m:r>
+            <m:r>
+              <m:rPr>
+                <m:sty m:val="p"/>
+              </m:rPr>
+              <m:t>,</m:t>
+            </m:r>
+            <m:r>
+              <m:t>0.239</m:t>
+            </m:r>
+          </m:e>
+        </m:d>
       </m:oMath>
       <w:r>
-        <w:t xml:space="preserve"> </w:t>
-      </w:r>
-      <w:r>
-        <w:t xml:space="preserve">to</w:t>
+        <w:t xml:space="preserve">. Restricting them to their statutory zones raises the lower bound above zero, to</w:t>
       </w:r>
       <w:r>
         <w:t xml:space="preserve"> </w:t>
       </w:r>
       <m:oMath>
-        <m:r>
-          <m:t>0.239</m:t>
-        </m:r>
+        <m:d>
+          <m:dPr>
+            <m:begChr m:val="["/>
+            <m:endChr m:val="]"/>
+            <m:sepChr m:val=""/>
+            <m:grow/>
+          </m:dPr>
+          <m:e>
+            <m:r>
+              <m:t>0.014</m:t>
+            </m:r>
+            <m:r>
+              <m:rPr>
+                <m:sty m:val="p"/>
+              </m:rPr>
+              <m:t>,</m:t>
+            </m:r>
+            <m:r>
+              <m:t>0.195</m:t>
+            </m:r>
+          </m:e>
+        </m:d>
       </m:oMath>
       <w:r>
-        <w:t xml:space="preserve"> </w:t>
-      </w:r>
-      <w:r>
-        <w:t xml:space="preserve">when early ballots may move throughout the district, compared with</w:t>
-      </w:r>
-      <w:r>
-        <w:t xml:space="preserve"> </w:t>
-      </w:r>
-      <m:oMath>
-        <m:r>
-          <m:t>0.014</m:t>
-        </m:r>
-      </m:oMath>
-      <w:r>
-        <w:t xml:space="preserve"> </w:t>
-      </w:r>
-      <w:r>
-        <w:t xml:space="preserve">to</w:t>
-      </w:r>
-      <w:r>
-        <w:t xml:space="preserve"> </w:t>
-      </w:r>
-      <m:oMath>
-        <m:r>
-          <m:t>0.195</m:t>
-        </m:r>
-      </m:oMath>
-      <w:r>
-        <w:t xml:space="preserve"> </w:t>
-      </w:r>
-      <w:r>
-        <w:t xml:space="preserve">under the statutory zones. Imposing the zones therefore changes whether a positive slope is identified under these assumptions. The mobility-calibrated comparison also changes the sign conclusion (</w:t>
+        <w:t xml:space="preserve">. The mobility-calibrated comparison gives the same change in sign status (</w:t>
       </w:r>
       <m:oMath>
         <m:d>
@@ -8338,21 +8692,15 @@
         </m:d>
       </m:oMath>
       <w:r>
-        <w:t xml:space="preserve">), although movement is recalibrated to each zone definition. Under the main assumptions, both ranges are positive and the zones narrow the range by about a quarter; there, the composition restrictions rather than the zones secure the sign. The comparison holds the 2026 votes and pooled-ballot structure fixed and changes only where in-zone ballots may be allocated. It is not a counterfactual election under presidential rules, in which today’s cross-constituency voters would have been in-zone movers, and it does not estimate how much of the difference between 2025 and 2026 is administrative; for the same reason,</w:t>
-      </w:r>
-      <w:r>
-        <w:t xml:space="preserve"> </w:t>
-      </w:r>
-      <m:oMath>
-        <m:r>
-          <m:t>δ</m:t>
-        </m:r>
-      </m:oMath>
-      <w:r>
-        <w:t xml:space="preserve"> </w:t>
-      </w:r>
-      <w:r>
-        <w:t xml:space="preserve">constrains a different population in 2026 than in presidential elections. The comparison shows only that, within the same returns, finer zones carry information that can decide the sign under weaker assumptions. Cross-election differences also reflect candidates, issues and the partisanship of early voting, so the clearer result of 2026 does not by itself show that Seoul’s housing divide deepened. Comparing political divisions across elections requires first establishing that each election’s counting rules reveal the quantity being compared.</w:t>
+        <w:t xml:space="preserve">), although its movement caps are recalibrated to each zone definition. Under the main assumptions, both ranges are positive and the zones narrow the range by about a quarter.</w:t>
+      </w:r>
+    </w:p>
+    <w:p>
+      <w:pPr>
+        <w:pStyle w:val="BodyText"/>
+      </w:pPr>
+      <w:r>
+        <w:t xml:space="preserve">The fixed-cap comparison isolates information in the zone boundaries: votes and pooled-ballot totals remain unchanged, and only the permitted destinations of in-zone ballots change. It does not simulate a presidential election, in which some voters classified as out-of-zone in 2026 would instead be in-zone. The populations subject to the out-of-zone restriction also differ across election types. Table 4 thus demonstrates the informational value of zones within one election; it does not decompose the political and administrative causes of the 2025–2026 difference.</w:t>
       </w:r>
     </w:p>
     <w:bookmarkEnd w:id="39"/>
@@ -8370,7 +8718,7 @@
         <w:pStyle w:val="FirstParagraph"/>
       </w:pPr>
       <w:r>
-        <w:t xml:space="preserve">Figure 4 maps how far the movement and composition assumptions can be relaxed: for each amount of movement and each out-of-zone tolerance, the largest additional departure</w:t>
+        <w:t xml:space="preserve">Figure 4 summarizes the three-parameter sensitivity analysis. Each cell reports a threshold</w:t>
       </w:r>
       <w:r>
         <w:t xml:space="preserve"> </w:t>
@@ -8385,6 +8733,7 @@
           <m:sup>
             <m:r>
               <m:rPr>
+                <m:nor/>
                 <m:sty m:val="p"/>
               </m:rPr>
               <m:t>*</m:t>
@@ -8393,10 +8742,10 @@
         </m:sSup>
       </m:oMath>
       <w:r>
-        <w:t xml:space="preserve"> </w:t>
-      </w:r>
-      <w:r>
-        <w:t xml:space="preserve">at which the slope stays positive. For all of Seoul in 2026, with a 10-point tolerance the slope stays positive at the main setting for every amount of movement, including unrestricted movement (</w:t>
+        <w:t xml:space="preserve">: for example, 0.087 means that the slope remains positive while the extra composition tolerance is below about 8.7 percentage points. The main setting uses two points. The figure maps how far the assumptions can be relaxed: for each amount of movement and each out-of-zone tolerance, the largest additional departure</w:t>
+      </w:r>
+      <w:r>
+        <w:t xml:space="preserve"> </w:t>
       </w:r>
       <m:oMath>
         <m:sSup>
@@ -8408,6 +8757,31 @@
           <m:sup>
             <m:r>
               <m:rPr>
+                <m:nor/>
+                <m:sty m:val="p"/>
+              </m:rPr>
+              <m:t>*</m:t>
+            </m:r>
+          </m:sup>
+        </m:sSup>
+      </m:oMath>
+      <w:r>
+        <w:t xml:space="preserve"> </w:t>
+      </w:r>
+      <w:r>
+        <w:t xml:space="preserve">at which the slope stays positive. For all of Seoul in 2026, with a 10-point tolerance the slope stays positive at the main setting for every amount of movement, including unrestricted movement (</w:t>
+      </w:r>
+      <m:oMath>
+        <m:sSup>
+          <m:e>
+            <m:r>
+              <m:t>s</m:t>
+            </m:r>
+          </m:e>
+          <m:sup>
+            <m:r>
+              <m:rPr>
+                <m:nor/>
                 <m:sty m:val="p"/>
               </m:rPr>
               <m:t>*</m:t>
@@ -8440,6 +8814,7 @@
           <m:sup>
             <m:r>
               <m:rPr>
+                <m:nor/>
                 <m:sty m:val="p"/>
               </m:rPr>
               <m:t>*</m:t>
@@ -8523,6 +8898,7 @@
           <m:sup>
             <m:r>
               <m:rPr>
+                <m:nor/>
                 <m:sty m:val="p"/>
               </m:rPr>
               <m:t>*</m:t>
@@ -8574,7 +8950,7 @@
           <wp:inline>
             <wp:extent cx="5334000" cy="3994889"/>
             <wp:effectExtent b="0" l="0" r="0" t="0"/>
-            <wp:docPr descr="Figure 4. Where the within-district slope is positive. Each cell gives s^*, the largest additional departure of residents’ early ballots from their neighborhood benchmark, beyond their station’s own departure, at which the lower end of the range stays positive; amounts of movement are multiples \lambda of the mobility-calibrated scenario or unrestricted, and \delta is the tolerance for out-of-zone voters. The main setting (\lambda=1, \delta=0.1, s=0.02) is outlined: the slope is positive there if s^* exceeds 0.02. “∞”: positive however much residents’ early ballots depart; gray: no positive lower bound for any s\ge0 among the settings examined. All of Seoul; numbers in Online Appendix Table C4, and selected settings without Gangnam, Seocho and Songpa in Table C19." title="" id="41" name="Picture"/>
+            <wp:docPr descr="Figure 4. Where the within-district slope is positive. Each cell gives s^{\text{*}}, the largest additional departure of residents’ early ballots from their neighborhood benchmark, beyond their station’s own departure, at which the lower end of the range stays positive; amounts of movement are multiples \lambda of the mobility-calibrated scenario or unrestricted, and \delta is the tolerance for out-of-zone voters. The main setting (\lambda=1, \delta=0.1, s=0.02) is outlined: the slope is positive there if s^{\text{*}} exceeds 0.02. “∞”: positive however much residents’ early ballots depart; gray: no positive lower bound for any s\ge0 among the settings examined. All of Seoul; numbers in Online Appendix Table C4, and selected settings without Gangnam, Seocho and Songpa in Table C19." title="" id="41" name="Picture"/>
             <a:graphic>
               <a:graphicData uri="http://schemas.openxmlformats.org/drawingml/2006/picture">
                 <pic:pic>
@@ -8632,6 +9008,7 @@
           <m:sup>
             <m:r>
               <m:rPr>
+                <m:nor/>
                 <m:sty m:val="p"/>
               </m:rPr>
               <m:t>*</m:t>
@@ -8740,6 +9117,7 @@
           <m:sup>
             <m:r>
               <m:rPr>
+                <m:nor/>
                 <m:sty m:val="p"/>
               </m:rPr>
               <m:t>*</m:t>
@@ -8942,7 +9320,7 @@
           <w:p>
             <w:pPr>
               <w:pStyle w:val="Compact"/>
-              <w:keepNext w:val="0"/>
+              <w:keepNext/>
               <w:keepLines/>
               <w:spacing w:before="0" w:after="40" w:line="240" w:lineRule="auto"/>
               <w:jc w:val="left"/>
@@ -8962,7 +9340,7 @@
           <w:p>
             <w:pPr>
               <w:pStyle w:val="Compact"/>
-              <w:keepNext w:val="0"/>
+              <w:keepNext/>
               <w:keepLines/>
               <w:spacing w:before="0" w:after="40" w:line="240" w:lineRule="auto"/>
               <w:jc w:val="center"/>
@@ -8982,7 +9360,7 @@
           <w:p>
             <w:pPr>
               <w:pStyle w:val="Compact"/>
-              <w:keepNext w:val="0"/>
+              <w:keepNext/>
               <w:keepLines/>
               <w:spacing w:before="0" w:after="40" w:line="240" w:lineRule="auto"/>
               <w:jc w:val="center"/>
@@ -9002,7 +9380,7 @@
           <w:p>
             <w:pPr>
               <w:pStyle w:val="Compact"/>
-              <w:keepNext w:val="0"/>
+              <w:keepNext/>
               <w:keepLines/>
               <w:spacing w:before="0" w:after="40" w:line="240" w:lineRule="auto"/>
               <w:jc w:val="center"/>
@@ -9022,7 +9400,7 @@
           <w:p>
             <w:pPr>
               <w:pStyle w:val="Compact"/>
-              <w:keepNext w:val="0"/>
+              <w:keepNext/>
               <w:keepLines/>
               <w:spacing w:before="0" w:after="40" w:line="240" w:lineRule="auto"/>
               <w:jc w:val="center"/>
@@ -9047,7 +9425,7 @@
           <w:p>
             <w:pPr>
               <w:pStyle w:val="Compact"/>
-              <w:keepNext w:val="0"/>
+              <w:keepNext/>
               <w:keepLines/>
               <w:spacing w:before="0" w:after="40" w:line="240" w:lineRule="auto"/>
               <w:jc w:val="left"/>
@@ -9067,7 +9445,7 @@
           <w:p>
             <w:pPr>
               <w:pStyle w:val="Compact"/>
-              <w:keepNext w:val="0"/>
+              <w:keepNext/>
               <w:keepLines/>
               <w:spacing w:before="0" w:after="40" w:line="240" w:lineRule="auto"/>
               <w:jc w:val="center"/>
@@ -9087,7 +9465,7 @@
           <w:p>
             <w:pPr>
               <w:pStyle w:val="Compact"/>
-              <w:keepNext w:val="0"/>
+              <w:keepNext/>
               <w:keepLines/>
               <w:spacing w:before="0" w:after="40" w:line="240" w:lineRule="auto"/>
               <w:jc w:val="center"/>
@@ -9107,7 +9485,7 @@
           <w:p>
             <w:pPr>
               <w:pStyle w:val="Compact"/>
-              <w:keepNext w:val="0"/>
+              <w:keepNext/>
               <w:keepLines/>
               <w:spacing w:before="0" w:after="40" w:line="240" w:lineRule="auto"/>
               <w:jc w:val="center"/>
@@ -9127,7 +9505,7 @@
           <w:p>
             <w:pPr>
               <w:pStyle w:val="Compact"/>
-              <w:keepNext w:val="0"/>
+              <w:keepNext/>
               <w:keepLines/>
               <w:spacing w:before="0" w:after="40" w:line="240" w:lineRule="auto"/>
               <w:jc w:val="center"/>
@@ -9152,7 +9530,7 @@
           <w:p>
             <w:pPr>
               <w:pStyle w:val="Compact"/>
-              <w:keepNext w:val="0"/>
+              <w:keepNext/>
               <w:keepLines/>
               <w:spacing w:before="0" w:after="40" w:line="240" w:lineRule="auto"/>
               <w:jc w:val="left"/>
@@ -9172,7 +9550,7 @@
           <w:p>
             <w:pPr>
               <w:pStyle w:val="Compact"/>
-              <w:keepNext w:val="0"/>
+              <w:keepNext/>
               <w:keepLines/>
               <w:spacing w:before="0" w:after="40" w:line="240" w:lineRule="auto"/>
               <w:jc w:val="center"/>
@@ -9192,7 +9570,7 @@
           <w:p>
             <w:pPr>
               <w:pStyle w:val="Compact"/>
-              <w:keepNext w:val="0"/>
+              <w:keepNext/>
               <w:keepLines/>
               <w:spacing w:before="0" w:after="40" w:line="240" w:lineRule="auto"/>
               <w:jc w:val="center"/>
@@ -9212,7 +9590,7 @@
           <w:p>
             <w:pPr>
               <w:pStyle w:val="Compact"/>
-              <w:keepNext w:val="0"/>
+              <w:keepNext/>
               <w:keepLines/>
               <w:spacing w:before="0" w:after="40" w:line="240" w:lineRule="auto"/>
               <w:jc w:val="center"/>
@@ -9232,7 +9610,7 @@
           <w:p>
             <w:pPr>
               <w:pStyle w:val="Compact"/>
-              <w:keepNext w:val="0"/>
+              <w:keepNext/>
               <w:keepLines/>
               <w:spacing w:before="0" w:after="40" w:line="240" w:lineRule="auto"/>
               <w:jc w:val="center"/>
@@ -9257,7 +9635,7 @@
           <w:p>
             <w:pPr>
               <w:pStyle w:val="Compact"/>
-              <w:keepNext w:val="0"/>
+              <w:keepNext/>
               <w:keepLines/>
               <w:spacing w:before="0" w:after="40" w:line="240" w:lineRule="auto"/>
               <w:jc w:val="left"/>
@@ -9277,7 +9655,7 @@
           <w:p>
             <w:pPr>
               <w:pStyle w:val="Compact"/>
-              <w:keepNext w:val="0"/>
+              <w:keepNext/>
               <w:keepLines/>
               <w:spacing w:before="0" w:after="40" w:line="240" w:lineRule="auto"/>
               <w:jc w:val="center"/>
@@ -9297,7 +9675,7 @@
           <w:p>
             <w:pPr>
               <w:pStyle w:val="Compact"/>
-              <w:keepNext w:val="0"/>
+              <w:keepNext/>
               <w:keepLines/>
               <w:spacing w:before="0" w:after="40" w:line="240" w:lineRule="auto"/>
               <w:jc w:val="center"/>
@@ -9317,7 +9695,7 @@
           <w:p>
             <w:pPr>
               <w:pStyle w:val="Compact"/>
-              <w:keepNext w:val="0"/>
+              <w:keepNext/>
               <w:keepLines/>
               <w:spacing w:before="0" w:after="40" w:line="240" w:lineRule="auto"/>
               <w:jc w:val="center"/>
@@ -9337,7 +9715,7 @@
           <w:p>
             <w:pPr>
               <w:pStyle w:val="Compact"/>
-              <w:keepNext w:val="0"/>
+              <w:keepNext/>
               <w:keepLines/>
               <w:spacing w:before="0" w:after="40" w:line="240" w:lineRule="auto"/>
               <w:jc w:val="center"/>
@@ -9362,7 +9740,7 @@
           <w:p>
             <w:pPr>
               <w:pStyle w:val="Compact"/>
-              <w:keepNext w:val="0"/>
+              <w:keepNext/>
               <w:keepLines/>
               <w:spacing w:before="0" w:after="40" w:line="240" w:lineRule="auto"/>
               <w:jc w:val="left"/>
@@ -9382,7 +9760,7 @@
           <w:p>
             <w:pPr>
               <w:pStyle w:val="Compact"/>
-              <w:keepNext w:val="0"/>
+              <w:keepNext/>
               <w:keepLines/>
               <w:spacing w:before="0" w:after="40" w:line="240" w:lineRule="auto"/>
               <w:jc w:val="center"/>
@@ -9402,7 +9780,7 @@
           <w:p>
             <w:pPr>
               <w:pStyle w:val="Compact"/>
-              <w:keepNext w:val="0"/>
+              <w:keepNext/>
               <w:keepLines/>
               <w:spacing w:before="0" w:after="40" w:line="240" w:lineRule="auto"/>
               <w:jc w:val="center"/>
@@ -9422,7 +9800,7 @@
           <w:p>
             <w:pPr>
               <w:pStyle w:val="Compact"/>
-              <w:keepNext w:val="0"/>
+              <w:keepNext/>
               <w:keepLines/>
               <w:spacing w:before="0" w:after="40" w:line="240" w:lineRule="auto"/>
               <w:jc w:val="center"/>
@@ -9442,7 +9820,7 @@
           <w:p>
             <w:pPr>
               <w:pStyle w:val="Compact"/>
-              <w:keepNext w:val="0"/>
+              <w:keepNext/>
               <w:keepLines/>
               <w:spacing w:before="0" w:after="40" w:line="240" w:lineRule="auto"/>
               <w:jc w:val="center"/>
@@ -9467,7 +9845,7 @@
           <w:p>
             <w:pPr>
               <w:pStyle w:val="Compact"/>
-              <w:keepNext w:val="0"/>
+              <w:keepNext/>
               <w:keepLines/>
               <w:spacing w:before="0" w:after="40" w:line="240" w:lineRule="auto"/>
               <w:jc w:val="left"/>
@@ -9487,7 +9865,7 @@
           <w:p>
             <w:pPr>
               <w:pStyle w:val="Compact"/>
-              <w:keepNext w:val="0"/>
+              <w:keepNext/>
               <w:keepLines/>
               <w:spacing w:before="0" w:after="40" w:line="240" w:lineRule="auto"/>
               <w:jc w:val="center"/>
@@ -9507,7 +9885,7 @@
           <w:p>
             <w:pPr>
               <w:pStyle w:val="Compact"/>
-              <w:keepNext w:val="0"/>
+              <w:keepNext/>
               <w:keepLines/>
               <w:spacing w:before="0" w:after="40" w:line="240" w:lineRule="auto"/>
               <w:jc w:val="center"/>
@@ -9527,7 +9905,7 @@
           <w:p>
             <w:pPr>
               <w:pStyle w:val="Compact"/>
-              <w:keepNext w:val="0"/>
+              <w:keepNext/>
               <w:keepLines/>
               <w:spacing w:before="0" w:after="40" w:line="240" w:lineRule="auto"/>
               <w:jc w:val="center"/>
@@ -9547,7 +9925,7 @@
           <w:p>
             <w:pPr>
               <w:pStyle w:val="Compact"/>
-              <w:keepNext w:val="0"/>
+              <w:keepNext/>
               <w:keepLines/>
               <w:spacing w:before="0" w:after="40" w:line="240" w:lineRule="auto"/>
               <w:jc w:val="center"/>
@@ -9572,7 +9950,7 @@
           <w:p>
             <w:pPr>
               <w:pStyle w:val="Compact"/>
-              <w:keepNext w:val="0"/>
+              <w:keepNext/>
               <w:keepLines/>
               <w:spacing w:before="0" w:after="40" w:line="240" w:lineRule="auto"/>
               <w:jc w:val="left"/>
@@ -9592,7 +9970,7 @@
           <w:p>
             <w:pPr>
               <w:pStyle w:val="Compact"/>
-              <w:keepNext w:val="0"/>
+              <w:keepNext/>
               <w:keepLines/>
               <w:spacing w:before="0" w:after="40" w:line="240" w:lineRule="auto"/>
               <w:jc w:val="center"/>
@@ -9612,7 +9990,7 @@
           <w:p>
             <w:pPr>
               <w:pStyle w:val="Compact"/>
-              <w:keepNext w:val="0"/>
+              <w:keepNext/>
               <w:keepLines/>
               <w:spacing w:before="0" w:after="40" w:line="240" w:lineRule="auto"/>
               <w:jc w:val="center"/>
@@ -9632,7 +10010,7 @@
           <w:p>
             <w:pPr>
               <w:pStyle w:val="Compact"/>
-              <w:keepNext w:val="0"/>
+              <w:keepNext/>
               <w:keepLines/>
               <w:spacing w:before="0" w:after="40" w:line="240" w:lineRule="auto"/>
               <w:jc w:val="center"/>
@@ -9652,7 +10030,7 @@
           <w:p>
             <w:pPr>
               <w:pStyle w:val="Compact"/>
-              <w:keepNext w:val="0"/>
+              <w:keepNext/>
               <w:keepLines/>
               <w:spacing w:before="0" w:after="40" w:line="240" w:lineRule="auto"/>
               <w:jc w:val="center"/>
@@ -9677,7 +10055,7 @@
           <w:p>
             <w:pPr>
               <w:pStyle w:val="Compact"/>
-              <w:keepNext w:val="0"/>
+              <w:keepNext/>
               <w:keepLines/>
               <w:spacing w:before="0" w:after="40" w:line="240" w:lineRule="auto"/>
               <w:jc w:val="left"/>
@@ -9697,7 +10075,7 @@
           <w:p>
             <w:pPr>
               <w:pStyle w:val="Compact"/>
-              <w:keepNext w:val="0"/>
+              <w:keepNext/>
               <w:keepLines/>
               <w:spacing w:before="0" w:after="40" w:line="240" w:lineRule="auto"/>
               <w:jc w:val="center"/>
@@ -9717,7 +10095,7 @@
           <w:p>
             <w:pPr>
               <w:pStyle w:val="Compact"/>
-              <w:keepNext w:val="0"/>
+              <w:keepNext/>
               <w:keepLines/>
               <w:spacing w:before="0" w:after="40" w:line="240" w:lineRule="auto"/>
               <w:jc w:val="center"/>
@@ -9737,7 +10115,7 @@
           <w:p>
             <w:pPr>
               <w:pStyle w:val="Compact"/>
-              <w:keepNext w:val="0"/>
+              <w:keepNext/>
               <w:keepLines/>
               <w:spacing w:before="0" w:after="40" w:line="240" w:lineRule="auto"/>
               <w:jc w:val="center"/>
@@ -9757,7 +10135,7 @@
           <w:p>
             <w:pPr>
               <w:pStyle w:val="Compact"/>
-              <w:keepNext w:val="0"/>
+              <w:keepNext/>
               <w:keepLines/>
               <w:spacing w:before="0" w:after="40" w:line="240" w:lineRule="auto"/>
               <w:jc w:val="center"/>
@@ -9775,6 +10153,7 @@
     <w:p>
       <w:pPr>
         <w:pStyle w:val="BodyText"/>
+        <w:keepLines/>
         <w:spacing w:line="240" w:lineRule="auto" w:before="80" w:after="120"/>
       </w:pPr>
       <w:r>
@@ -9856,7 +10235,7 @@
         <w:pStyle w:val="BodyText"/>
       </w:pPr>
       <w:r>
-        <w:t xml:space="preserve">The 2025 sign conclusions in columns A, C, D and E also hold when prices are rebuilt from a separately retrieved official transaction snapshot and extended address mapping. Online Appendix B.3 documents the source history and neighborhood-level differences; Table C28 reports the resulting bounds, including comparisons on common geographic support.</w:t>
+        <w:t xml:space="preserve">An alternative 2025 price measure leaves the sign conclusions in columns A, C, D and E unchanged. The comparison uses a separately documented official transaction snapshot and address mapping, with results also restricted to the neighborhoods priced in both sources (Online Appendix B.3 and Table C28).</w:t>
       </w:r>
     </w:p>
     <w:p>
@@ -9907,7 +10286,15 @@
         <w:t xml:space="preserve"> </w:t>
       </w:r>
       <w:r>
-        <w:t xml:space="preserve">it turns negative (Online Appendix Table C10); resampling transactions moves the bounds by a few thousandths (Table C13). A benchmark that varies with price within districts, motivated by larger early-vote gaps in higher-price districts in 2024–2026, changes the 2026 result only slightly (Table 2, column F), as does shifting the out-of-zone benchmark by the observed out-of-zone gap (Table C9). Valid-vote shares</w:t>
+        <w:t xml:space="preserve">it turns negative (Online Appendix Table C10). Resampling transactions moves the bounds by a few thousandths (Table C13).</w:t>
+      </w:r>
+    </w:p>
+    <w:p>
+      <w:pPr>
+        <w:pStyle w:val="BodyText"/>
+      </w:pPr>
+      <w:r>
+        <w:t xml:space="preserve">A benchmark that varies with price within districts, motivated by larger early-vote gaps in higher-price districts in 2024–2026, changes the 2026 result only slightly (Table 2, column F), as does shifting the out-of-zone benchmark by the observed out-of-zone gap (Table C9). Valid-vote shares</w:t>
       </w:r>
       <w:r>
         <w:t xml:space="preserve"> </w:t>
@@ -10206,7 +10593,7 @@
           <w:p>
             <w:pPr>
               <w:pStyle w:val="Compact"/>
-              <w:keepNext w:val="0"/>
+              <w:keepNext/>
               <w:keepLines/>
               <w:spacing w:before="0" w:after="40" w:line="240" w:lineRule="auto"/>
               <w:jc w:val="left"/>
@@ -10226,7 +10613,7 @@
           <w:p>
             <w:pPr>
               <w:pStyle w:val="Compact"/>
-              <w:keepNext w:val="0"/>
+              <w:keepNext/>
               <w:keepLines/>
               <w:spacing w:before="0" w:after="40" w:line="240" w:lineRule="auto"/>
               <w:jc w:val="center"/>
@@ -10246,7 +10633,7 @@
           <w:p>
             <w:pPr>
               <w:pStyle w:val="Compact"/>
-              <w:keepNext w:val="0"/>
+              <w:keepNext/>
               <w:keepLines/>
               <w:spacing w:before="0" w:after="40" w:line="240" w:lineRule="auto"/>
               <w:jc w:val="center"/>
@@ -10266,7 +10653,7 @@
           <w:p>
             <w:pPr>
               <w:pStyle w:val="Compact"/>
-              <w:keepNext w:val="0"/>
+              <w:keepNext/>
               <w:keepLines/>
               <w:spacing w:before="0" w:after="40" w:line="240" w:lineRule="auto"/>
               <w:jc w:val="center"/>
@@ -10286,7 +10673,7 @@
           <w:p>
             <w:pPr>
               <w:pStyle w:val="Compact"/>
-              <w:keepNext w:val="0"/>
+              <w:keepNext/>
               <w:keepLines/>
               <w:spacing w:before="0" w:after="40" w:line="240" w:lineRule="auto"/>
               <w:jc w:val="center"/>
@@ -10306,7 +10693,7 @@
           <w:p>
             <w:pPr>
               <w:pStyle w:val="Compact"/>
-              <w:keepNext w:val="0"/>
+              <w:keepNext/>
               <w:keepLines/>
               <w:spacing w:before="0" w:after="40" w:line="240" w:lineRule="auto"/>
               <w:jc w:val="center"/>
@@ -10331,7 +10718,7 @@
           <w:p>
             <w:pPr>
               <w:pStyle w:val="Compact"/>
-              <w:keepNext w:val="0"/>
+              <w:keepNext/>
               <w:keepLines/>
               <w:spacing w:before="0" w:after="40" w:line="240" w:lineRule="auto"/>
               <w:jc w:val="left"/>
@@ -10351,7 +10738,7 @@
           <w:p>
             <w:pPr>
               <w:pStyle w:val="Compact"/>
-              <w:keepNext w:val="0"/>
+              <w:keepNext/>
               <w:keepLines/>
               <w:spacing w:before="0" w:after="40" w:line="240" w:lineRule="auto"/>
               <w:jc w:val="center"/>
@@ -10371,7 +10758,7 @@
           <w:p>
             <w:pPr>
               <w:pStyle w:val="Compact"/>
-              <w:keepNext w:val="0"/>
+              <w:keepNext/>
               <w:keepLines/>
               <w:spacing w:before="0" w:after="40" w:line="240" w:lineRule="auto"/>
               <w:jc w:val="center"/>
@@ -10391,7 +10778,7 @@
           <w:p>
             <w:pPr>
               <w:pStyle w:val="Compact"/>
-              <w:keepNext w:val="0"/>
+              <w:keepNext/>
               <w:keepLines/>
               <w:spacing w:before="0" w:after="40" w:line="240" w:lineRule="auto"/>
               <w:jc w:val="center"/>
@@ -10411,7 +10798,7 @@
           <w:p>
             <w:pPr>
               <w:pStyle w:val="Compact"/>
-              <w:keepNext w:val="0"/>
+              <w:keepNext/>
               <w:keepLines/>
               <w:spacing w:before="0" w:after="40" w:line="240" w:lineRule="auto"/>
               <w:jc w:val="center"/>
@@ -10431,7 +10818,7 @@
           <w:p>
             <w:pPr>
               <w:pStyle w:val="Compact"/>
-              <w:keepNext w:val="0"/>
+              <w:keepNext/>
               <w:keepLines/>
               <w:spacing w:before="0" w:after="40" w:line="240" w:lineRule="auto"/>
               <w:jc w:val="center"/>
@@ -10456,7 +10843,7 @@
           <w:p>
             <w:pPr>
               <w:pStyle w:val="Compact"/>
-              <w:keepNext w:val="0"/>
+              <w:keepNext/>
               <w:keepLines/>
               <w:spacing w:before="0" w:after="40" w:line="240" w:lineRule="auto"/>
               <w:jc w:val="left"/>
@@ -10476,7 +10863,7 @@
           <w:p>
             <w:pPr>
               <w:pStyle w:val="Compact"/>
-              <w:keepNext w:val="0"/>
+              <w:keepNext/>
               <w:keepLines/>
               <w:spacing w:before="0" w:after="40" w:line="240" w:lineRule="auto"/>
               <w:jc w:val="center"/>
@@ -10496,7 +10883,7 @@
           <w:p>
             <w:pPr>
               <w:pStyle w:val="Compact"/>
-              <w:keepNext w:val="0"/>
+              <w:keepNext/>
               <w:keepLines/>
               <w:spacing w:before="0" w:after="40" w:line="240" w:lineRule="auto"/>
               <w:jc w:val="center"/>
@@ -10516,7 +10903,7 @@
           <w:p>
             <w:pPr>
               <w:pStyle w:val="Compact"/>
-              <w:keepNext w:val="0"/>
+              <w:keepNext/>
               <w:keepLines/>
               <w:spacing w:before="0" w:after="40" w:line="240" w:lineRule="auto"/>
               <w:jc w:val="center"/>
@@ -10536,7 +10923,7 @@
           <w:p>
             <w:pPr>
               <w:pStyle w:val="Compact"/>
-              <w:keepNext w:val="0"/>
+              <w:keepNext/>
               <w:keepLines/>
               <w:spacing w:before="0" w:after="40" w:line="240" w:lineRule="auto"/>
               <w:jc w:val="center"/>
@@ -10556,7 +10943,7 @@
           <w:p>
             <w:pPr>
               <w:pStyle w:val="Compact"/>
-              <w:keepNext w:val="0"/>
+              <w:keepNext/>
               <w:keepLines/>
               <w:spacing w:before="0" w:after="40" w:line="240" w:lineRule="auto"/>
               <w:jc w:val="center"/>
@@ -10581,7 +10968,7 @@
           <w:p>
             <w:pPr>
               <w:pStyle w:val="Compact"/>
-              <w:keepNext w:val="0"/>
+              <w:keepNext/>
               <w:keepLines/>
               <w:spacing w:before="0" w:after="40" w:line="240" w:lineRule="auto"/>
               <w:jc w:val="left"/>
@@ -10601,7 +10988,7 @@
           <w:p>
             <w:pPr>
               <w:pStyle w:val="Compact"/>
-              <w:keepNext w:val="0"/>
+              <w:keepNext/>
               <w:keepLines/>
               <w:spacing w:before="0" w:after="40" w:line="240" w:lineRule="auto"/>
               <w:jc w:val="center"/>
@@ -10621,7 +11008,7 @@
           <w:p>
             <w:pPr>
               <w:pStyle w:val="Compact"/>
-              <w:keepNext w:val="0"/>
+              <w:keepNext/>
               <w:keepLines/>
               <w:spacing w:before="0" w:after="40" w:line="240" w:lineRule="auto"/>
               <w:jc w:val="center"/>
@@ -10641,7 +11028,7 @@
           <w:p>
             <w:pPr>
               <w:pStyle w:val="Compact"/>
-              <w:keepNext w:val="0"/>
+              <w:keepNext/>
               <w:keepLines/>
               <w:spacing w:before="0" w:after="40" w:line="240" w:lineRule="auto"/>
               <w:jc w:val="center"/>
@@ -10661,7 +11048,7 @@
           <w:p>
             <w:pPr>
               <w:pStyle w:val="Compact"/>
-              <w:keepNext w:val="0"/>
+              <w:keepNext/>
               <w:keepLines/>
               <w:spacing w:before="0" w:after="40" w:line="240" w:lineRule="auto"/>
               <w:jc w:val="center"/>
@@ -10681,7 +11068,7 @@
           <w:p>
             <w:pPr>
               <w:pStyle w:val="Compact"/>
-              <w:keepNext w:val="0"/>
+              <w:keepNext/>
               <w:keepLines/>
               <w:spacing w:before="0" w:after="40" w:line="240" w:lineRule="auto"/>
               <w:jc w:val="center"/>
@@ -10699,6 +11086,7 @@
     <w:p>
       <w:pPr>
         <w:pStyle w:val="BodyText"/>
+        <w:keepLines/>
         <w:spacing w:line="240" w:lineRule="auto" w:before="80" w:after="120"/>
       </w:pPr>
       <w:r>
@@ -10801,7 +11189,7 @@
         <w:pStyle w:val="FirstParagraph"/>
       </w:pPr>
       <w:r>
-        <w:t xml:space="preserve">Housing’s electoral geography has a spatial scope, an electorate and an institutional basis for observation. Across Seoul’s districts, the price–vote association is positive in all six elections, extending Han’s (2024) district-level evidence, although the earlier associations depend heavily on the three southeastern districts. Inside districts, the association extends beyond those three districts among election-day voters in 2012 and the four sampled elections from 2022. For all residents, that extension is established in 2026 under the main assumptions; the 2024 whole-city result is fragile and the 2022 and 2025 signs remain unresolved. Price-group contrasts outside the three districts are borderline even in 2026. Together, these results locate the geographic and electoral reach that accounts of housing interests, residential sorting and place identity must explain.</w:t>
+        <w:t xml:space="preserve">Higher-price neighborhoods in Seoul vote more conservatively among election-day voters in 2012 and the four sampled elections from 2022, including outside Gangnam, Seocho and Songpa. The extension across voting modes is established in 2026 under the main assumptions, is sensitive to specification in 2024, and remains unresolved in 2022 and 2025. Even in 2026, the result outside the three districts depends on high-price neighborhoods, and the median-split contrast includes zero. These distinctions matter for explanations of housing politics: the observed gradient extends beyond the southeastern enclave, but evidence for a general separation between higher- and lower-price groups is weaker.</w:t>
       </w:r>
     </w:p>
     <w:p>
@@ -10809,7 +11197,7 @@
         <w:pStyle w:val="BodyText"/>
       </w:pPr>
       <w:r>
-        <w:t xml:space="preserve">The distinction between voting groups changes the substantive account of housing politics. The price gradient among election-day voters is directly observed, while its extension to politically different early voters depends on their unreported residential distribution. Our bounds make that extension testable under explicit restrictions and quantify the departures that change the result. A positive gradient across all compatible allocations establishes alignment throughout the specified uncertainty set; an unresolved sign identifies which additional information or assumptions would settle the question. This makes the reach of the housing–vote relationship an empirical result with an explicit electorate.</w:t>
+        <w:t xml:space="preserve">The comparison across voting modes changes what can be inferred from a neighborhood map. Election-day voters supply a directly observed residential pattern, but early voters are politically different and partly missing from residential returns. A conventional allocation supplies one answer to that missing-data problem. Our bounds show whether other allocations consistent with the same counts can reverse it, and how much restrictions on movement and composition narrow the answer. The finding of an unresolved sign is consequently informative about the evidence needed to establish the relationship; it does not imply that housing and voting are unrelated.</w:t>
       </w:r>
     </w:p>
     <w:p>
@@ -10817,7 +11205,7 @@
         <w:pStyle w:val="BodyText"/>
       </w:pPr>
       <w:r>
-        <w:t xml:space="preserve">The institutional result shows why electoral reporting belongs in the analysis of political geography. Applying finer zones to the same 2026 returns can establish the sign under weaker assumptions: administrative information changes what can be demonstrated about a fixed electorate. Cross-election comparisons must therefore distinguish political change from changes in what returns reveal. The within-election design isolates the latter contribution.</w:t>
+        <w:t xml:space="preserve">The analysis also identifies information that election administration could supply. Finer statutory zones can establish a sign that remains unresolved under the same movement cap and coarser boundaries. Exact residence reporting of out-of-zone ballots would guarantee reductions of 27–57% in the remaining range under the main assumptions, although it need not settle an unresolved sign. The suppression exercise shows that some of this gain can survive withholding small counts. Operational costs and disclosure risks still require assessment before implementing such a release.</w:t>
       </w:r>
     </w:p>
     <w:p>
@@ -10825,7 +11213,7 @@
         <w:pStyle w:val="BodyText"/>
       </w:pPr>
       <w:r>
-        <w:t xml:space="preserve">These distinctions matter for how neighborhood studies are read. Analyses of published dong returns, including Kim and Kang’s (2022) study of price levels and Yun and Jun’s (2024) study of price changes, face the attribution problem unless they account for pooled ballots and early voters’ movement, although our analysis does not test their estimates directly. Explicit allocations such as Lee’s (2026) make their assumptions visible but yield a single slope even where the sign is undetermined. Neighborhood analyses should report the treatment of unattributed ballots, show which conclusions depend on that treatment, and report the election-day relation, which needs none.</w:t>
+        <w:t xml:space="preserve">For studies using published neighborhood returns, the practical implication is to state how unattributed ballots are handled and show whether the substantive conclusion depends on that choice. This applies to the price-level and price-change questions studied by Kim and Kang (2022) and Yun and Jun (2024), although we do not directly test their estimates. Explicit allocations such as Lee’s (2026) make their rules visible; allocation bounds add a measure of the conclusions those rules leave open. Reporting the election-day relationship alongside the resident-based range gives readers an observed benchmark and a clear account of the extrapolation across voters.</w:t>
       </w:r>
     </w:p>
     <w:p>
@@ -10833,7 +11221,7 @@
         <w:pStyle w:val="BodyText"/>
       </w:pPr>
       <w:r>
-        <w:t xml:space="preserve">The attribution problem also arises where ballots cast away from a voter’s assigned polling place are reported at a larger scale. German precinct results omit postal ballots, which were close to half of all ballots in 2021; Australian booth results omit declaration votes (Online Appendix B.5); and many American states report absentee and early ballots only at the county level, requiring precinct datasets to allocate them by assumption (Amos et al. 2017; Baltz et al. 2022). Other systems trade detail against attribution differently (Online Appendix Table B2). Taiwan requires voters to vote at the station of their household registration, so station returns are residence-based. Japan mixes all ballots, including early ballots, at the counting district (開票区), usually a whole municipality or ward, and reports nothing below it: its returns contain no misattribution within that unit but cannot speak to neighborhoods at all. Korea lies between these, publishing neighborhood rows that mix residents’ and neighbors’ early ballots and omit pooled ones. For the spatial claims examined here, such fine but mixed returns support conclusions that exact but coarse returns could not address, provided that their mixing is bounded explicitly. Applying our approach elsewhere requires small-area returns, candidate totals for pooled ballots, and compatible information on registered residents’ use of voting modes. Whether a particular system publishes enough information is an empirical question; where it does, the method can assess the spatial claims its returns support.</w:t>
+        <w:t xml:space="preserve">Other electoral systems face different versions of this problem. German precinct returns omit postal ballots, Australian booth returns omit declaration votes, and many American precinct datasets must allocate absentee ballots reported at county level (Online Appendix B.5; Amos et al. 2017; Baltz et al. 2022). Taiwan ties voting to household registration and reports residence-based station returns. Japan combines ballots at the counting district, usually a municipality or ward, with no neighborhood results. Korea publishes finer rows but mixes residential origins within them. Applying the approach elsewhere requires small-area returns, candidate totals for pooled ballots and compatible information on residents’ use of voting modes. These reporting differences determine which geographic questions the data can answer.</w:t>
       </w:r>
     </w:p>
     <w:p>
@@ -10841,15 +11229,7 @@
         <w:pStyle w:val="BodyText"/>
       </w:pPr>
       <w:r>
-        <w:t xml:space="preserve">The six-election design also defines a comparative research agenda. Applying the same allocation analysis to earlier local elections would test the reach of the 2026 result across candidates and turnout conditions; separating party and candidate components would extend the 2024 legislative comparison. Historical age profiles and direct information on early-voting movements would further refine the existing sensitivity analyses. The present results concern housing-price differences among registered neighborhoods, with the causal mechanisms behind that alignment remaining a task for complementary research.</w:t>
-      </w:r>
-    </w:p>
-    <w:p>
-      <w:pPr>
-        <w:pStyle w:val="BodyText"/>
-      </w:pPr>
-      <w:r>
-        <w:t xml:space="preserve">The broader contribution is a standard of evidence for claims about political places: specify the spatial comparison, identify which residents’ votes it represents, and show how the treatment of unattributed ballots affects the conclusion. Residence reporting could reduce the uncertainty materially, with gains depending on the disclosure rule. Together, the empirical results and reporting analysis establish a housing-related gradient beyond Seoul’s southeastern enclave among election-day voters, define the conditions for its extension across the electorate, and quantify the gains from reporting ballots by residence.</w:t>
+        <w:t xml:space="preserve">Earlier local elections would test whether the 2026 pattern recurs across candidates and turnout conditions. Historical age profiles and direct observations of early-voting movements could also sharpen the sensitivity analysis. For the six contests studied here, the contribution is specific: the paper establishes the geographic reach of the election-day gradient, measures the conditions for its extension across voting modes, and identifies reporting changes that would make that extension less dependent on assumptions.</w:t>
       </w:r>
     </w:p>
     <w:bookmarkEnd w:id="46"/>

</xml_diff>

<commit_message>
Build review-ready documents after repository audit
</commit_message>
<xml_diff>
--- a/paper/build/manuscript.docx
+++ b/paper/build/manuscript.docx
@@ -168,7 +168,7 @@
         <w:pStyle w:val="BodyText"/>
       </w:pPr>
       <w:r>
-        <w:t xml:space="preserve">Since nationwide early voting began in 2014, a substantial share of Seoul’s ballots has been affected. In recent elections, 22–35% were cast early inside the voter’s statutory zone and counted at the station’s neighborhood. Another 12–15% were out-of-zone, at-home or overseas ballots reported only for a district or constituency. Only election-day ballots are attributed exactly to residential neighborhoods. Conservative support among in-zone early voters averaged 4 percentage points below the election-day share in the same district in 2017, and 10, 12, 28 and 26 points below it in 2022, 2024, 2025 and 2026 (Online Appendix Table C8). Korean and comparative research documents political selection and participation differences under early and convenience voting (Ka 2021; Gronke et al. 2008; Kaplan and Yuan 2020). Assuming that these voters share election-day voters’ neighborhood pattern can therefore change the substantive conclusion.</w:t>
+        <w:t xml:space="preserve">Since nationwide early voting began in 2014, a substantial share of Seoul’s ballots has been affected. In recent elections, 22–35% were cast early inside the voter’s statutory zone and counted at the station’s neighborhood. Another 12–15% were out-of-zone, at-home or overseas ballots reported only for a district or constituency. Only election-day ballots are attributed exactly to residential neighborhoods. Conservative support among in-zone early voters averaged 4 percentage points below the election-day share in the same counting jurisdiction (district, or constituency in 2024) in 2017, and 10, 12, 28 and 26 points below it in 2022, 2024, 2025 and 2026 (Online Appendix Table C8). Korean and comparative research documents political selection and participation differences under early and convenience voting (Ka 2021; Gronke et al. 2008; Kaplan and Yuan 2020). Assuming that these voters share election-day voters’ neighborhood pattern can therefore change the substantive conclusion.</w:t>
       </w:r>
     </w:p>
     <w:p>
@@ -2661,7 +2661,7 @@
         </m:r>
       </m:oMath>
       <w:r>
-        <w:t xml:space="preserve">, ten points in the main specification. A version that first shifts the station shares by the district’s observed difference between out-of-zone and in-zone early voters yields nearly identical results.</w:t>
+        <w:t xml:space="preserve">, ten points in the main specification. A version that first shifts the station shares by the counting jurisdiction’s observed difference between out-of-zone and in-zone early voters yields nearly identical results.</w:t>
       </w:r>
     </w:p>
     <w:p>
@@ -2683,7 +2683,7 @@
         <w:t xml:space="preserve"> </w:t>
       </w:r>
       <w:r>
-        <w:t xml:space="preserve">We benchmark each neighborhood’s early vote by its own election-day vote, shifted by the district’s observed gap between early and election-day voters. We then allow residents’ early ballots, wherever in the zone they were cast, to depart from this benchmark as much as their station’s ballots do, plus an additional tolerance</w:t>
+        <w:t xml:space="preserve">We benchmark each neighborhood’s early vote by its own election-day vote, shifted by the counting jurisdiction’s observed gap between early and election-day voters. The jurisdiction is a district, or a parliamentary constituency in 2024. We then allow residents’ early ballots, wherever in the zone they were cast, to depart from this benchmark as much as their station’s ballots do, plus an additional tolerance</w:t>
       </w:r>
       <w:r>
         <w:t xml:space="preserve"> </w:t>
@@ -2731,7 +2731,7 @@
         </m:r>
       </m:oMath>
       <w:r>
-        <w:t xml:space="preserve">, residents’ early ballots inherit their neighborhood’s election-day vote, shifted by a district-wide gap. Its role is therefore to ask how far the early-vote gradient could differ from the election-day gradient, which is point-identified (Section 4.2), before a conclusion about all residents changes.</w:t>
+        <w:t xml:space="preserve">, residents’ early ballots inherit their neighborhood’s election-day vote, shifted by a jurisdiction-wide gap. Its role is therefore to ask how far the early-vote gradient could differ from the election-day gradient, which is point-identified (Section 4.2), before a conclusion about all residents changes.</w:t>
       </w:r>
     </w:p>
     <w:p>
@@ -2798,7 +2798,7 @@
         <w:t xml:space="preserve">main assumptions</w:t>
       </w:r>
       <w:r>
-        <w:t xml:space="preserve">. They are reference points, not validated error bounds. Stations’ own ballots depart from the benchmark by a median of about one point, and in the five elections with early voting the conservative share among a district’s out-of-zone early voters differs from that among its in-zone early voters by at most 7.7 points (Online Appendix Table C21), so the 10-point tolerance exceeds every district-level gap observed. What</w:t>
+        <w:t xml:space="preserve">. They are reference points, not validated error bounds. Stations’ own ballots depart from the benchmark by a median of about one point, and in the five elections with early voting the conservative share among a jurisdiction’s out-of-zone early voters differs from that among its in-zone early voters by at most 7.7 points (Online Appendix Table C21), so the 10-point tolerance exceeds every jurisdiction-level gap observed. What</w:t>
       </w:r>
       <w:r>
         <w:t xml:space="preserve"> </w:t>
@@ -2812,7 +2812,7 @@
         <w:t xml:space="preserve"> </w:t>
       </w:r>
       <w:r>
-        <w:t xml:space="preserve">bounds, however, is the gap for each neighborhood’s residents, which is not observed and may vary within a district more than district totals show. Moreover, the population classified as out-of-zone differs across election types. We therefore treat as evidence the range of settings under which a conclusion holds: each assumption is indexed by one parameter, so we report how far it can be relaxed before a conclusion changes and what the allocation that first reverses it looks like (Masten and Poirier 2020; Table 3, Panel B; Section 4.5). Box 2 states the accounting identities and the outcome; Online Appendix A gives the assumptions in the same notation.</w:t>
+        <w:t xml:space="preserve">bounds, however, is the gap for each neighborhood’s residents, which is not observed and may vary within a district more than jurisdiction totals show. Moreover, the population classified as out-of-zone differs across election types. We therefore treat as evidence the range of settings under which a conclusion holds: each assumption is indexed by one parameter, so we report how far it can be relaxed before a conclusion changes and what the allocation that first reverses it looks like (Masten and Poirier 2020; Table 3, Panel B; Section 4.5). Box 2 states the accounting identities and the outcome; Online Appendix A gives the assumptions in the same notation.</w:t>
       </w:r>
     </w:p>
     <w:p>
@@ -8937,7 +8937,7 @@
         <w:t xml:space="preserve"> </w:t>
       </w:r>
       <w:r>
-        <w:t xml:space="preserve">The unresolved signs can be settled by a different assumption that limits how residents’ early-vote departures align with neighborhood prices, rather than limiting each neighborhood separately (Online Appendix A.1 and Table C22). For all of Seoul, departure slopes at the scale of observed station patterns would establish positive gradients in the four sampled elections from 2022. Those patterns concern station voters or district averages, however, and do not measure the unobserved residential departures being restricted. Outside the three districts the conclusion is less uniform. Appendix C reports the thresholds and comparisons, including a restriction on out-of-zone departures alone (Table C25). These exercises identify assumptions that would settle the open signs; they do not establish that those assumptions hold.</w:t>
+        <w:t xml:space="preserve">The unresolved signs can be settled by a different assumption that limits how residents’ early-vote departures align with neighborhood prices, rather than limiting each neighborhood separately (Online Appendix A.1 and Table C22). Keeping the ten-point out-of-zone restriction, departure slopes at the scale of observed station patterns would establish positive gradients for all of Seoul in the four sampled elections from 2022. Those patterns concern station voters or district averages, however, and do not measure the unobserved residential departures being restricted. Outside the three districts the conclusion is less uniform. Appendix C reports the thresholds and comparisons, including a restriction on out-of-zone departures alone (Table C25). These exercises identify assumptions that would settle the open signs; they do not establish that those assumptions hold.</w:t>
       </w:r>
     </w:p>
     <w:p>
@@ -10294,7 +10294,7 @@
         <w:pStyle w:val="BodyText"/>
       </w:pPr>
       <w:r>
-        <w:t xml:space="preserve">A benchmark that varies with price within districts, motivated by larger early-vote gaps in higher-price districts in 2024–2026, changes the 2026 result only slightly (Table 2, column F), as does shifting the out-of-zone benchmark by the observed out-of-zone gap (Table C9). Valid-vote shares</w:t>
+        <w:t xml:space="preserve">A benchmark that varies with price within districts, motivated by larger early-vote gaps in higher-price counting jurisdictions in 2024–2026, changes the 2026 result only slightly (Table 2, column F), as does shifting the out-of-zone benchmark by the observed out-of-zone gap (Table C9). Valid-vote shares</w:t>
       </w:r>
       <w:r>
         <w:t xml:space="preserve"> </w:t>
@@ -11247,7 +11247,7 @@
         <w:pStyle w:val="FirstParagraph"/>
       </w:pPr>
       <w:r>
-        <w:t xml:space="preserve">An anonymized replication package provides the analysis inputs, available source snapshots, code and commands for regenerating the tables and figures and checking the headline calculations; it will be deposited publicly upon acceptance. For 2025 prices, it includes the archived summary and a separately documented reconstruction from a new transaction snapshot. The original summary-generation materials are unavailable; Online Appendix B.3 documents this distinction and Table C28 reports the sensitivity comparison.</w:t>
+        <w:t xml:space="preserve">An anonymized replication package accompanies the submission and provides the analysis inputs, available source snapshots, and code for regenerating the tables and figures and checking the headline calculations. For 2025 prices, it includes the archived summary and a separately documented reconstruction from a new transaction snapshot. The original summary-generation materials are unavailable; Online Appendix B.3 documents this distinction and Table C28 reports the sensitivity comparison.</w:t>
       </w:r>
     </w:p>
     <w:bookmarkEnd w:id="47"/>

</xml_diff>

<commit_message>
Build reviewed JJPS v6 documents from committed sources
</commit_message>
<xml_diff>
--- a/paper/build/manuscript.docx
+++ b/paper/build/manuscript.docx
@@ -97,7 +97,7 @@
         <w:t xml:space="preserve"> </w:t>
       </w:r>
       <w:r>
-        <w:t xml:space="preserve">Neighborhood election returns can combine residents’ votes with ballots cast by people who live elsewhere. We examine how this reporting problem affects the association between housing prices and conservative voting in six Seoul elections, 2012–2026. Among election-day voters, the positive within-district gradient extends beyond Gangnam, Seocho and Songpa in 2012 and the four sampled elections from 2022. To assess the relationship across voting modes, we bound a resident-based, roll-denominator vote share over allocations consistent with returns, electoral rolls and statutory voting zones. Returns alone leave the sign unresolved in every sampled election with nationwide early voting. Under the main movement and composition restrictions, the gradient is positive in 2026, narrowly positive in 2024, and unresolved in 2022 and 2025. The 2026 result extends beyond the three districts but is sensitive to out-of-zone composition and the highest-price neighborhoods. Holding votes fixed, finer statutory zones can establish the sign under weaker restrictions. Reporting out-of-zone ballots by registered neighborhood would guarantee reductions of 27–57% in the remaining range across the four recent elections under the main restrictions. These results show which housing-related electoral patterns survive uncertain residential attribution and how reporting changes could make neighborhood comparisons more informative.</w:t>
+        <w:t xml:space="preserve">Neighborhood election returns can combine residents’ votes with ballots cast by people who live elsewhere. We examine how this reporting problem affects the association between housing prices and conservative voting in six Seoul elections, 2012–2026. The positive within-district gradient among election-day voters extends beyond Gangnam, Seocho and Songpa in 2012 and the four sampled elections from 2022. For residents across voting modes, allocation bounds give a different conclusion: returns alone leave the sign unresolved in every sampled election with nationwide early voting. Under reference restrictions on movement and composition, the gradient is positive in 2026, fragile in 2024, and unresolved in 2022 and 2025. The 2026 extension beyond the three districts remains sensitive to out-of-zone composition and the highest-price neighborhoods. Holding votes fixed, finer statutory zones can establish the sign under weaker restrictions. Exact reporting of out-of-zone ballots by registered neighborhood would guarantee reductions of 27–57% in the remaining range across the four recent elections under the reference restrictions. The findings distinguish the observed geography of housing-related voting from its conditional extension across voters, and quantify how reporting institutions shape the evidence for that extension.</w:t>
       </w:r>
     </w:p>
     <w:p>
@@ -168,7 +168,7 @@
         <w:pStyle w:val="BodyText"/>
       </w:pPr>
       <w:r>
-        <w:t xml:space="preserve">Since nationwide early voting began in 2014, a substantial share of Seoul’s ballots has been affected. In recent elections, 22–35% were cast early inside the voter’s statutory zone and counted at the station’s neighborhood. Another 12–15% were out-of-zone, at-home or overseas ballots reported only for a district or constituency. Only election-day ballots are attributed exactly to residential neighborhoods. Conservative support among in-zone early voters averaged 4 percentage points below the election-day share in the same counting jurisdiction (district, or constituency in 2024) in 2017, and 10, 12, 28 and 26 points below it in 2022, 2024, 2025 and 2026 (Online Appendix Table C8). Korean and comparative research documents political selection and participation differences under early and convenience voting (Ka 2021; Gronke et al. 2008; Kaplan and Yuan 2020). Assuming that these voters share election-day voters’ neighborhood pattern can therefore change the substantive conclusion.</w:t>
+        <w:t xml:space="preserve">Since nationwide early voting began in 2014, a substantial share of Seoul’s ballots has been affected. In recent elections, 22–35% were cast early inside the voter’s statutory zone and counted at the station’s neighborhood. Another 12–15% were out-of-zone, at-home or overseas ballots reported only for a district or constituency. Only election-day ballots are attributed exactly to residential neighborhoods. Conservative support among in-zone early voters averaged 4 percentage points below the election-day share in the same counting jurisdiction (district, or constituency in 2024) in 2017, and 10, 12, 28 and 26 points below it in 2022, 2024, 2025 and 2026 (Online Appendix Table C5). Korean and comparative research documents political selection and participation differences under early and convenience voting (Ka 2021; Gronke et al. 2008; Kaplan and Yuan 2020). Assuming that these voters share election-day voters’ neighborhood pattern can therefore change the substantive conclusion.</w:t>
       </w:r>
     </w:p>
     <w:p>
@@ -200,7 +200,7 @@
         <w:pStyle w:val="BodyText"/>
       </w:pPr>
       <w:r>
-        <w:t xml:space="preserve">The paper contributes to housing politics by establishing where the observed association extends beyond Seoul’s southeastern enclave and which claims about the wider electorate require assumptions about early voters. It also addresses a measurement problem distinct from changing the size or boundaries of spatial units (Lee et al. 2025): ballots can be attributed to the wrong neighborhood even when boundaries remain fixed. Related problems arise for German postal ballots, Australian declaration votes and American precinct datasets that allocate absentee votes (Online Appendix B.5; Amos et al. 2017; Baltz et al. 2022). Explicit allocation bounds allow those residential claims to be assessed without selecting a single unobserved distribution of votes.</w:t>
+        <w:t xml:space="preserve">The housing-politics contribution is to distinguish three claims that a single price–vote correlation can obscure: a contrast between the southeastern enclave and the rest of Seoul, a gradient among neighborhoods outside that enclave, and an association among residents across voting modes. Our results support these claims to different degrees. The 2026 gradient beyond the three districts remains sensitive to the highest-price neighborhoods, while the median-split contrast includes zero; an association outside Gangnam therefore need not describe a broad divide across the price distribution. The reporting analysis then measures which additional information could establish stronger residential comparisons. This is a measurement problem distinct from changing the size or boundaries of spatial units (Lee et al. 2025): ballots can be attributed to the wrong neighborhood even when boundaries remain fixed. Related problems arise for German postal ballots, Australian declaration votes and American precinct datasets that allocate absentee votes (Online Appendix B.5; Amos et al. 2017; Baltz et al. 2022). Explicit allocation bounds allow those residential claims to be assessed without selecting a single unobserved distribution of votes.</w:t>
       </w:r>
     </w:p>
     <w:bookmarkEnd w:id="20"/>
@@ -257,7 +257,7 @@
         <w:pStyle w:val="BodyText"/>
       </w:pPr>
       <w:r>
-        <w:t xml:space="preserve">The comparisons answer progressively narrower empirical questions. District-level estimates describe differences across Seoul; district fixed effects ask whether more expensive neighborhoods also vote more conservatively than other neighborhoods in the same district. Excluding Gangnam, Seocho and Songpa tests how much that relation depends on the southeastern enclave. Finally, comparing election-day voters with residents across all voting modes tests whether the pattern extends to politically different early voters. Income, age and residential selection remain possible explanations of the neighborhood association. The analysis identifies its geographic and electoral reach, not a causal effect of housing wealth.</w:t>
+        <w:t xml:space="preserve">The comparisons answer progressively narrower empirical questions. District-level estimates describe differences across Seoul; district fixed effects ask whether more expensive neighborhoods also vote more conservatively than other neighborhoods in the same district. Excluding Gangnam, Seocho and Songpa tests how much that relation depends on the southeastern enclave. Finally, comparing election-day voters with residents across all voting modes tests whether the pattern extends to politically different early voters. Income, age and residential selection remain possible explanations of the neighborhood association. The analysis identifies its geographic and electoral reach, not a causal effect of housing wealth. The distinction between excluding a named enclave and excluding the price distribution’s upper tail is substantively useful: it asks whether the pattern is confined to one place or remains concentrated among expensive places elsewhere. Neither comparison identifies owners’ interests, sorting or place identity as the mechanism.</w:t>
       </w:r>
     </w:p>
     <w:p>
@@ -327,6 +327,23 @@
     <w:p>
       <w:pPr>
         <w:pStyle w:val="BodyText"/>
+      </w:pPr>
+      <w:r>
+        <w:t xml:space="preserve">The early-voting zone is decisive for our question, because a voter can be misattributed to another neighborhood only inside it. In presidential elections the zone is the whole district, about 17 neighborhoods; in National Assembly elections it is the constituency where a district holds two or more (Regulations, Art. 86(3)). In the 2026 local elections it was the district-council constituency (Regulations, Art. 133(3); National Election Commission 2022a): 155 constituencies in Seoul, with 2.8 neighborhoods on average. The council returns are consistent with this restriction: at all 320 early-voting stations in contested constituencies, the number of early voters in the council contest equals the number in the mayoral contest.</w:t>
+      </w:r>
+    </w:p>
+    <w:p>
+      <w:pPr>
+        <w:pStyle w:val="BodyText"/>
+      </w:pPr>
+      <w:r>
+        <w:t xml:space="preserve">Two features of the published data make inference possible. The election-day roll is printed after early voting with early voters marked, so the difference between each neighborhood’s electorate and its election-day roll counts the residents removed from that roll: those who voted early or were registered to vote at home or abroad, some of whom cast no counted ballot. And pooled-ballot totals are published by candidate for each counting jurisdiction. With each station’s count, these numbers constrain how the unattributed ballots can have been distributed.</w:t>
+      </w:r>
+    </w:p>
+    <w:p>
+      <w:pPr>
+        <w:pStyle w:val="BodyText"/>
+        <w:keepNext/>
       </w:pPr>
       <w:r>
         <w:rPr>
@@ -445,7 +462,7 @@
           <w:p>
             <w:pPr>
               <w:pStyle w:val="Compact"/>
-              <w:keepNext w:val="0"/>
+              <w:keepNext/>
               <w:keepLines/>
               <w:spacing w:before="0" w:after="40" w:line="240" w:lineRule="auto"/>
               <w:jc w:val="left"/>
@@ -465,7 +482,7 @@
           <w:p>
             <w:pPr>
               <w:pStyle w:val="Compact"/>
-              <w:keepNext w:val="0"/>
+              <w:keepNext/>
               <w:keepLines/>
               <w:spacing w:before="0" w:after="40" w:line="240" w:lineRule="auto"/>
               <w:jc w:val="center"/>
@@ -485,7 +502,7 @@
           <w:p>
             <w:pPr>
               <w:pStyle w:val="Compact"/>
-              <w:keepNext w:val="0"/>
+              <w:keepNext/>
               <w:keepLines/>
               <w:spacing w:before="0" w:after="40" w:line="240" w:lineRule="auto"/>
               <w:jc w:val="center"/>
@@ -510,7 +527,7 @@
           <w:p>
             <w:pPr>
               <w:pStyle w:val="Compact"/>
-              <w:keepNext w:val="0"/>
+              <w:keepNext/>
               <w:keepLines/>
               <w:spacing w:before="0" w:after="40" w:line="240" w:lineRule="auto"/>
               <w:jc w:val="left"/>
@@ -530,7 +547,7 @@
           <w:p>
             <w:pPr>
               <w:pStyle w:val="Compact"/>
-              <w:keepNext w:val="0"/>
+              <w:keepNext/>
               <w:keepLines/>
               <w:spacing w:before="0" w:after="40" w:line="240" w:lineRule="auto"/>
               <w:jc w:val="center"/>
@@ -550,7 +567,7 @@
           <w:p>
             <w:pPr>
               <w:pStyle w:val="Compact"/>
-              <w:keepNext w:val="0"/>
+              <w:keepNext/>
               <w:keepLines/>
               <w:spacing w:before="0" w:after="40" w:line="240" w:lineRule="auto"/>
               <w:jc w:val="center"/>
@@ -575,7 +592,7 @@
           <w:p>
             <w:pPr>
               <w:pStyle w:val="Compact"/>
-              <w:keepNext w:val="0"/>
+              <w:keepNext/>
               <w:keepLines/>
               <w:spacing w:before="0" w:after="40" w:line="240" w:lineRule="auto"/>
               <w:jc w:val="left"/>
@@ -595,7 +612,7 @@
           <w:p>
             <w:pPr>
               <w:pStyle w:val="Compact"/>
-              <w:keepNext w:val="0"/>
+              <w:keepNext/>
               <w:keepLines/>
               <w:spacing w:before="0" w:after="40" w:line="240" w:lineRule="auto"/>
               <w:jc w:val="center"/>
@@ -615,7 +632,7 @@
           <w:p>
             <w:pPr>
               <w:pStyle w:val="Compact"/>
-              <w:keepNext w:val="0"/>
+              <w:keepNext/>
               <w:keepLines/>
               <w:spacing w:before="0" w:after="40" w:line="240" w:lineRule="auto"/>
               <w:jc w:val="center"/>
@@ -640,7 +657,7 @@
           <w:p>
             <w:pPr>
               <w:pStyle w:val="Compact"/>
-              <w:keepNext w:val="0"/>
+              <w:keepNext/>
               <w:keepLines/>
               <w:spacing w:before="0" w:after="40" w:line="240" w:lineRule="auto"/>
               <w:jc w:val="left"/>
@@ -660,7 +677,7 @@
           <w:p>
             <w:pPr>
               <w:pStyle w:val="Compact"/>
-              <w:keepNext w:val="0"/>
+              <w:keepNext/>
               <w:keepLines/>
               <w:spacing w:before="0" w:after="40" w:line="240" w:lineRule="auto"/>
               <w:jc w:val="center"/>
@@ -680,7 +697,7 @@
           <w:p>
             <w:pPr>
               <w:pStyle w:val="Compact"/>
-              <w:keepNext w:val="0"/>
+              <w:keepNext/>
               <w:keepLines/>
               <w:spacing w:before="0" w:after="40" w:line="240" w:lineRule="auto"/>
               <w:jc w:val="center"/>
@@ -816,56 +833,8 @@
         <w:t xml:space="preserve">Figure 1. Where a Seoul resident’s ballot is reported, by voting mode, since 2014. The zone is the district; in National Assembly elections, the constituency where a district holds two or more; in local elections, the district-council constituency.</w:t>
       </w:r>
     </w:p>
-    <w:p>
-      <w:pPr>
-        <w:pStyle w:val="BodyText"/>
-      </w:pPr>
-      <w:r>
-        <w:t xml:space="preserve">The early-voting zone is decisive for our question, because a voter can be misattributed to another neighborhood only inside it. In presidential elections the zone is the whole district, about 17 neighborhoods; in National Assembly elections it is the constituency where a district holds two or more (Regulations, Art. 86(3)). In the 2026 local elections it was the district-council constituency (Regulations, Art. 133(3); National Election Commission 2022a): 155 constituencies in Seoul, with 2.8 neighborhoods on average. The council returns are consistent with this restriction: at all 320 early-voting stations in contested constituencies, the number of early voters in the council contest equals the number in the mayoral contest.</w:t>
-      </w:r>
-    </w:p>
-    <w:p>
-      <w:pPr>
-        <w:pStyle w:val="BodyText"/>
-      </w:pPr>
-      <w:r>
-        <w:t xml:space="preserve">Two features of the published data make inference possible. The election-day roll is printed after early voting with early voters marked, so the difference between each neighborhood’s electorate and its election-day roll counts the residents removed from that roll: those who voted early or were registered to vote at home or abroad, some of whom cast no counted ballot. And pooled-ballot totals are published by candidate for each counting jurisdiction. With each station’s count, these numbers constrain how the unattributed ballots can have been distributed.</w:t>
-      </w:r>
-    </w:p>
     <w:bookmarkEnd w:id="25"/>
     <w:bookmarkStart w:id="26" w:name="data"/>
-    <w:p>
-      <w:pPr>
-        <w:pStyle w:val="Heading2"/>
-      </w:pPr>
-      <w:r>
-        <w:t xml:space="preserve">3.2 Data</w:t>
-      </w:r>
-    </w:p>
-    <w:p>
-      <w:pPr>
-        <w:pStyle w:val="FirstParagraph"/>
-      </w:pPr>
-      <w:r>
-        <w:t xml:space="preserve">We study the presidential elections of 2012, 2017, 2022 and 2025, the 2024 National Assembly election and the 2026 election of the mayor of Seoul (Table 1). The four presidential contests permit same-office comparisons. The legislative and mayoral contests provide different early-voting zones: parliamentary constituencies in 2024 and smaller district-council constituencies in 2026. The dataset covers these six contests; the cross-election comparisons do not estimate a continuous trend (Online Appendix B.1).</w:t>
-      </w:r>
-    </w:p>
-    <w:p>
-      <w:pPr>
-        <w:pStyle w:val="BodyText"/>
-      </w:pPr>
-      <w:r>
-        <w:t xml:space="preserve">Returns and electorates are the National Election Commission’s official counting-unit files and electorate records (National Election Commission 2026). The 2026 zones come from its official table of council constituencies and neighborhoods. We measure support for the main conservative candidate: Park Geun-hye (2012), Hong Joon-pyo (2017), Yoon Suk Yeol (2022), the People Power Party’s constituency candidates (2024), Kim Moon-soo (2025) and Oh Se-hoon (2026). In 2017 the conservative vote was split. Combining Hong with Yoo Seung-min also leaves the within-district sign unresolved under returns alone and minimal movement (Online Appendix Table C24).</w:t>
-      </w:r>
-    </w:p>
-    <w:p>
-      <w:pPr>
-        <w:pStyle w:val="BodyText"/>
-      </w:pPr>
-      <w:r>
-        <w:t xml:space="preserve">Neighborhood prices are medians of apartment sale prices per square meter during the twelve complete calendar months before each election month, from Ministry of Land, Infrastructure and Transport (2026) transactions geocoded to neighborhoods. They measure traded apartments, not residents’ ownership or wealth. The movement scenarios use Seoul Living Mobility data, which estimate trips from mobile-phone signals and are available from 2022 (Seoul Metropolitan Government and KT 2026). Table 1 gives price coverage and the shares of votes requiring residential allocation; Online Appendix B documents the sources and construction.</w:t>
-      </w:r>
-    </w:p>
     <w:p>
       <w:pPr>
         <w:sectPr>
@@ -874,6 +843,30 @@
           <w:type w:val="nextPage"/>
         </w:sectPr>
       </w:pPr>
+    </w:p>
+    <w:p>
+      <w:pPr>
+        <w:pStyle w:val="Heading2"/>
+      </w:pPr>
+      <w:r>
+        <w:t xml:space="preserve">3.2 Data</w:t>
+      </w:r>
+    </w:p>
+    <w:p>
+      <w:pPr>
+        <w:pStyle w:val="FirstParagraph"/>
+      </w:pPr>
+      <w:r>
+        <w:t xml:space="preserve">We study the presidential elections of 2012, 2017, 2022 and 2025, the 2024 National Assembly election and the 2026 election of the mayor of Seoul (Table 1). The four presidential contests permit same-office comparisons. The legislative and mayoral contests provide different early-voting zones: parliamentary constituencies in 2024 and smaller district-council constituencies in 2026. The dataset covers these six contests; the cross-election comparisons do not estimate a continuous trend (Online Appendix B.1).</w:t>
+      </w:r>
+    </w:p>
+    <w:p>
+      <w:pPr>
+        <w:pStyle w:val="BodyText"/>
+      </w:pPr>
+      <w:r>
+        <w:t xml:space="preserve">Returns and electorates are the National Election Commission’s official counting-unit files and electorate records (National Election Commission 2026). The 2026 zones come from its official table of council constituencies and neighborhoods. We measure support for the main conservative candidate: Park Geun-hye (2012), Hong Joon-pyo (2017), Yoon Suk Yeol (2022), the People Power Party’s constituency candidates (2024), Kim Moon-soo (2025) and Oh Se-hoon (2026). In 2017 the conservative vote was split. Combining Hong with Yoo Seung-min also leaves the within-district sign unresolved under returns alone and minimal movement (Online Appendix Table C26).</w:t>
+      </w:r>
     </w:p>
     <w:p>
       <w:pPr>
@@ -2273,6 +2266,14 @@
         </w:sectPr>
       </w:pPr>
     </w:p>
+    <w:p>
+      <w:pPr>
+        <w:pStyle w:val="BodyText"/>
+      </w:pPr>
+      <w:r>
+        <w:t xml:space="preserve">Neighborhood prices are medians of apartment sale prices per square meter during the twelve complete calendar months before each election month, from Ministry of Land, Infrastructure and Transport (2026) transactions geocoded to neighborhoods. They measure traded apartments, not residents’ ownership or wealth. The movement scenarios use Seoul Living Mobility data, which estimate trips from mobile-phone signals and are available from 2022 (Seoul Metropolitan Government and KT 2026). Table 1 gives price coverage and the shares of votes requiring residential allocation; Online Appendix B documents the sources and construction. The six contests are assembled cases rather than an exhaustive or prespecified election sample. Earlier local elections are outside the dataset, so the 2026 result cannot establish a general difference between local and national elections.</w:t>
+      </w:r>
+    </w:p>
     <w:bookmarkEnd w:id="26"/>
     <w:bookmarkStart w:id="27" w:name="identification"/>
     <w:p>
@@ -2798,7 +2799,7 @@
         <w:t xml:space="preserve">main assumptions</w:t>
       </w:r>
       <w:r>
-        <w:t xml:space="preserve">. They are reference points, not validated error bounds. Stations’ own ballots depart from the benchmark by a median of about one point, and in the five elections with early voting the conservative share among a jurisdiction’s out-of-zone early voters differs from that among its in-zone early voters by at most 7.7 points (Online Appendix Table C21), so the 10-point tolerance exceeds every jurisdiction-level gap observed. What</w:t>
+        <w:t xml:space="preserve">. They are reference points, not validated error bounds. Stations’ own ballots depart from the benchmark by a median of about one point, and in the five elections with early voting the conservative share among a jurisdiction’s out-of-zone early voters differs from that among its in-zone early voters by at most 7.7 points (Online Appendix Table C6), so the 10-point tolerance exceeds every jurisdiction-level gap observed. What</w:t>
       </w:r>
       <w:r>
         <w:t xml:space="preserve"> </w:t>
@@ -2820,7 +2821,7 @@
         <w:pStyle w:val="BodyText"/>
       </w:pPr>
       <w:r>
-        <w:t xml:space="preserve">Table 2 separates the contribution of each restriction: counts and rolls alone, movement and out-of-zone composition, then residents’ in-zone composition. The last restriction links an unobserved group to the observed election-day pattern. Sensitivity thresholds show how far that link can be relaxed; they neither validate it nor assign probabilities to the assumed tolerances.</w:t>
+        <w:t xml:space="preserve">Table 2 separates the contribution of each restriction. Column A establishes what follows from the returns, rolls and zones; column D adds movement and out-of-zone composition restrictions; column E adds the link to residents’ in-zone early composition. A positive bound in E therefore shows that the election-day pattern can be extended under that link, rather than independently confirming that early voters follow it. Comparing D with E identifies where the link is decisive: the 2026 whole-city slope is already positive in D, whereas its extension outside the three districts and the narrow 2024 whole-city result require E. Sensitivity thresholds measure how far the restrictions can be relaxed; they neither validate them nor assign probabilities to the tolerances.</w:t>
       </w:r>
     </w:p>
     <w:p>
@@ -4231,7 +4232,7 @@
         <w:t xml:space="preserve"> </w:t>
       </w:r>
       <w:r>
-        <w:t xml:space="preserve">we bracket the endpoints. The main-assumption sign conclusions agree, but the 2025 positive slope under minimal movement and a ten-point out-of-zone tolerance does not survive this outcome change (Online Appendix Tables C15 and C18).</w:t>
+        <w:t xml:space="preserve">we bracket the endpoints. The main-assumption sign conclusions agree, but the 2025 positive slope under minimal movement and a ten-point out-of-zone tolerance does not survive this outcome change (Online Appendix Tables C20 and C21).</w:t>
       </w:r>
     </w:p>
     <w:p>
@@ -4611,7 +4612,7 @@
         <w:pStyle w:val="BodyText"/>
       </w:pPr>
       <w:r>
-        <w:t xml:space="preserve">The estimands describe registered residents of places, not homeowners, and they are associations, not effects of housing wealth. All results are conditional on the observed returns and price measure. The ranges describe allocation uncertainty for the observed finite population, not confidence intervals: the returns are a census, so this target does not involve sampling voters. This does not eliminate uncertainty from price measurement, address matching or administrative records, nor justify inference to other elections. The election-day slopes are descriptions of the observed neighborhoods; permutation p-values and clustered standard errors are auxiliary diagnostics requiring further assumptions (Abadie et al. 2020; Online Appendix Table C20). Transaction resampling shows sensitivity to the price measure without supplying confidence intervals with established coverage (Online Appendix Table C13). Inference for estimated bounds is developed elsewhere (Imbens and Manski 2004; Stoye 2009; Fang and Santos 2019; Fang et al. 2023).</w:t>
+        <w:t xml:space="preserve">The estimands describe registered residents of places, not homeowners, and they are associations, not effects of housing wealth. All results are conditional on the observed returns and price measure. The ranges describe allocation uncertainty for the observed finite population, not confidence intervals: the returns are a census, so this target does not involve sampling voters. This does not eliminate uncertainty from price measurement, address matching or administrative records, nor justify inference to other elections. The election-day slopes are descriptions of the observed neighborhoods; permutation p-values and clustered standard errors are auxiliary diagnostics requiring further assumptions (Abadie et al. 2020; Online Appendix Table C1). Transaction resampling shows sensitivity to the price measure without supplying confidence intervals with established coverage (Online Appendix Table C24). Inference for estimated bounds is developed elsewhere (Imbens and Manski 2004; Stoye 2009; Fang and Santos 2019; Fang et al. 2023).</w:t>
       </w:r>
     </w:p>
     <w:bookmarkEnd w:id="28"/>
@@ -4639,7 +4640,7 @@
         <w:pStyle w:val="FirstParagraph"/>
       </w:pPr>
       <w:r>
-        <w:t xml:space="preserve">At the district scale, ballots can be assigned to the residential unit without neighborhood-level allocation assumptions. The 2024 analysis uses 24 units, merging Jung-gu and Seongdong-gu because one constituency spans both; the other elections use 25 districts. For all of Seoul, higher apartment prices are associated with greater conservative support in every election (Figure 2A; Table 3). A doubling of the geometric mean of a district’s neighborhood prices is associated with a conservative share 4 percentage points higher in 2017 and 9 to 14 points higher in the other elections. Excluding Gangnam, Seocho and Songpa reduces the slope to about half to two-thirds of its full value in 2022–2026. In 2012 and 2017 it falls to 0.057 and 0.025, less than half its full value, and model-based standard errors would not distinguish these slopes from zero (Online Appendix Table C14). The earlier district-level associations thus rest largely on the three southeastern districts.</w:t>
+        <w:t xml:space="preserve">At the district scale, ballots can be assigned to the residential unit without neighborhood-level allocation assumptions. The 2024 analysis uses 24 units, merging Jung-gu and Seongdong-gu because one constituency spans both; the other elections use 25 districts. For all of Seoul, higher apartment prices are associated with greater conservative support in every election (Figure 2A; Table 3). A doubling of the geometric mean of a district’s neighborhood prices is associated with a conservative share 4 percentage points higher in 2017 and 9 to 14 points higher in the other elections. Excluding Gangnam, Seocho and Songpa reduces the slope to about half to two-thirds of its full value in 2022–2026. In 2012 and 2017 it falls to 0.057 and 0.025, less than half its full value, and model-based standard errors would not distinguish these slopes from zero (Online Appendix Table C2). The earlier district-level associations thus rest largely on the three southeastern districts.</w:t>
       </w:r>
     </w:p>
     <w:p>
@@ -4716,28 +4717,28 @@
     <w:bookmarkStart w:id="37" w:name="the-association-within-districts"/>
     <w:p>
       <w:pPr>
-        <w:pStyle w:val="Heading2"/>
-      </w:pPr>
-      <w:r>
-        <w:t xml:space="preserve">4.2 The association within districts</w:t>
-      </w:r>
-    </w:p>
-    <w:p>
-      <w:pPr>
-        <w:pStyle w:val="FirstParagraph"/>
-      </w:pPr>
-      <w:r>
-        <w:t xml:space="preserve">Table 2 follows the within-district gradient as assumptions are added. Each range contains the slopes consistent with the data and stated assumptions. A range that includes zero leaves the direction unresolved. Table 3 compares the geographic scopes and price-group contrasts; the full contrast results are in Online Appendix Table C11.</w:t>
-      </w:r>
-    </w:p>
-    <w:p>
-      <w:pPr>
         <w:sectPr>
           <w:pgMar w:top="1417" w:bottom="1417" w:left="1417" w:right="1417"/>
           <w:pgSz w:w="11906" w:h="16838" w:orient="portrait"/>
           <w:type w:val="nextPage"/>
         </w:sectPr>
       </w:pPr>
+    </w:p>
+    <w:p>
+      <w:pPr>
+        <w:pStyle w:val="Heading2"/>
+      </w:pPr>
+      <w:r>
+        <w:t xml:space="preserve">4.2 The association within districts</w:t>
+      </w:r>
+    </w:p>
+    <w:p>
+      <w:pPr>
+        <w:pStyle w:val="FirstParagraph"/>
+      </w:pPr>
+      <w:r>
+        <w:t xml:space="preserve">Table 2 follows the within-district gradient as assumptions are added. Each range contains the slopes consistent with the data and stated assumptions. A range that includes zero leaves the direction unresolved. Table 3 compares the geographic scopes and price-group contrasts; the full contrast results are in Online Appendix Table C3.</w:t>
+      </w:r>
     </w:p>
     <w:p>
       <w:pPr>
@@ -5978,7 +5979,7 @@
         <w:rPr>
           <w:sz w:val="18"/>
         </w:rPr>
-        <w:t xml:space="preserve">Bold ranges include zero; their sign is not identified. Slope of the conservative share among residents (roll-based share z) on log median apartment price per square meter; 0.1 means a neighborhood with prices twice as high has a share about 7 points higher. Within National Assembly constituencies in 2024 the ranges are [−0.729, 0.816] (A), [0.004, 0.166] (C), [−0.269, 0.427] (D) and [−0.035, 0.221] (E). Election day: point-identified valid-vote share among election-day voters (Online Appendix Table C20). Conventional estimates: Table C1. High-minus-low contrasts: Table 3 and Table C11. (A) every allocation consistent with the counts, rolls and statutory zones; (B) minimal movement; (C) adds out-of-zone ballots within 10 points of the station; (D) replaces (B) with mobility-calibrated movement; (E) adds residents’ early ballots within their station’s departure plus 2 points of the benchmark; (F) price-dependent benchmark. Definitions in Section 3.4 and Online Appendix A.</w:t>
+        <w:t xml:space="preserve">Bold ranges include zero; their sign is not identified. Slope of the conservative share among residents (roll-based share z) on log median apartment price per square meter; 0.1 means a neighborhood with prices twice as high has a share about 7 points higher. Within National Assembly constituencies in 2024 the ranges are [−0.729, 0.816] (A), [0.004, 0.166] (C), [−0.269, 0.427] (D) and [−0.035, 0.221] (E). Election day: point-identified valid-vote share among election-day voters (Online Appendix Table C1). Conventional estimates: Table C4. High-minus-low contrasts: Table 3 and Table C3. (A) every allocation consistent with the counts, rolls and statutory zones; (B) minimal movement; (C) adds out-of-zone ballots within 10 points of the station; (D) replaces (B) with mobility-calibrated movement; (E) adds residents’ early ballots within their station’s departure plus 2 points of the benchmark; (F) price-dependent benchmark. Definitions in Section 3.4 and Online Appendix A.</w:t>
       </w:r>
     </w:p>
     <w:p>
@@ -6005,7 +6006,7 @@
         <w:t xml:space="preserve"> </w:t>
       </w:r>
       <w:r>
-        <w:t xml:space="preserve">Election-day ballots are counted in the voter’s own voting district, so the slope of the conservative share among election-day voters needs no allocation assumption (Table 2). It is positive in 2012 and in the four sampled elections from 2022 and close to zero in 2017: 0.097, 0.102, 0.063 and 0.086 in 2022, 2024, 2025 and 2026, and 0.079, 0.078, 0.041 and 0.069 outside Gangnam, Seocho and Songpa (Online Appendix Table C20). The rest of this section asks whether the same holds for all residents, including the third to half who voted early.</w:t>
+        <w:t xml:space="preserve">Election-day ballots are counted in the voter’s own voting district, so the slope of the conservative share among election-day voters needs no allocation assumption (Table 2). It is positive in 2012 and in the four sampled elections from 2022 and close to zero in 2017: 0.097, 0.102, 0.063 and 0.086 in 2022, 2024, 2025 and 2026, and 0.079, 0.078, 0.041 and 0.069 outside Gangnam, Seocho and Songpa (Online Appendix Table C1). The rest of this section asks whether the same holds for all residents, including the third to half who voted early.</w:t>
       </w:r>
     </w:p>
     <w:p>
@@ -7975,7 +7976,7 @@
         <w:rPr>
           <w:sz w:val="18"/>
         </w:rPr>
-        <w:t xml:space="preserve">Bold ranges include zero; their sign is not identified. Across districts: slope of the valid-vote share on log price across districts (point values, no allocation assumption). Within districts: ranges in z under the main assumptions (Table 2, column E); 2012 under column A and 2017 under column C, as those elections lack mobility data. Without the three: Gangnam, Seocho and Songpa dropped from the regression and the contrast, all accounting constraints kept. Panel B: s* with movement and the out-of-zone tolerance (±10 or ±20 points) held fixed; a relation is established at the main setting when s* exceeds 0.02. ∞: positive however much residents’ early ballots depart; none: not positive for any s (Online Appendix Table C19).</w:t>
+        <w:t xml:space="preserve">Bold ranges include zero; their sign is not identified. Across districts: slope of the valid-vote share on log price across districts (point values, no allocation assumption). Within districts: ranges in z under the main assumptions (Table 2, column E); 2012 under column A and 2017 under column C, as those elections lack mobility data. Without the three: Gangnam, Seocho and Songpa dropped from the regression and the contrast, all accounting constraints kept. Panel B: s* with movement and the out-of-zone tolerance (±10 or ±20 points) held fixed; a relation is established at the main setting when s* exceeds 0.02. ∞: positive however much residents’ early ballots depart; none: not positive for any s (Online Appendix Table C9).</w:t>
       </w:r>
     </w:p>
     <w:p>
@@ -7983,7 +7984,7 @@
         <w:pStyle w:val="BodyText"/>
       </w:pPr>
       <w:r>
-        <w:t xml:space="preserve">Among election-day voters the slope outside the three districts is positive in 2022–2026 (Online Appendix Table C20). Among all residents, under the main assumptions, the 2026 within-district slope remains positive after the exclusion: its range is 0.029 to 0.139, compared with 0.054 to 0.156 for all of Seoul. In magnitude, a neighborhood whose apartment prices are twice those of another in the same district has a conservative roll-based share 2.0 to 9.6 points higher in the fitted relation; this describes the regression slope, not the effect of a price change or a difference found between every pair of neighborhoods. The median-split contrast ranges from</w:t>
+        <w:t xml:space="preserve">Among election-day voters the slope outside the three districts is positive in 2022–2026 (Online Appendix Table C1). Among all residents, under the main assumptions, the 2026 within-district slope remains positive after the exclusion: its range is 0.029 to 0.139, compared with 0.054 to 0.156 for all of Seoul. In magnitude, a neighborhood whose apartment prices are twice those of another in the same district has a conservative roll-based share 2.0 to 9.6 points higher in the fitted relation; this describes the regression slope, not the effect of a price change or a difference found between every pair of neighborhoods. The median-split contrast ranges from</w:t>
       </w:r>
       <w:r>
         <w:t xml:space="preserve"> </w:t>
@@ -8017,7 +8018,7 @@
         <w:t xml:space="preserve"> </w:t>
       </w:r>
       <w:r>
-        <w:t xml:space="preserve">percentage points after the exclusion and the top-minus-bottom-tercile contrast from 0.1 to 7.9 (Online Appendix Table C23), so the group comparisons are borderline. Valid-vote shares yield the same conclusions about signs (Online Appendix Table C18). Excluding the three districts also removes the positive lower bound for the 2024 slope under the main assumptions and for the 2012 slope based on returns and rolls alone (Table 3).</w:t>
+        <w:t xml:space="preserve">percentage points after the exclusion and the top-minus-bottom-tercile contrast from 0.1 to 7.9 (Online Appendix Table C22), so the group comparisons are borderline. Valid-vote shares yield the same conclusions about signs (Online Appendix Table C21). Excluding the three districts also removes the positive lower bound for the 2024 slope under the main assumptions and for the 2012 slope based on returns and rolls alone (Table 3).</w:t>
       </w:r>
     </w:p>
     <w:p>
@@ -8056,7 +8057,7 @@
         </m:r>
       </m:oMath>
       <w:r>
-        <w:t xml:space="preserve">. Holding movement and the tolerance fixed, it stays positive as long as residents’ early ballots depart from their benchmark by no more than about 0.103 beyond their station’s departure, about five times the main setting’s 0.02; with unrestricted movement the threshold is 0.067. The result is more sensitive to the out-of-zone tolerance: with a 20-percentage-point tolerance and mobility-calibrated movement, the slope remains positive only up to an additional tolerance of 0.001, below the main setting (Table 3, Panel B; Online Appendix Table C19). The conclusion beyond Gangnam is therefore less robust than the conclusion for all of Seoul, which survives a 20-point tolerance up to</w:t>
+        <w:t xml:space="preserve">. Holding movement and the tolerance fixed, it stays positive as long as residents’ early ballots depart from their benchmark by no more than about 0.103 beyond their station’s departure, about five times the main setting’s 0.02; with unrestricted movement the threshold is 0.067. The result is more sensitive to the out-of-zone tolerance: with a 20-percentage-point tolerance and mobility-calibrated movement, the slope remains positive only up to an additional tolerance of 0.001, below the main setting (Table 3, Panel B; Online Appendix Table C9). The conclusion beyond Gangnam is therefore less robust than the conclusion for all of Seoul, which survives a 20-point tolerance up to</w:t>
       </w:r>
       <w:r>
         <w:t xml:space="preserve"> </w:t>
@@ -8084,7 +8085,7 @@
         <w:pStyle w:val="BodyText"/>
       </w:pPr>
       <w:r>
-        <w:t xml:space="preserve">Under the main assumptions, the 2026 positive slope extends beyond Gangnam, Seocho and Songpa. It is not driven by any single remaining district: omitting each in turn keeps the lower bound positive. High-price neighborhoods nevertheless matter. Excluding the top 5% or 10% by price among the remaining neighborhoods lowers the bound to 0.0004 and -0.0093, respectively (Online Appendix Table C29). The result therefore extends beyond the three-district enclave while remaining sensitive to the upper end of the price distribution. It is compatible with economic interests, sorting and place identity operating elsewhere in Seoul (Bae and Joo 2020).</w:t>
+        <w:t xml:space="preserve">Under the main assumptions, the 2026 positive slope extends beyond Gangnam, Seocho and Songpa. It is not driven by any single remaining district: omitting each in turn keeps the lower bound positive. High-price neighborhoods nevertheless matter. Excluding the top 5% or 10% by price among the remaining neighborhoods lowers the bound to 0.0004 and -0.0093, respectively (Online Appendix Table C19). The result therefore extends beyond the three-district enclave while remaining sensitive to the upper end of the price distribution. Trimming changes the neighborhoods being compared; the loss of a positive bound limits the claim’s reach rather than demonstrating that the original slope was erroneous. Together with the median-split contrast, it cautions against describing a general separation between expensive and inexpensive neighborhoods outside Gangnam. Economic interests, sorting and place identity remain possible explanations of the association (Bae and Joo 2020).</w:t>
       </w:r>
     </w:p>
     <w:bookmarkEnd w:id="38"/>
@@ -8552,7 +8553,7 @@
         <w:rPr>
           <w:sz w:val="18"/>
         </w:rPr>
-        <w:t xml:space="preserve">Bold ranges include zero; their sign is not identified. Roll-based share z. The zones are the 155 district-council constituencies, about three neighborhoods each. Rows with uniform movement hold the amount of movement fixed, so the comparison isolates the zone rule; the mobility-calibrated rows recalibrate movement to the zone definition. Adding the council contest’s published headcounts changes the statutory-zone ranges by at most 0.003 (Online Appendix Table C2).</w:t>
+        <w:t xml:space="preserve">Bold ranges include zero; their sign is not identified. Roll-based share z. The zones are the 155 district-council constituencies, about three neighborhoods each. Rows with uniform movement hold the amount of movement fixed, so the comparison isolates the zone rule; the mobility-calibrated rows recalibrate movement to the zone definition. Adding the council contest’s published headcounts changes the statutory-zone ranges by at most 0.003 (Online Appendix Table C27).</w:t>
       </w:r>
     </w:p>
     <w:p>
@@ -8718,7 +8719,17 @@
         <w:pStyle w:val="FirstParagraph"/>
       </w:pPr>
       <w:r>
-        <w:t xml:space="preserve">Figure 4 summarizes the three-parameter sensitivity analysis. Each cell reports a threshold</w:t>
+        <w:rPr>
+          <w:iCs/>
+          <w:i/>
+        </w:rPr>
+        <w:t xml:space="preserve">How much composition restriction is needed?</w:t>
+      </w:r>
+      <w:r>
+        <w:t xml:space="preserve"> </w:t>
+      </w:r>
+      <w:r>
+        <w:t xml:space="preserve">Figure 4 reports the largest additional tolerance</w:t>
       </w:r>
       <w:r>
         <w:t xml:space="preserve"> </w:t>
@@ -8742,34 +8753,10 @@
         </m:sSup>
       </m:oMath>
       <w:r>
-        <w:t xml:space="preserve">: for example, 0.087 means that the slope remains positive while the extra composition tolerance is below about 8.7 percentage points. The main setting uses two points. The figure maps how far the assumptions can be relaxed: for each amount of movement and each out-of-zone tolerance, the largest additional departure</w:t>
-      </w:r>
-      <w:r>
-        <w:t xml:space="preserve"> </w:t>
-      </w:r>
-      <m:oMath>
-        <m:sSup>
-          <m:e>
-            <m:r>
-              <m:t>s</m:t>
-            </m:r>
-          </m:e>
-          <m:sup>
-            <m:r>
-              <m:rPr>
-                <m:nor/>
-                <m:sty m:val="p"/>
-              </m:rPr>
-              <m:t>*</m:t>
-            </m:r>
-          </m:sup>
-        </m:sSup>
-      </m:oMath>
-      <w:r>
-        <w:t xml:space="preserve"> </w:t>
-      </w:r>
-      <w:r>
-        <w:t xml:space="preserve">at which the slope stays positive. For all of Seoul in 2026, with a 10-point tolerance the slope stays positive at the main setting for every amount of movement, including unrestricted movement (</w:t>
+        <w:t xml:space="preserve"> </w:t>
+      </w:r>
+      <w:r>
+        <w:t xml:space="preserve">at which the slope remains positive for each movement cap and out-of-zone tolerance. A value of 0.087 means an additional departure below about 8.7 percentage points; the main setting allows two. For all of Seoul in 2026, with a ten-point out-of-zone tolerance the slope is positive at the main setting even with unrestricted movement (</w:t>
       </w:r>
       <m:oMath>
         <m:sSup>
@@ -8826,7 +8813,7 @@
         <w:t xml:space="preserve"> </w:t>
       </w:r>
       <w:r>
-        <w:t xml:space="preserve">is 0.087 under calibrated and 0.006 under unrestricted movement (Online Appendix Tables C4 and C19). The 2026 conclusion therefore depends mainly on the out-of-zone tolerance, not on the mobile-phone calibration; at the main</w:t>
+        <w:t xml:space="preserve">is 0.087 under calibrated movement but only 0.006 under unrestricted movement (Online Appendix Tables C8 and C9). Thus relaxing movement alone does not overturn the main whole-city result; jointly relaxing movement and composition can. At calibrated movement and the main</w:t>
       </w:r>
       <w:r>
         <w:t xml:space="preserve"> </w:t>
@@ -8837,56 +8824,18 @@
         </m:r>
       </m:oMath>
       <w:r>
-        <w:t xml:space="preserve"> </w:t>
-      </w:r>
-      <w:r>
-        <w:t xml:space="preserve">it holds up to</w:t>
-      </w:r>
-      <w:r>
-        <w:t xml:space="preserve"> </w:t>
-      </w:r>
-      <m:oMath>
-        <m:r>
-          <m:t>δ</m:t>
-        </m:r>
-        <m:r>
-          <m:rPr>
-            <m:sty m:val="p"/>
-          </m:rPr>
-          <m:t>=</m:t>
-        </m:r>
-        <m:r>
-          <m:t>0.26</m:t>
-        </m:r>
-      </m:oMath>
-      <w:r>
-        <w:t xml:space="preserve"> </w:t>
-      </w:r>
-      <w:r>
-        <w:t xml:space="preserve">for all of Seoul and</w:t>
-      </w:r>
-      <w:r>
-        <w:t xml:space="preserve"> </w:t>
-      </w:r>
-      <m:oMath>
-        <m:r>
-          <m:t>δ</m:t>
-        </m:r>
-        <m:r>
-          <m:rPr>
-            <m:sty m:val="p"/>
-          </m:rPr>
-          <m:t>=</m:t>
-        </m:r>
-        <m:r>
-          <m:t>0.18</m:t>
-        </m:r>
-      </m:oMath>
-      <w:r>
-        <w:t xml:space="preserve"> </w:t>
-      </w:r>
-      <w:r>
-        <w:t xml:space="preserve">outside the three districts (Online Appendix Table C25). In 2024 the region is a narrow strip (</w:t>
+        <w:t xml:space="preserve">, the largest out-of-zone tolerance retaining a positive slope is about 0.26 for all Seoul and 0.18 outside the three districts (Table C12). These thresholds describe conditional robustness, not evidence that the restrictions hold.</w:t>
+      </w:r>
+    </w:p>
+    <w:p>
+      <w:pPr>
+        <w:pStyle w:val="BodyText"/>
+      </w:pPr>
+      <w:r>
+        <w:t xml:space="preserve">The 2024 whole-city result has much less room:</w:t>
+      </w:r>
+      <w:r>
+        <w:t xml:space="preserve"> </w:t>
       </w:r>
       <m:oMath>
         <m:sSup>
@@ -8919,25 +8868,27 @@
         <w:t xml:space="preserve"> </w:t>
       </w:r>
       <w:r>
-        <w:t xml:space="preserve">at the main movement and tolerance); in 2022 and 2025 there is none.</w:t>
-      </w:r>
-    </w:p>
-    <w:p>
-      <w:pPr>
-        <w:pStyle w:val="BodyText"/>
-      </w:pPr>
-      <w:r>
-        <w:rPr>
-          <w:iCs/>
-          <w:i/>
-        </w:rPr>
-        <w:t xml:space="preserve">Price-aligned departures.</w:t>
-      </w:r>
-      <w:r>
-        <w:t xml:space="preserve"> </w:t>
-      </w:r>
-      <w:r>
-        <w:t xml:space="preserve">The unresolved signs can be settled by a different assumption that limits how residents’ early-vote departures align with neighborhood prices, rather than limiting each neighborhood separately (Online Appendix A.1 and Table C22). Keeping the ten-point out-of-zone restriction, departure slopes at the scale of observed station patterns would establish positive gradients for all of Seoul in the four sampled elections from 2022. Those patterns concern station voters or district averages, however, and do not measure the unobserved residential departures being restricted. Outside the three districts the conclusion is less uniform. Appendix C reports the thresholds and comparisons, including a restriction on out-of-zone departures alone (Table C25). These exercises identify assumptions that would settle the open signs; they do not establish that those assumptions hold.</w:t>
+        <w:t xml:space="preserve">at the main movement cap and out-of-zone tolerance, almost the main</w:t>
+      </w:r>
+      <w:r>
+        <w:t xml:space="preserve"> </w:t>
+      </w:r>
+      <m:oMath>
+        <m:r>
+          <m:t>s</m:t>
+        </m:r>
+        <m:r>
+          <m:rPr>
+            <m:sty m:val="p"/>
+          </m:rPr>
+          <m:t>=</m:t>
+        </m:r>
+        <m:r>
+          <m:t>0.02</m:t>
+        </m:r>
+      </m:oMath>
+      <w:r>
+        <w:t xml:space="preserve">. Its positive lower bound disappears with constituency fixed effects, a price-dependent benchmark or age adjustment. In 2022 and 2025, the sign remains unresolved even when residents’ early ballots depart from the benchmark only as much as their station’s ballots do. Restricting movers’ composition alone does not settle these signs because pooled ballots can support a reversal. Online Appendix Tables C14–C17 summarize the reversing allocations and their departures; they describe possibilities allowed by the assumptions, not estimated voting behavior.</w:t>
       </w:r>
     </w:p>
     <w:p>
@@ -8950,7 +8901,7 @@
           <wp:inline>
             <wp:extent cx="5334000" cy="3994889"/>
             <wp:effectExtent b="0" l="0" r="0" t="0"/>
-            <wp:docPr descr="Figure 4. Where the within-district slope is positive. Each cell gives s^{\text{*}}, the largest additional departure of residents’ early ballots from their neighborhood benchmark, beyond their station’s own departure, at which the lower end of the range stays positive; amounts of movement are multiples \lambda of the mobility-calibrated scenario or unrestricted, and \delta is the tolerance for out-of-zone voters. The main setting (\lambda=1, \delta=0.1, s=0.02) is outlined: the slope is positive there if s^{\text{*}} exceeds 0.02. “∞”: positive however much residents’ early ballots depart; gray: no positive lower bound for any s\ge0 among the settings examined. All of Seoul; numbers in Online Appendix Table C4, and selected settings without Gangnam, Seocho and Songpa in Table C19." title="" id="41" name="Picture"/>
+            <wp:docPr descr="Figure 4. Where the within-district slope is positive. Each cell gives s^{\text{*}}, the largest additional departure of residents’ early ballots from their neighborhood benchmark, beyond their station’s own departure, at which the lower end of the range stays positive; amounts of movement are multiples \lambda of the mobility-calibrated scenario or unrestricted, and \delta is the tolerance for out-of-zone voters. The main setting (\lambda=1, \delta=0.1, s=0.02) is outlined: the slope is positive there if s^{\text{*}} exceeds 0.02. “∞”: positive however much residents’ early ballots depart; gray: no positive lower bound for any s\ge0 among the settings examined. All of Seoul; numbers in Online Appendix Table C8, and selected settings without Gangnam, Seocho and Songpa in Table C9." title="" id="41" name="Picture"/>
             <a:graphic>
               <a:graphicData uri="http://schemas.openxmlformats.org/drawingml/2006/picture">
                 <pic:pic>
@@ -9167,1014 +9118,7 @@
         <w:t xml:space="preserve"> </w:t>
       </w:r>
       <w:r>
-        <w:t xml:space="preserve">among the settings examined. All of Seoul; numbers in Online Appendix Table C4, and selected settings without Gangnam, Seocho and Songpa in Table C19.</w:t>
-      </w:r>
-    </w:p>
-    <w:p>
-      <w:pPr>
-        <w:pStyle w:val="BodyText"/>
-      </w:pPr>
-      <w:r>
-        <w:t xml:space="preserve">Table 5 characterizes reversals. The 2022 and 2025 signs are unresolved even when residents’ early votes depart from their benchmark only as much as their station’s ballots do. Restricting movers’ composition does not settle them because pooled ballots can instead support a reversal (Online Appendix Tables C5–C7 and C25). In 2026 no reversal exists under calibrated movement and the ten-point out-of-zone tolerance, even without restricting residents’ in-zone composition. At a 20-point tolerance it requires an additional departure of about 9 points. These allocations describe what the assumptions allow, not estimated voting behavior.</w:t>
-      </w:r>
-    </w:p>
-    <w:p>
-      <w:pPr>
-        <w:pStyle w:val="TableCaption"/>
-        <w:keepNext/>
-      </w:pPr>
-      <w:r>
-        <w:t xml:space="preserve">Table 5. Assumptions and allocations that permit a non-positive slope</w:t>
-      </w:r>
-    </w:p>
-    <w:tbl>
-      <w:tblPr>
-        <w:tblStyle w:val="Table"/>
-        <w:tblW w:type="pct" w:w="5000"/>
-        <w:tblLayout w:type="fixed"/>
-        <w:tblLook w:firstRow="1" w:lastRow="0" w:firstColumn="0" w:lastColumn="0" w:noHBand="0" w:noVBand="0" w:val="0020"/>
-        <w:jc w:val="start"/>
-        <w:tblCaption w:val="Table 5. Assumptions and allocations that permit a non-positive slope"/>
-      </w:tblPr>
-      <w:tblGrid>
-        <w:gridCol w:w="1564"/>
-        <w:gridCol w:w="1877"/>
-        <w:gridCol w:w="1721"/>
-        <w:gridCol w:w="2033"/>
-        <w:gridCol w:w="1877"/>
-      </w:tblGrid>
-      <w:tr>
-        <w:trPr>
-          <w:tblHeader w:val="true"/>
-          <w:cantSplit/>
-        </w:trPr>
-        <w:tc>
-          <w:tcPr>
-            <w:tcW w:type="dxa" w:w="1564"/>
-          </w:tcPr>
-          <w:p>
-            <w:pPr>
-              <w:pStyle w:val="Compact"/>
-              <w:keepNext/>
-              <w:keepLines/>
-              <w:spacing w:before="0" w:after="40" w:line="240" w:lineRule="auto"/>
-              <w:jc w:val="left"/>
-            </w:pPr>
-            <w:r>
-              <w:rPr>
-                <w:sz w:val="18"/>
-              </w:rPr>
-              <w:t xml:space="preserve">Election</w:t>
-            </w:r>
-          </w:p>
-        </w:tc>
-        <w:tc>
-          <w:tcPr>
-            <w:tcW w:type="dxa" w:w="1877"/>
-          </w:tcPr>
-          <w:p>
-            <w:pPr>
-              <w:pStyle w:val="Compact"/>
-              <w:keepNext/>
-              <w:keepLines/>
-              <w:spacing w:before="0" w:after="40" w:line="240" w:lineRule="auto"/>
-              <w:jc w:val="center"/>
-            </w:pPr>
-            <w:r>
-              <w:rPr>
-                <w:sz w:val="18"/>
-              </w:rPr>
-              <w:t xml:space="preserve">Out-of-zone voters within (points)</w:t>
-            </w:r>
-          </w:p>
-        </w:tc>
-        <w:tc>
-          <w:tcPr>
-            <w:tcW w:type="dxa" w:w="1721"/>
-          </w:tcPr>
-          <w:p>
-            <w:pPr>
-              <w:pStyle w:val="Compact"/>
-              <w:keepNext/>
-              <w:keepLines/>
-              <w:spacing w:before="0" w:after="40" w:line="240" w:lineRule="auto"/>
-              <w:jc w:val="center"/>
-            </w:pPr>
-            <w:r>
-              <w:rPr>
-                <w:sz w:val="18"/>
-              </w:rPr>
-              <w:t xml:space="preserve">Largest additional tolerance s with a positive slope</w:t>
-            </w:r>
-          </w:p>
-        </w:tc>
-        <w:tc>
-          <w:tcPr>
-            <w:tcW w:type="dxa" w:w="2033"/>
-          </w:tcPr>
-          <w:p>
-            <w:pPr>
-              <w:pStyle w:val="Compact"/>
-              <w:keepNext/>
-              <w:keepLines/>
-              <w:spacing w:before="0" w:after="40" w:line="240" w:lineRule="auto"/>
-              <w:jc w:val="center"/>
-            </w:pPr>
-            <w:r>
-              <w:rPr>
-                <w:sz w:val="18"/>
-              </w:rPr>
-              <w:t xml:space="preserve">First reversing allocation: movers minus stayers, conservative share (points)</w:t>
-            </w:r>
-          </w:p>
-        </w:tc>
-        <w:tc>
-          <w:tcPr>
-            <w:tcW w:type="dxa" w:w="1877"/>
-          </w:tcPr>
-          <w:p>
-            <w:pPr>
-              <w:pStyle w:val="Compact"/>
-              <w:keepNext/>
-              <w:keepLines/>
-              <w:spacing w:before="0" w:after="40" w:line="240" w:lineRule="auto"/>
-              <w:jc w:val="center"/>
-            </w:pPr>
-            <w:r>
-              <w:rPr>
-                <w:sz w:val="18"/>
-              </w:rPr>
-              <w:t xml:space="preserve">Fewest residents’ early ballots that must depart to reverse</w:t>
-            </w:r>
-          </w:p>
-        </w:tc>
-      </w:tr>
-      <w:tr>
-        <w:trPr>
-          <w:cantSplit/>
-        </w:trPr>
-        <w:tc>
-          <w:tcPr>
-            <w:tcW w:type="dxa" w:w="1564"/>
-          </w:tcPr>
-          <w:p>
-            <w:pPr>
-              <w:pStyle w:val="Compact"/>
-              <w:keepNext/>
-              <w:keepLines/>
-              <w:spacing w:before="0" w:after="40" w:line="240" w:lineRule="auto"/>
-              <w:jc w:val="left"/>
-            </w:pPr>
-            <w:r>
-              <w:rPr>
-                <w:sz w:val="18"/>
-              </w:rPr>
-              <w:t xml:space="preserve">2022</w:t>
-            </w:r>
-          </w:p>
-        </w:tc>
-        <w:tc>
-          <w:tcPr>
-            <w:tcW w:type="dxa" w:w="1877"/>
-          </w:tcPr>
-          <w:p>
-            <w:pPr>
-              <w:pStyle w:val="Compact"/>
-              <w:keepNext/>
-              <w:keepLines/>
-              <w:spacing w:before="0" w:after="40" w:line="240" w:lineRule="auto"/>
-              <w:jc w:val="center"/>
-            </w:pPr>
-            <w:r>
-              <w:rPr>
-                <w:sz w:val="18"/>
-              </w:rPr>
-              <w:t xml:space="preserve">10</w:t>
-            </w:r>
-          </w:p>
-        </w:tc>
-        <w:tc>
-          <w:tcPr>
-            <w:tcW w:type="dxa" w:w="1721"/>
-          </w:tcPr>
-          <w:p>
-            <w:pPr>
-              <w:pStyle w:val="Compact"/>
-              <w:keepNext/>
-              <w:keepLines/>
-              <w:spacing w:before="0" w:after="40" w:line="240" w:lineRule="auto"/>
-              <w:jc w:val="center"/>
-            </w:pPr>
-            <w:r>
-              <w:rPr>
-                <w:sz w:val="18"/>
-              </w:rPr>
-              <w:t xml:space="preserve">none</w:t>
-            </w:r>
-          </w:p>
-        </w:tc>
-        <w:tc>
-          <w:tcPr>
-            <w:tcW w:type="dxa" w:w="2033"/>
-          </w:tcPr>
-          <w:p>
-            <w:pPr>
-              <w:pStyle w:val="Compact"/>
-              <w:keepNext/>
-              <w:keepLines/>
-              <w:spacing w:before="0" w:after="40" w:line="240" w:lineRule="auto"/>
-              <w:jc w:val="center"/>
-            </w:pPr>
-            <w:r>
-              <w:rPr>
-                <w:sz w:val="18"/>
-              </w:rPr>
-              <w:t xml:space="preserve">12 to 21</w:t>
-            </w:r>
-          </w:p>
-        </w:tc>
-        <w:tc>
-          <w:tcPr>
-            <w:tcW w:type="dxa" w:w="1877"/>
-          </w:tcPr>
-          <w:p>
-            <w:pPr>
-              <w:pStyle w:val="Compact"/>
-              <w:keepNext/>
-              <w:keepLines/>
-              <w:spacing w:before="0" w:after="40" w:line="240" w:lineRule="auto"/>
-              <w:jc w:val="center"/>
-            </w:pPr>
-            <w:r>
-              <w:rPr>
-                <w:sz w:val="18"/>
-              </w:rPr>
-              <w:t xml:space="preserve">16,685</w:t>
-            </w:r>
-          </w:p>
-        </w:tc>
-      </w:tr>
-      <w:tr>
-        <w:trPr>
-          <w:cantSplit/>
-        </w:trPr>
-        <w:tc>
-          <w:tcPr>
-            <w:tcW w:type="dxa" w:w="1564"/>
-          </w:tcPr>
-          <w:p>
-            <w:pPr>
-              <w:pStyle w:val="Compact"/>
-              <w:keepNext/>
-              <w:keepLines/>
-              <w:spacing w:before="0" w:after="40" w:line="240" w:lineRule="auto"/>
-              <w:jc w:val="left"/>
-            </w:pPr>
-            <w:r>
-              <w:rPr>
-                <w:sz w:val="18"/>
-              </w:rPr>
-              <w:t xml:space="preserve">2022</w:t>
-            </w:r>
-          </w:p>
-        </w:tc>
-        <w:tc>
-          <w:tcPr>
-            <w:tcW w:type="dxa" w:w="1877"/>
-          </w:tcPr>
-          <w:p>
-            <w:pPr>
-              <w:pStyle w:val="Compact"/>
-              <w:keepNext/>
-              <w:keepLines/>
-              <w:spacing w:before="0" w:after="40" w:line="240" w:lineRule="auto"/>
-              <w:jc w:val="center"/>
-            </w:pPr>
-            <w:r>
-              <w:rPr>
-                <w:sz w:val="18"/>
-              </w:rPr>
-              <w:t xml:space="preserve">20</w:t>
-            </w:r>
-          </w:p>
-        </w:tc>
-        <w:tc>
-          <w:tcPr>
-            <w:tcW w:type="dxa" w:w="1721"/>
-          </w:tcPr>
-          <w:p>
-            <w:pPr>
-              <w:pStyle w:val="Compact"/>
-              <w:keepNext/>
-              <w:keepLines/>
-              <w:spacing w:before="0" w:after="40" w:line="240" w:lineRule="auto"/>
-              <w:jc w:val="center"/>
-            </w:pPr>
-            <w:r>
-              <w:rPr>
-                <w:sz w:val="18"/>
-              </w:rPr>
-              <w:t xml:space="preserve">none</w:t>
-            </w:r>
-          </w:p>
-        </w:tc>
-        <w:tc>
-          <w:tcPr>
-            <w:tcW w:type="dxa" w:w="2033"/>
-          </w:tcPr>
-          <w:p>
-            <w:pPr>
-              <w:pStyle w:val="Compact"/>
-              <w:keepNext/>
-              <w:keepLines/>
-              <w:spacing w:before="0" w:after="40" w:line="240" w:lineRule="auto"/>
-              <w:jc w:val="center"/>
-            </w:pPr>
-            <w:r>
-              <w:rPr>
-                <w:sz w:val="18"/>
-              </w:rPr>
-              <w:t xml:space="preserve">14 to 18</w:t>
-            </w:r>
-          </w:p>
-        </w:tc>
-        <w:tc>
-          <w:tcPr>
-            <w:tcW w:type="dxa" w:w="1877"/>
-          </w:tcPr>
-          <w:p>
-            <w:pPr>
-              <w:pStyle w:val="Compact"/>
-              <w:keepNext/>
-              <w:keepLines/>
-              <w:spacing w:before="0" w:after="40" w:line="240" w:lineRule="auto"/>
-              <w:jc w:val="center"/>
-            </w:pPr>
-            <w:r>
-              <w:rPr>
-                <w:sz w:val="18"/>
-              </w:rPr>
-              <w:t xml:space="preserve">15,340</w:t>
-            </w:r>
-          </w:p>
-        </w:tc>
-      </w:tr>
-      <w:tr>
-        <w:trPr>
-          <w:cantSplit/>
-        </w:trPr>
-        <w:tc>
-          <w:tcPr>
-            <w:tcW w:type="dxa" w:w="1564"/>
-          </w:tcPr>
-          <w:p>
-            <w:pPr>
-              <w:pStyle w:val="Compact"/>
-              <w:keepNext/>
-              <w:keepLines/>
-              <w:spacing w:before="0" w:after="40" w:line="240" w:lineRule="auto"/>
-              <w:jc w:val="left"/>
-            </w:pPr>
-            <w:r>
-              <w:rPr>
-                <w:sz w:val="18"/>
-              </w:rPr>
-              <w:t xml:space="preserve">2024</w:t>
-            </w:r>
-          </w:p>
-        </w:tc>
-        <w:tc>
-          <w:tcPr>
-            <w:tcW w:type="dxa" w:w="1877"/>
-          </w:tcPr>
-          <w:p>
-            <w:pPr>
-              <w:pStyle w:val="Compact"/>
-              <w:keepNext/>
-              <w:keepLines/>
-              <w:spacing w:before="0" w:after="40" w:line="240" w:lineRule="auto"/>
-              <w:jc w:val="center"/>
-            </w:pPr>
-            <w:r>
-              <w:rPr>
-                <w:sz w:val="18"/>
-              </w:rPr>
-              <w:t xml:space="preserve">10</w:t>
-            </w:r>
-          </w:p>
-        </w:tc>
-        <w:tc>
-          <w:tcPr>
-            <w:tcW w:type="dxa" w:w="1721"/>
-          </w:tcPr>
-          <w:p>
-            <w:pPr>
-              <w:pStyle w:val="Compact"/>
-              <w:keepNext/>
-              <w:keepLines/>
-              <w:spacing w:before="0" w:after="40" w:line="240" w:lineRule="auto"/>
-              <w:jc w:val="center"/>
-            </w:pPr>
-            <w:r>
-              <w:rPr>
-                <w:sz w:val="18"/>
-              </w:rPr>
-              <w:t xml:space="preserve">0.021</w:t>
-            </w:r>
-          </w:p>
-        </w:tc>
-        <w:tc>
-          <w:tcPr>
-            <w:tcW w:type="dxa" w:w="2033"/>
-          </w:tcPr>
-          <w:p>
-            <w:pPr>
-              <w:pStyle w:val="Compact"/>
-              <w:keepNext/>
-              <w:keepLines/>
-              <w:spacing w:before="0" w:after="40" w:line="240" w:lineRule="auto"/>
-              <w:jc w:val="center"/>
-            </w:pPr>
-            <w:r>
-              <w:rPr>
-                <w:sz w:val="18"/>
-              </w:rPr>
-              <w:t xml:space="preserve">11 to 17</w:t>
-            </w:r>
-          </w:p>
-        </w:tc>
-        <w:tc>
-          <w:tcPr>
-            <w:tcW w:type="dxa" w:w="1877"/>
-          </w:tcPr>
-          <w:p>
-            <w:pPr>
-              <w:pStyle w:val="Compact"/>
-              <w:keepNext/>
-              <w:keepLines/>
-              <w:spacing w:before="0" w:after="40" w:line="240" w:lineRule="auto"/>
-              <w:jc w:val="center"/>
-            </w:pPr>
-            <w:r>
-              <w:rPr>
-                <w:sz w:val="18"/>
-              </w:rPr>
-              <w:t xml:space="preserve">32,177</w:t>
-            </w:r>
-          </w:p>
-        </w:tc>
-      </w:tr>
-      <w:tr>
-        <w:trPr>
-          <w:cantSplit/>
-        </w:trPr>
-        <w:tc>
-          <w:tcPr>
-            <w:tcW w:type="dxa" w:w="1564"/>
-          </w:tcPr>
-          <w:p>
-            <w:pPr>
-              <w:pStyle w:val="Compact"/>
-              <w:keepNext/>
-              <w:keepLines/>
-              <w:spacing w:before="0" w:after="40" w:line="240" w:lineRule="auto"/>
-              <w:jc w:val="left"/>
-            </w:pPr>
-            <w:r>
-              <w:rPr>
-                <w:sz w:val="18"/>
-              </w:rPr>
-              <w:t xml:space="preserve">2024</w:t>
-            </w:r>
-          </w:p>
-        </w:tc>
-        <w:tc>
-          <w:tcPr>
-            <w:tcW w:type="dxa" w:w="1877"/>
-          </w:tcPr>
-          <w:p>
-            <w:pPr>
-              <w:pStyle w:val="Compact"/>
-              <w:keepNext/>
-              <w:keepLines/>
-              <w:spacing w:before="0" w:after="40" w:line="240" w:lineRule="auto"/>
-              <w:jc w:val="center"/>
-            </w:pPr>
-            <w:r>
-              <w:rPr>
-                <w:sz w:val="18"/>
-              </w:rPr>
-              <w:t xml:space="preserve">20</w:t>
-            </w:r>
-          </w:p>
-        </w:tc>
-        <w:tc>
-          <w:tcPr>
-            <w:tcW w:type="dxa" w:w="1721"/>
-          </w:tcPr>
-          <w:p>
-            <w:pPr>
-              <w:pStyle w:val="Compact"/>
-              <w:keepNext/>
-              <w:keepLines/>
-              <w:spacing w:before="0" w:after="40" w:line="240" w:lineRule="auto"/>
-              <w:jc w:val="center"/>
-            </w:pPr>
-            <w:r>
-              <w:rPr>
-                <w:sz w:val="18"/>
-              </w:rPr>
-              <w:t xml:space="preserve">none</w:t>
-            </w:r>
-          </w:p>
-        </w:tc>
-        <w:tc>
-          <w:tcPr>
-            <w:tcW w:type="dxa" w:w="2033"/>
-          </w:tcPr>
-          <w:p>
-            <w:pPr>
-              <w:pStyle w:val="Compact"/>
-              <w:keepNext/>
-              <w:keepLines/>
-              <w:spacing w:before="0" w:after="40" w:line="240" w:lineRule="auto"/>
-              <w:jc w:val="center"/>
-            </w:pPr>
-            <w:r>
-              <w:rPr>
-                <w:sz w:val="18"/>
-              </w:rPr>
-              <w:t xml:space="preserve">9 to 14</w:t>
-            </w:r>
-          </w:p>
-        </w:tc>
-        <w:tc>
-          <w:tcPr>
-            <w:tcW w:type="dxa" w:w="1877"/>
-          </w:tcPr>
-          <w:p>
-            <w:pPr>
-              <w:pStyle w:val="Compact"/>
-              <w:keepNext/>
-              <w:keepLines/>
-              <w:spacing w:before="0" w:after="40" w:line="240" w:lineRule="auto"/>
-              <w:jc w:val="center"/>
-            </w:pPr>
-            <w:r>
-              <w:rPr>
-                <w:sz w:val="18"/>
-              </w:rPr>
-              <w:t xml:space="preserve">30,103</w:t>
-            </w:r>
-          </w:p>
-        </w:tc>
-      </w:tr>
-      <w:tr>
-        <w:trPr>
-          <w:cantSplit/>
-        </w:trPr>
-        <w:tc>
-          <w:tcPr>
-            <w:tcW w:type="dxa" w:w="1564"/>
-          </w:tcPr>
-          <w:p>
-            <w:pPr>
-              <w:pStyle w:val="Compact"/>
-              <w:keepNext/>
-              <w:keepLines/>
-              <w:spacing w:before="0" w:after="40" w:line="240" w:lineRule="auto"/>
-              <w:jc w:val="left"/>
-            </w:pPr>
-            <w:r>
-              <w:rPr>
-                <w:sz w:val="18"/>
-              </w:rPr>
-              <w:t xml:space="preserve">2025</w:t>
-            </w:r>
-          </w:p>
-        </w:tc>
-        <w:tc>
-          <w:tcPr>
-            <w:tcW w:type="dxa" w:w="1877"/>
-          </w:tcPr>
-          <w:p>
-            <w:pPr>
-              <w:pStyle w:val="Compact"/>
-              <w:keepNext/>
-              <w:keepLines/>
-              <w:spacing w:before="0" w:after="40" w:line="240" w:lineRule="auto"/>
-              <w:jc w:val="center"/>
-            </w:pPr>
-            <w:r>
-              <w:rPr>
-                <w:sz w:val="18"/>
-              </w:rPr>
-              <w:t xml:space="preserve">10</w:t>
-            </w:r>
-          </w:p>
-        </w:tc>
-        <w:tc>
-          <w:tcPr>
-            <w:tcW w:type="dxa" w:w="1721"/>
-          </w:tcPr>
-          <w:p>
-            <w:pPr>
-              <w:pStyle w:val="Compact"/>
-              <w:keepNext/>
-              <w:keepLines/>
-              <w:spacing w:before="0" w:after="40" w:line="240" w:lineRule="auto"/>
-              <w:jc w:val="center"/>
-            </w:pPr>
-            <w:r>
-              <w:rPr>
-                <w:sz w:val="18"/>
-              </w:rPr>
-              <w:t xml:space="preserve">none</w:t>
-            </w:r>
-          </w:p>
-        </w:tc>
-        <w:tc>
-          <w:tcPr>
-            <w:tcW w:type="dxa" w:w="2033"/>
-          </w:tcPr>
-          <w:p>
-            <w:pPr>
-              <w:pStyle w:val="Compact"/>
-              <w:keepNext/>
-              <w:keepLines/>
-              <w:spacing w:before="0" w:after="40" w:line="240" w:lineRule="auto"/>
-              <w:jc w:val="center"/>
-            </w:pPr>
-            <w:r>
-              <w:rPr>
-                <w:sz w:val="18"/>
-              </w:rPr>
-              <w:t xml:space="preserve">20 to 24</w:t>
-            </w:r>
-          </w:p>
-        </w:tc>
-        <w:tc>
-          <w:tcPr>
-            <w:tcW w:type="dxa" w:w="1877"/>
-          </w:tcPr>
-          <w:p>
-            <w:pPr>
-              <w:pStyle w:val="Compact"/>
-              <w:keepNext/>
-              <w:keepLines/>
-              <w:spacing w:before="0" w:after="40" w:line="240" w:lineRule="auto"/>
-              <w:jc w:val="center"/>
-            </w:pPr>
-            <w:r>
-              <w:rPr>
-                <w:sz w:val="18"/>
-              </w:rPr>
-              <w:t xml:space="preserve">13,539</w:t>
-            </w:r>
-          </w:p>
-        </w:tc>
-      </w:tr>
-      <w:tr>
-        <w:trPr>
-          <w:cantSplit/>
-        </w:trPr>
-        <w:tc>
-          <w:tcPr>
-            <w:tcW w:type="dxa" w:w="1564"/>
-          </w:tcPr>
-          <w:p>
-            <w:pPr>
-              <w:pStyle w:val="Compact"/>
-              <w:keepNext/>
-              <w:keepLines/>
-              <w:spacing w:before="0" w:after="40" w:line="240" w:lineRule="auto"/>
-              <w:jc w:val="left"/>
-            </w:pPr>
-            <w:r>
-              <w:rPr>
-                <w:sz w:val="18"/>
-              </w:rPr>
-              <w:t xml:space="preserve">2025</w:t>
-            </w:r>
-          </w:p>
-        </w:tc>
-        <w:tc>
-          <w:tcPr>
-            <w:tcW w:type="dxa" w:w="1877"/>
-          </w:tcPr>
-          <w:p>
-            <w:pPr>
-              <w:pStyle w:val="Compact"/>
-              <w:keepNext/>
-              <w:keepLines/>
-              <w:spacing w:before="0" w:after="40" w:line="240" w:lineRule="auto"/>
-              <w:jc w:val="center"/>
-            </w:pPr>
-            <w:r>
-              <w:rPr>
-                <w:sz w:val="18"/>
-              </w:rPr>
-              <w:t xml:space="preserve">20</w:t>
-            </w:r>
-          </w:p>
-        </w:tc>
-        <w:tc>
-          <w:tcPr>
-            <w:tcW w:type="dxa" w:w="1721"/>
-          </w:tcPr>
-          <w:p>
-            <w:pPr>
-              <w:pStyle w:val="Compact"/>
-              <w:keepNext/>
-              <w:keepLines/>
-              <w:spacing w:before="0" w:after="40" w:line="240" w:lineRule="auto"/>
-              <w:jc w:val="center"/>
-            </w:pPr>
-            <w:r>
-              <w:rPr>
-                <w:sz w:val="18"/>
-              </w:rPr>
-              <w:t xml:space="preserve">none</w:t>
-            </w:r>
-          </w:p>
-        </w:tc>
-        <w:tc>
-          <w:tcPr>
-            <w:tcW w:type="dxa" w:w="2033"/>
-          </w:tcPr>
-          <w:p>
-            <w:pPr>
-              <w:pStyle w:val="Compact"/>
-              <w:keepNext/>
-              <w:keepLines/>
-              <w:spacing w:before="0" w:after="40" w:line="240" w:lineRule="auto"/>
-              <w:jc w:val="center"/>
-            </w:pPr>
-            <w:r>
-              <w:rPr>
-                <w:sz w:val="18"/>
-              </w:rPr>
-              <w:t xml:space="preserve">21 to 23</w:t>
-            </w:r>
-          </w:p>
-        </w:tc>
-        <w:tc>
-          <w:tcPr>
-            <w:tcW w:type="dxa" w:w="1877"/>
-          </w:tcPr>
-          <w:p>
-            <w:pPr>
-              <w:pStyle w:val="Compact"/>
-              <w:keepNext/>
-              <w:keepLines/>
-              <w:spacing w:before="0" w:after="40" w:line="240" w:lineRule="auto"/>
-              <w:jc w:val="center"/>
-            </w:pPr>
-            <w:r>
-              <w:rPr>
-                <w:sz w:val="18"/>
-              </w:rPr>
-              <w:t xml:space="preserve">12,512</w:t>
-            </w:r>
-          </w:p>
-        </w:tc>
-      </w:tr>
-      <w:tr>
-        <w:trPr>
-          <w:cantSplit/>
-        </w:trPr>
-        <w:tc>
-          <w:tcPr>
-            <w:tcW w:type="dxa" w:w="1564"/>
-          </w:tcPr>
-          <w:p>
-            <w:pPr>
-              <w:pStyle w:val="Compact"/>
-              <w:keepNext/>
-              <w:keepLines/>
-              <w:spacing w:before="0" w:after="40" w:line="240" w:lineRule="auto"/>
-              <w:jc w:val="left"/>
-            </w:pPr>
-            <w:r>
-              <w:rPr>
-                <w:sz w:val="18"/>
-              </w:rPr>
-              <w:t xml:space="preserve">2026</w:t>
-            </w:r>
-          </w:p>
-        </w:tc>
-        <w:tc>
-          <w:tcPr>
-            <w:tcW w:type="dxa" w:w="1877"/>
-          </w:tcPr>
-          <w:p>
-            <w:pPr>
-              <w:pStyle w:val="Compact"/>
-              <w:keepNext/>
-              <w:keepLines/>
-              <w:spacing w:before="0" w:after="40" w:line="240" w:lineRule="auto"/>
-              <w:jc w:val="center"/>
-            </w:pPr>
-            <w:r>
-              <w:rPr>
-                <w:sz w:val="18"/>
-              </w:rPr>
-              <w:t xml:space="preserve">10</w:t>
-            </w:r>
-          </w:p>
-        </w:tc>
-        <w:tc>
-          <w:tcPr>
-            <w:tcW w:type="dxa" w:w="1721"/>
-          </w:tcPr>
-          <w:p>
-            <w:pPr>
-              <w:pStyle w:val="Compact"/>
-              <w:keepNext/>
-              <w:keepLines/>
-              <w:spacing w:before="0" w:after="40" w:line="240" w:lineRule="auto"/>
-              <w:jc w:val="center"/>
-            </w:pPr>
-            <w:r>
-              <w:rPr>
-                <w:sz w:val="18"/>
-              </w:rPr>
-              <w:t xml:space="preserve">∞</w:t>
-            </w:r>
-          </w:p>
-        </w:tc>
-        <w:tc>
-          <w:tcPr>
-            <w:tcW w:type="dxa" w:w="2033"/>
-          </w:tcPr>
-          <w:p>
-            <w:pPr>
-              <w:pStyle w:val="Compact"/>
-              <w:keepNext/>
-              <w:keepLines/>
-              <w:spacing w:before="0" w:after="40" w:line="240" w:lineRule="auto"/>
-              <w:jc w:val="center"/>
-            </w:pPr>
-            <w:r>
-              <w:rPr>
-                <w:sz w:val="18"/>
-              </w:rPr>
-              <w:t xml:space="preserve">no reversal</w:t>
-            </w:r>
-          </w:p>
-        </w:tc>
-        <w:tc>
-          <w:tcPr>
-            <w:tcW w:type="dxa" w:w="1877"/>
-          </w:tcPr>
-          <w:p>
-            <w:pPr>
-              <w:pStyle w:val="Compact"/>
-              <w:keepNext/>
-              <w:keepLines/>
-              <w:spacing w:before="0" w:after="40" w:line="240" w:lineRule="auto"/>
-              <w:jc w:val="center"/>
-            </w:pPr>
-            <w:r>
-              <w:rPr>
-                <w:sz w:val="18"/>
-              </w:rPr>
-              <w:t xml:space="preserve">no reversal</w:t>
-            </w:r>
-          </w:p>
-        </w:tc>
-      </w:tr>
-      <w:tr>
-        <w:trPr>
-          <w:cantSplit/>
-        </w:trPr>
-        <w:tc>
-          <w:tcPr>
-            <w:tcW w:type="dxa" w:w="1564"/>
-          </w:tcPr>
-          <w:p>
-            <w:pPr>
-              <w:pStyle w:val="Compact"/>
-              <w:keepNext/>
-              <w:keepLines/>
-              <w:spacing w:before="0" w:after="40" w:line="240" w:lineRule="auto"/>
-              <w:jc w:val="left"/>
-            </w:pPr>
-            <w:r>
-              <w:rPr>
-                <w:sz w:val="18"/>
-              </w:rPr>
-              <w:t xml:space="preserve">2026</w:t>
-            </w:r>
-          </w:p>
-        </w:tc>
-        <w:tc>
-          <w:tcPr>
-            <w:tcW w:type="dxa" w:w="1877"/>
-          </w:tcPr>
-          <w:p>
-            <w:pPr>
-              <w:pStyle w:val="Compact"/>
-              <w:keepNext/>
-              <w:keepLines/>
-              <w:spacing w:before="0" w:after="40" w:line="240" w:lineRule="auto"/>
-              <w:jc w:val="center"/>
-            </w:pPr>
-            <w:r>
-              <w:rPr>
-                <w:sz w:val="18"/>
-              </w:rPr>
-              <w:t xml:space="preserve">20</w:t>
-            </w:r>
-          </w:p>
-        </w:tc>
-        <w:tc>
-          <w:tcPr>
-            <w:tcW w:type="dxa" w:w="1721"/>
-          </w:tcPr>
-          <w:p>
-            <w:pPr>
-              <w:pStyle w:val="Compact"/>
-              <w:keepNext/>
-              <w:keepLines/>
-              <w:spacing w:before="0" w:after="40" w:line="240" w:lineRule="auto"/>
-              <w:jc w:val="center"/>
-            </w:pPr>
-            <w:r>
-              <w:rPr>
-                <w:sz w:val="18"/>
-              </w:rPr>
-              <w:t xml:space="preserve">0.087</w:t>
-            </w:r>
-          </w:p>
-        </w:tc>
-        <w:tc>
-          <w:tcPr>
-            <w:tcW w:type="dxa" w:w="2033"/>
-          </w:tcPr>
-          <w:p>
-            <w:pPr>
-              <w:pStyle w:val="Compact"/>
-              <w:keepNext/>
-              <w:keepLines/>
-              <w:spacing w:before="0" w:after="40" w:line="240" w:lineRule="auto"/>
-              <w:jc w:val="center"/>
-            </w:pPr>
-            <w:r>
-              <w:rPr>
-                <w:sz w:val="18"/>
-              </w:rPr>
-              <w:t xml:space="preserve">−2 to 24</w:t>
-            </w:r>
-          </w:p>
-        </w:tc>
-        <w:tc>
-          <w:tcPr>
-            <w:tcW w:type="dxa" w:w="1877"/>
-          </w:tcPr>
-          <w:p>
-            <w:pPr>
-              <w:pStyle w:val="Compact"/>
-              <w:keepNext/>
-              <w:keepLines/>
-              <w:spacing w:before="0" w:after="40" w:line="240" w:lineRule="auto"/>
-              <w:jc w:val="center"/>
-            </w:pPr>
-            <w:r>
-              <w:rPr>
-                <w:sz w:val="18"/>
-              </w:rPr>
-              <w:t xml:space="preserve">69,384</w:t>
-            </w:r>
-          </w:p>
-        </w:tc>
-      </w:tr>
-    </w:tbl>
-    <w:p>
-      <w:pPr>
-        <w:pStyle w:val="BodyText"/>
-        <w:keepLines/>
-        <w:spacing w:line="240" w:lineRule="auto" w:before="80" w:after="120"/>
-      </w:pPr>
-      <w:r>
-        <w:rPr>
-          <w:iCs/>
-          <w:i/>
-          <w:sz w:val="18"/>
-        </w:rPr>
-        <w:t xml:space="preserve">Notes.</w:t>
-      </w:r>
-      <w:r>
-        <w:rPr>
-          <w:sz w:val="18"/>
-        </w:rPr>
-        <w:t xml:space="preserve"> </w:t>
-      </w:r>
-      <w:r>
-        <w:rPr>
-          <w:sz w:val="18"/>
-        </w:rPr>
-        <w:t xml:space="preserve">Mobility-calibrated movement. s: residents’ early ballots may depart from their neighborhood benchmark (election-day share shifted by the district’s early-vote gap) by their station’s departure plus s; ∞: positive however much they depart; none: not positive even when they depart only as much as their station. First reversing allocation: the one with the lowest slope at s just above that value; movers voted at another station of their zone, stayers at their own; range over price terciles. Last column: among allocations with a non-positive slope, the fewest residents’ conservative early ballots departing from the benchmark (out-of-zone departures and concentration in Online Appendix Table C6). Each reversal is minimal only in its own metric, with other assumptions fixed.</w:t>
+        <w:t xml:space="preserve">among the settings examined. All of Seoul; numbers in Online Appendix Table C8, and selected settings without Gangnam, Seocho and Songpa in Table C9.</w:t>
       </w:r>
     </w:p>
     <w:p>
@@ -10186,13 +9130,13 @@
           <w:iCs/>
           <w:i/>
         </w:rPr>
-        <w:t xml:space="preserve">Compatibility with observed counts.</w:t>
-      </w:r>
-      <w:r>
-        <w:t xml:space="preserve"> </w:t>
-      </w:r>
-      <w:r>
-        <w:t xml:space="preserve">We assess how the result changes when composition tolerances are set relative to the minimum required by each jurisdiction’s counts. Holding calibrated movement and</w:t>
+        <w:t xml:space="preserve">Compatibility with the observed counts.</w:t>
+      </w:r>
+      <w:r>
+        <w:t xml:space="preserve"> </w:t>
+      </w:r>
+      <w:r>
+        <w:t xml:space="preserve">A restriction must first admit an allocation that reproduces the data. Holding calibrated movement and</w:t>
       </w:r>
       <w:r>
         <w:t xml:space="preserve"> </w:t>
@@ -10215,7 +9159,7 @@
         <w:t xml:space="preserve"> </w:t>
       </w:r>
       <w:r>
-        <w:t xml:space="preserve">fixed, the largest jurisdiction-specific minimum feasible out-of-zone band is 0.031, 0.046, 0.061 and 0.073 in 2022, 2024, 2025 and 2026. We therefore replace the constant band by each jurisdiction’s minimum plus a common excess tolerance (Online Appendix Table C27). At an excess of ten points, the 2026 slope remains positive for all Seoul and outside the three districts, with lower bounds 0.040 and 0.012. These jurisdiction-specific bands assess proximity to refutation and are not generally nested with the constant-band main setting (Online Appendix C).</w:t>
+        <w:t xml:space="preserve">fixed, the largest jurisdiction-specific minimum feasible out-of-zone band is 0.031, 0.046, 0.061 and 0.073 in 2022, 2024, 2025 and 2026. Table C10 replaces the constant band with each jurisdiction’s minimum plus a common excess tolerance. At an excess of ten points, the 2026 slope remains positive for all Seoul and outside the three districts, with lower bounds 0.040 and 0.012. Some bands are smaller and others larger than the main 0.10, so the models are not generally nested. This check establishes compatibility and sensitivity to a different reference point, without verifying the unobserved composition.</w:t>
       </w:r>
     </w:p>
     <w:p>
@@ -10227,23 +9171,47 @@
           <w:iCs/>
           <w:i/>
         </w:rPr>
-        <w:t xml:space="preserve">Alternative specifications.</w:t>
-      </w:r>
-    </w:p>
-    <w:p>
-      <w:pPr>
-        <w:pStyle w:val="BodyText"/>
-      </w:pPr>
-      <w:r>
-        <w:t xml:space="preserve">An alternative 2025 price measure leaves the sign conclusions in columns A, C, D and E unchanged. The comparison uses a separately documented official transaction snapshot and address mapping, with results also restricted to the neighborhoods priced in both sources (Online Appendix B.3 and Table C28).</w:t>
-      </w:r>
-    </w:p>
-    <w:p>
-      <w:pPr>
-        <w:pStyle w:val="BodyText"/>
-      </w:pPr>
-      <w:r>
-        <w:t xml:space="preserve">The 2026 conclusion under the main assumptions holds with regressions weighted by</w:t>
+        <w:t xml:space="preserve">Geographic scope and measurement.</w:t>
+      </w:r>
+      <w:r>
+        <w:t xml:space="preserve"> </w:t>
+      </w:r>
+      <w:r>
+        <w:t xml:space="preserve">The joint geographic and price-tail comparison in Section 4.3 is the relevant test for the claim beyond Gangnam. For all Seoul, removing the highest-price 10% leaves a positive lower bound of 0.008 at the main</w:t>
+      </w:r>
+      <w:r>
+        <w:t xml:space="preserve"> </w:t>
+      </w:r>
+      <m:oMath>
+        <m:r>
+          <m:t>s</m:t>
+        </m:r>
+      </m:oMath>
+      <w:r>
+        <w:t xml:space="preserve">, but the bound becomes negative at</w:t>
+      </w:r>
+      <w:r>
+        <w:t xml:space="preserve"> </w:t>
+      </w:r>
+      <m:oMath>
+        <m:r>
+          <m:t>s</m:t>
+        </m:r>
+        <m:r>
+          <m:rPr>
+            <m:sty m:val="p"/>
+          </m:rPr>
+          <m:t>=</m:t>
+        </m:r>
+        <m:r>
+          <m:t>0.05</m:t>
+        </m:r>
+      </m:oMath>
+      <w:r>
+        <w:t xml:space="preserve"> </w:t>
+      </w:r>
+      <w:r>
+        <w:t xml:space="preserve">(Table C23). Separate changes to the price definition, transaction coverage and neighborhood weights retain the 2026 main-assumption direction: mean prices, exclusion of the 43 neighborhoods with fewer than 30 transactions, and</w:t>
       </w:r>
       <w:r>
         <w:t xml:space="preserve"> </w:t>
@@ -10263,30 +9231,7 @@
         </m:sSub>
       </m:oMath>
       <w:r>
-        <w:t xml:space="preserve">, mean prices, without the 43 neighborhoods with fewer than 30 transactions, and without the 5% or 10% most expensive neighborhoods, but it depends on the most expensive neighborhoods: without the top 10% the lower bound falls from 0.054 to 0.008, and with</w:t>
-      </w:r>
-      <w:r>
-        <w:t xml:space="preserve"> </w:t>
-      </w:r>
-      <m:oMath>
-        <m:r>
-          <m:t>s</m:t>
-        </m:r>
-        <m:r>
-          <m:rPr>
-            <m:sty m:val="p"/>
-          </m:rPr>
-          <m:t>=</m:t>
-        </m:r>
-        <m:r>
-          <m:t>0.05</m:t>
-        </m:r>
-      </m:oMath>
-      <w:r>
-        <w:t xml:space="preserve"> </w:t>
-      </w:r>
-      <w:r>
-        <w:t xml:space="preserve">it turns negative (Online Appendix Table C10). Resampling transactions moves the bounds by a few thousandths (Table C13).</w:t>
+        <w:t xml:space="preserve">-weighted regressions. Transaction resampling moves the endpoints by a few thousandths (Table C24).</w:t>
       </w:r>
     </w:p>
     <w:p>
@@ -10294,21 +9239,28 @@
         <w:pStyle w:val="BodyText"/>
       </w:pPr>
       <w:r>
-        <w:t xml:space="preserve">A benchmark that varies with price within districts, motivated by larger early-vote gaps in higher-price counting jurisdictions in 2024–2026, changes the 2026 result only slightly (Table 2, column F), as does shifting the out-of-zone benchmark by the observed out-of-zone gap (Table C9). Valid-vote shares</w:t>
-      </w:r>
-      <w:r>
-        <w:t xml:space="preserve"> </w:t>
-      </w:r>
-      <m:oMath>
-        <m:r>
-          <m:t>y</m:t>
-        </m:r>
-      </m:oMath>
-      <w:r>
-        <w:t xml:space="preserve"> </w:t>
-      </w:r>
-      <w:r>
-        <w:t xml:space="preserve">lead to the same conclusions, except that column C does not establish the 2025 slope for them (Table C15), and the council contest’s out-of-zone headcounts change the 2026 ranges by at most 0.003 (Table C2). Adjusting for neighborhood age composition measured in 2026 leaves the election-day slopes almost unchanged and the 2026 range among all residents positive (</w:t>
+        <w:t xml:space="preserve">For 2025, the original price-summary construction is unavailable. Replacing it with a separately documented official transaction snapshot and address mapping leaves the A, C, D and E sign conclusions unchanged in both geographic scopes, including the main-setting comparison on common priced neighborhoods (Table C25; Appendix B.3). This reduces concern that the unresolved sign is specific to the archived price input; it does not recover that input’s original provenance.</w:t>
+      </w:r>
+    </w:p>
+    <w:p>
+      <w:pPr>
+        <w:pStyle w:val="BodyText"/>
+      </w:pPr>
+      <w:r>
+        <w:rPr>
+          <w:iCs/>
+          <w:i/>
+        </w:rPr>
+        <w:t xml:space="preserve">Benchmarks, denominator and age.</w:t>
+      </w:r>
+      <w:r>
+        <w:t xml:space="preserve"> </w:t>
+      </w:r>
+      <w:r>
+        <w:t xml:space="preserve">A price-dependent early-vote benchmark changes the 2026 result only slightly (Table 2, F), as does shifting the out-of-zone benchmark by the observed jurisdiction gap (Table C11). The main-assumption sign conclusions also hold for valid-vote shares, while the 2025 positive slope under the minimal-movement/ten-point specification does not (Tables C20 and C21). Adding the council contest’s out-of-zone headcounts changes the 2026 ranges by at most 0.003 (Table C27). Adjusting for neighborhood age composition measured in 2026 leaves the election-day slopes almost unchanged and the 2026 resident-based range positive:</w:t>
+      </w:r>
+      <w:r>
+        <w:t xml:space="preserve"> </w:t>
       </w:r>
       <m:oMath>
         <m:d>
@@ -10335,7 +9287,10 @@
         </m:d>
       </m:oMath>
       <w:r>
-        <w:t xml:space="preserve">;</w:t>
+        <w:t xml:space="preserve"> </w:t>
+      </w:r>
+      <w:r>
+        <w:t xml:space="preserve">for all Seoul and</w:t>
       </w:r>
       <w:r>
         <w:t xml:space="preserve"> </w:t>
@@ -10368,7 +9323,15 @@
         <w:t xml:space="preserve"> </w:t>
       </w:r>
       <w:r>
-        <w:t xml:space="preserve">outside the three districts), but removes the fragile 2024 lower bound (Table C23).</w:t>
+        <w:t xml:space="preserve">outside the three districts. It removes the fragile 2024 lower bound (Table C22). The age data cannot establish adjustment for contemporaneous age composition in earlier elections.</w:t>
+      </w:r>
+    </w:p>
+    <w:p>
+      <w:pPr>
+        <w:pStyle w:val="BodyText"/>
+      </w:pPr>
+      <w:r>
+        <w:t xml:space="preserve">An alternative restriction limits how early-vote departures align with prices instead of bounding each neighborhood separately. It can settle some unresolved signs at the scale of observed station patterns, but those patterns do not measure the residential departures being restricted. Online Appendix A.1 and Tables C12 and C13 present it as a separate conditional exercise, rather than corroboration of the main assumptions.</w:t>
       </w:r>
     </w:p>
     <w:bookmarkEnd w:id="43"/>
@@ -10427,7 +9390,7 @@
         <w:pStyle w:val="BodyText"/>
       </w:pPr>
       <w:r>
-        <w:t xml:space="preserve">Because the true allocation is unknown, we evaluate each change by the uncertainty it is guaranteed to remove: the largest range that could remain whatever the true allocation, computed as the largest difference in the within-district slope between two allocations that the new report could not tell apart. Table 6 reports, under the main assumptions, the current range and the largest range that could remain after each report.</w:t>
+        <w:t xml:space="preserve">Because the true allocation is unknown, we evaluate each change by the uncertainty it is guaranteed to remove: the largest range that could remain whatever the true allocation, computed as the largest difference in the within-district slope between two allocations that the new report could not tell apart. Table 5 reports, under the main assumptions, the current range and the largest range that could remain after each report.</w:t>
       </w:r>
     </w:p>
     <w:p>
@@ -10436,7 +9399,7 @@
         <w:keepNext/>
       </w:pPr>
       <w:r>
-        <w:t xml:space="preserve">Table 6. Guaranteed reductions in uncertainty under residence reporting</w:t>
+        <w:t xml:space="preserve">Table 5. Guaranteed reductions in uncertainty under residence reporting</w:t>
       </w:r>
     </w:p>
     <w:tbl>
@@ -10446,7 +9409,7 @@
         <w:tblLayout w:type="fixed"/>
         <w:tblLook w:firstRow="1" w:lastRow="0" w:firstColumn="0" w:lastColumn="0" w:noHBand="0" w:noVBand="0" w:val="0020"/>
         <w:jc w:val="start"/>
-        <w:tblCaption w:val="Table 6. Guaranteed reductions in uncertainty under residence reporting"/>
+        <w:tblCaption w:val="Table 5. Guaranteed reductions in uncertainty under residence reporting"/>
       </w:tblPr>
       <w:tblGrid>
         <w:gridCol w:w="1334"/>
@@ -11107,7 +10070,7 @@
         <w:rPr>
           <w:sz w:val="18"/>
         </w:rPr>
-        <w:t xml:space="preserve">All columns describe the width of the within-district slope range or the guaranteed fraction of that width removed. Main assumptions: Table 2, column E. Proposal: out-of-zone early ballots reported as aggregate counts by the voter’s registered neighborhood, at-home and overseas ballots kept pooled. All pooled modes: out-of-zone early, at-home and overseas ballots by neighborhood. Maximum remaining width: the largest difference in the within-district slope between two allocations that the report could not tell apart, which bounds the range left whatever the true allocation. Counts are released exactly, without cell suppression. Suppression sensitivity: Online Appendix Table C26. Other assumptions and headcount reporting: Table C12.</w:t>
+        <w:t xml:space="preserve">All columns describe the width of the within-district slope range or the guaranteed fraction of that width removed. Main assumptions: Table 2, column E. Proposal: out-of-zone early ballots reported as aggregate counts by the voter’s registered neighborhood, at-home and overseas ballots kept pooled. All pooled modes: out-of-zone early, at-home and overseas ballots by neighborhood. Maximum remaining width: the largest difference in the within-district slope between two allocations that the report could not tell apart, which bounds the range left whatever the true allocation. Counts are released exactly, without cell suppression. Suppression sensitivity: Online Appendix Table C30. Other assumptions and headcount reporting: Table C28.</w:t>
       </w:r>
     </w:p>
     <w:p>
@@ -11115,7 +10078,7 @@
         <w:pStyle w:val="BodyText"/>
       </w:pPr>
       <w:r>
-        <w:t xml:space="preserve">Residence reporting of out-of-zone early ballots, with at-home and overseas ballots kept pooled, is the version we evaluate most closely. With counts released exactly, it is guaranteed to remove 27%, 30%, 32% and 57% of the current range in 2022, 2024, 2025 and 2026; reporting all pooled modes would remove 49–69% (Online Appendix Table C12). Neither version guarantees that a currently undetermined direction is revealed: in 2022, two allocations with slopes of</w:t>
+        <w:t xml:space="preserve">Residence reporting of out-of-zone early ballots, with at-home and overseas ballots kept pooled, is the version we evaluate most closely. With counts released exactly, it is guaranteed to remove 27%, 30%, 32% and 57% of the current range in 2022, 2024, 2025 and 2026; reporting all pooled modes would remove 49–69% (Online Appendix Table C28). Neither version guarantees that a currently undetermined direction is revealed: in 2022, two allocations with slopes of</w:t>
       </w:r>
       <w:r>
         <w:t xml:space="preserve"> </w:t>
@@ -11155,7 +10118,7 @@
         <w:t xml:space="preserve"> </w:t>
       </w:r>
       <w:r>
-        <w:t xml:space="preserve">produce the same exact residence report (Table C16). Headcount reporting alone reveals little about how movers voted, but combined with reporting all pooled modes it removes 63–72% of the range that remains without any movement assumption (Table C12).</w:t>
+        <w:t xml:space="preserve">produce the same exact residence report (Table C29). Headcount reporting alone reveals little about how movers voted, but combined with reporting all pooled modes it removes 63–72% of the range that remains without any movement assumption (Table C28).</w:t>
       </w:r>
     </w:p>
     <w:p>
@@ -11163,7 +10126,7 @@
         <w:pStyle w:val="BodyText"/>
       </w:pPr>
       <w:r>
-        <w:t xml:space="preserve">Exact disclosure and a release with small cells suppressed supply different information. As a sensitivity exercise, suppose each out-of-zone neighborhood-by-candidate count below 20 is marked suppressed and every other count is released exactly. A conservative calculation bounds the remaining integer uncertainty and guarantees reductions relative to the current continuous range of at least 23.7%, 26.8%, 29.6% and 49.0% in the four elections (Online Appendix Table C26). The calculation relaxes equality of reports to a necessary condition for two integer allocations to generate the same suppressed report; its bounds need not be sharp. It does not cover complementary suppression of larger counts or certify the privacy of such a release. Those choices require a separate disclosure assessment, and could reduce the information gained further.</w:t>
+        <w:t xml:space="preserve">Exact disclosure and a release with small cells suppressed supply different information. As a sensitivity exercise, suppose each out-of-zone neighborhood-by-candidate count below 20 is marked suppressed and every other count is released exactly. A conservative calculation bounds the remaining integer uncertainty and guarantees reductions relative to the current continuous range of at least 23.7%, 26.8%, 29.6% and 49.0% in the four elections (Online Appendix Table C30). The calculation relaxes equality of reports to a necessary condition for two integer allocations to generate the same suppressed report; its bounds need not be sharp. It does not cover complementary suppression of larger counts or certify the privacy of such a release. Those choices require a separate disclosure assessment, and could reduce the information gained further.</w:t>
       </w:r>
     </w:p>
     <w:p>
@@ -11171,7 +10134,7 @@
         <w:pStyle w:val="BodyText"/>
       </w:pPr>
       <w:r>
-        <w:t xml:space="preserve">The guaranteed reductions characterize the information supplied by each reporting rule under the stated restrictions. Implementation would require sorting out-of-zone envelopes into neighborhood groups before opening and assessing which aggregate counts could be released safely. A supplementary release after the official count could preserve the timing of official results, but ballot secrecy and operational costs require evaluation. The counts would permit direct neighborhood comparisons of residents’ early and election-day votes, without explaining why those groups differ. Headcount reporting measures movement without adding candidate totals. Each proposal should be judged by both the uncertainty it removes and the disclosure constraints it must meet.</w:t>
+        <w:t xml:space="preserve">The reporting analysis measures an institutional contribution to the evidence: for a fixed set of votes and assumptions, a report can distinguish residential allocations that the current returns leave indistinguishable. The 27–57% guarantees are conditional on the main restrictions, and neither establish their realism nor predict an average effect of implementation. Implementation would require sorting out-of-zone envelopes into neighborhood groups before opening and assessing which aggregate counts could be released safely. A supplementary release after the official count could preserve the timing of official results, but ballot secrecy and operational costs require evaluation. The counts would permit direct neighborhood comparisons of residents’ early and election-day votes, without explaining why those groups differ. Headcount reporting measures movement without adding candidate totals. Each proposal should be judged by both the uncertainty it removes and the disclosure constraints it must meet.</w:t>
       </w:r>
     </w:p>
     <w:bookmarkEnd w:id="45"/>
@@ -11189,7 +10152,7 @@
         <w:pStyle w:val="FirstParagraph"/>
       </w:pPr>
       <w:r>
-        <w:t xml:space="preserve">Higher-price neighborhoods in Seoul vote more conservatively among election-day voters in 2012 and the four sampled elections from 2022, including outside Gangnam, Seocho and Songpa. The extension across voting modes is established in 2026 under the main assumptions, is sensitive to specification in 2024, and remains unresolved in 2022 and 2025. Even in 2026, the result outside the three districts depends on high-price neighborhoods, and the median-split contrast includes zero. These distinctions matter for explanations of housing politics: the observed gradient extends beyond the southeastern enclave, but evidence for a general separation between higher- and lower-price groups is weaker.</w:t>
+        <w:t xml:space="preserve">Higher-price neighborhoods in Seoul vote more conservatively among election-day voters in 2012 and the four sampled elections from 2022, including outside Gangnam, Seocho and Songpa. The extension across voting modes is established in 2026 under the main assumptions, is sensitive to specification in 2024, and remains unresolved in 2022 and 2025. Even in 2026, the result outside the three districts depends on high-price neighborhoods, and the median-split contrast includes zero. These distinctions change the substantive geography to be explained: a relation extending beyond the southeastern enclave can remain concentrated toward the upper end of the price distribution, and an observed election-day gradient need not establish the same relation among all voters. The paper locates these differences without choosing among economic interests, residential sorting and place identity.</w:t>
       </w:r>
     </w:p>
     <w:p>
@@ -11247,7 +10210,7 @@
         <w:pStyle w:val="FirstParagraph"/>
       </w:pPr>
       <w:r>
-        <w:t xml:space="preserve">An anonymized replication package accompanies the submission and provides the analysis inputs, available source snapshots, and code for regenerating the tables and figures and checking the headline calculations. For 2025 prices, it includes the archived summary and a separately documented reconstruction from a new transaction snapshot. The original summary-generation materials are unavailable; Online Appendix B.3 documents this distinction and Table C28 reports the sensitivity comparison.</w:t>
+        <w:t xml:space="preserve">An anonymized replication package accompanies the submission and provides the analysis inputs, available source snapshots, and code for regenerating the tables and figures and checking the headline calculations. For 2025 prices, it includes the archived summary and a separately documented reconstruction from a new transaction snapshot. The original summary-generation materials are unavailable; Online Appendix B.3 documents this distinction and Table C25 reports the sensitivity comparison.</w:t>
       </w:r>
     </w:p>
     <w:bookmarkEnd w:id="47"/>

</xml_diff>